<commit_message>
refactor: alinhar codigo e relatorios estritamente as apostilas das Agendas 1 a 11 do CPS
</commit_message>
<xml_diff>
--- a/IraciBertoGomes_Ag11_DSI.docx
+++ b/IraciBertoGomes_Ag11_DSI.docx
@@ -1358,41 +1358,56 @@
         </w:rPr>
         <w:t>"""</w:t>
         <w:br/>
-        <w:t>Atividade: Controle de Níveis de Água - Agenda 11</w:t>
+        <w:t>=============================================================================</w:t>
+        <w:br/>
+        <w:t>CURSO TÉCNICO EM DESENVOLVIMENTO DE SISTEMAS - ETEC / CPS</w:t>
         <w:br/>
         <w:t>Componente Curricular: Desenvolvimento de Sistemas I (DS I)</w:t>
         <w:br/>
-        <w:t>Curso Técnico em Desenvolvimento de Sistemas - ETEC / CPS</w:t>
+        <w:t>Atividade da Agenda 11: Controle de Níveis de Água no Reservatório</w:t>
         <w:br/>
         <w:t>Estudante: Iraci Berto Gomes</w:t>
         <w:br/>
         <w:t>Arquivo de Entrega: IraciBertoGomes_Ag11_DSI.py</w:t>
         <w:br/>
         <w:br/>
-        <w:t>Competência:</w:t>
+        <w:t>CONCEITOS APLICADOS DAS APOSTILAS DO CURSO (AGENDAS 1 A 11):</w:t>
         <w:br/>
-        <w:t>4. Elaborar sistemas aplicando princípios e paradigmas de programação.</w:t>
+        <w:t>- Agenda 02 e 03: Variáveis, tipos de dados primitivos e f-strings.</w:t>
         <w:br/>
+        <w:t>- Agenda 04 e 05: Versionamento do código com Git e GitHub.</w:t>
         <w:br/>
-        <w:t>Habilidades:</w:t>
+        <w:t>- Agenda 06 e 07: Estruturas de Decisão com if, elif e else.</w:t>
         <w:br/>
-        <w:t>4.1 Codificar programas, utilizando técnica de programação estruturada.</w:t>
+        <w:t>- Agenda 08: Estruturas de Repetição com for e range().</w:t>
         <w:br/>
-        <w:t>4.2 Depurar e versionar programas, utilizando ambiente de desenvolvimento integrado.</w:t>
+        <w:t>- Agenda 09: Estruturas de Dados - Listas ([]), índices e função len().</w:t>
+        <w:br/>
+        <w:t>- Agenda 10: Funções com retorno (return) e Procedimentos (SRP).</w:t>
+        <w:br/>
+        <w:t>- Agenda 11: Bibliotecas padrão (os, sys, time) e externa (colorama).</w:t>
+        <w:br/>
+        <w:t>=============================================================================</w:t>
         <w:br/>
         <w:t>"""</w:t>
         <w:br/>
         <w:br/>
-        <w:t>import os</w:t>
+        <w:t># ---------------------------------------------------------------------------</w:t>
         <w:br/>
-        <w:t>import sys</w:t>
+        <w:t># AGENDA 11: IMPORTAÇÃO DE BIBLIOTECAS (Padrão e Externas)</w:t>
         <w:br/>
-        <w:t>import time</w:t>
+        <w:t># ---------------------------------------------------------------------------</w:t>
         <w:br/>
-        <w:t>from colorama import init, Fore, Style, Back</w:t>
+        <w:t>import os               # Biblioteca padrão: interação com o sistema operacional</w:t>
+        <w:br/>
+        <w:t>import sys              # Biblioteca padrão: recursos do ambiente Python</w:t>
+        <w:br/>
+        <w:t>import time             # Biblioteca padrão: controle de intervalos e pausas (time.sleep)</w:t>
+        <w:br/>
+        <w:t>from colorama import Fore, Style  # Biblioteca externa: cores e estilos no terminal</w:t>
         <w:br/>
         <w:br/>
-        <w:t># Configuração de suporte a UTF-8 no terminal Windows para acentuação perfeita</w:t>
+        <w:t># Configuração de compatibilidade de codificação UTF-8 para o console Windows</w:t>
         <w:br/>
         <w:t>if sys.platform == 'win32':</w:t>
         <w:br/>
@@ -1405,28 +1420,21 @@
         <w:t xml:space="preserve">        pass</w:t>
         <w:br/>
         <w:br/>
-        <w:t># Inicializa o colorama.</w:t>
         <w:br/>
-        <w:t># autoreset=False permite demonstrar explicitamente o controle de restauração do padrão do terminal (Style.RESET_ALL)</w:t>
+        <w:t># ---------------------------------------------------------------------------</w:t>
         <w:br/>
-        <w:t>init(autoreset=False)</w:t>
+        <w:t># AGENDA 10: PROCEDIMENTOS DE INTERFACE E APRESENTAÇÃO (Sem retorno - None)</w:t>
         <w:br/>
-        <w:br/>
-        <w:br/>
-        <w:t># ====================================================================</w:t>
-        <w:br/>
-        <w:t># FUNÇÕES E PROCEDIMENTOS DO SISTEMA</w:t>
-        <w:br/>
-        <w:t># ====================================================================</w:t>
+        <w:t># ---------------------------------------------------------------------------</w:t>
         <w:br/>
         <w:br/>
         <w:t>def limpar_tela():</w:t>
         <w:br/>
         <w:t xml:space="preserve">    """</w:t>
         <w:br/>
-        <w:t xml:space="preserve">    Procedimento para limpar o terminal de forma multiplataforma (Windows e Linux/Mac).</w:t>
+        <w:t xml:space="preserve">    Procedimento para limpar o terminal de forma multiplataforma (Agenda 10 e 11).</w:t>
         <w:br/>
-        <w:t xml:space="preserve">    Encapsulado em função para evitar efeitos colaterais na importação.</w:t>
+        <w:t xml:space="preserve">    Utiliza a biblioteca 'os' estudada na Agenda 11.</w:t>
         <w:br/>
         <w:t xml:space="preserve">    """</w:t>
         <w:br/>
@@ -1438,31 +1446,40 @@
         <w:br/>
         <w:t xml:space="preserve">    """</w:t>
         <w:br/>
-        <w:t xml:space="preserve">    Procedimento que imprime o cabeçalho oficial do sistema no terminal.</w:t>
+        <w:t xml:space="preserve">    Procedimento que exibe o cabeçalho do sistema de monitoramento (Agenda 10).</w:t>
+        <w:br/>
+        <w:t xml:space="preserve">    Aplica formatação com a biblioteca colorama (Agenda 11).</w:t>
         <w:br/>
         <w:t xml:space="preserve">    """</w:t>
         <w:br/>
-        <w:t xml:space="preserve">    print(Style.BRIGHT + Fore.CYAN + "=" * 68)</w:t>
+        <w:t xml:space="preserve">    print(Style.BRIGHT + Fore.CYAN + "=" * 65)</w:t>
         <w:br/>
-        <w:t xml:space="preserve">    print("      SISTEMA DE MONITORAMENTO DE NÍVEIS DE ÁGUA - RESERVATÓRIO")</w:t>
+        <w:t xml:space="preserve">    print("   SISTEMA DE MONITORAMENTO DE NÍVEIS DE ÁGUA - RESERVATÓRIO")</w:t>
         <w:br/>
-        <w:t xml:space="preserve">    print("             Telemetria e Controle de Risco Operacional")</w:t>
+        <w:t xml:space="preserve">    print("        Telemetria e Controle Automatizado em Terminal")</w:t>
         <w:br/>
-        <w:t xml:space="preserve">    print("=" * 68 + Style.RESET_ALL)</w:t>
+        <w:t xml:space="preserve">    print("=" * 65 + Style.RESET_ALL)</w:t>
         <w:br/>
         <w:t xml:space="preserve">    print()</w:t>
         <w:br/>
         <w:br/>
         <w:br/>
-        <w:t>def definir_cor_nivel(nivel):</w:t>
+        <w:t># ---------------------------------------------------------------------------</w:t>
+        <w:br/>
+        <w:t># AGENDA 10 &amp; 11: FUNÇÃO COM RETORNO PARA DEFINIR A COR (Regra da Atividade)</w:t>
+        <w:br/>
+        <w:t># ---------------------------------------------------------------------------</w:t>
+        <w:br/>
+        <w:br/>
+        <w:t>def definir_cor_mensagem(nivel):</w:t>
         <w:br/>
         <w:t xml:space="preserve">    """</w:t>
         <w:br/>
-        <w:t xml:space="preserve">    Função com Retorno (Responsabilidade Única - SRP):</w:t>
+        <w:t xml:space="preserve">    Função com retorno (Agenda 10):</w:t>
         <w:br/>
-        <w:t xml:space="preserve">    Define e retorna o código de cor da biblioteca colorama correspondente</w:t>
+        <w:t xml:space="preserve">    Responsável estritamente por definir e retornar a cor da biblioteca colorama</w:t>
         <w:br/>
-        <w:t xml:space="preserve">    ao nível informado, seguindo rigorosamente a tabela de risco da atividade:</w:t>
+        <w:t xml:space="preserve">    conforme o nível de água informado, seguindo a tabela de risco da Agenda 11:</w:t>
         <w:br/>
         <w:br/>
         <w:t xml:space="preserve">    - Nível 1: Muito baixo (crítico) -&gt; Vermelho (Fore.RED)</w:t>
@@ -1476,14 +1493,7 @@
         <w:t xml:space="preserve">    - Nível 5: Muito alto (alerta)  -&gt; Azul     (Fore.BLUE)</w:t>
         <w:br/>
         <w:br/>
-        <w:t xml:space="preserve">    Parâmetros:</w:t>
-        <w:br/>
-        <w:t xml:space="preserve">        nivel (int): Nível de água do reservatório (1 a 5).</w:t>
-        <w:br/>
-        <w:br/>
-        <w:t xml:space="preserve">    Retorno:</w:t>
-        <w:br/>
-        <w:t xml:space="preserve">        str: Código de cor ANSI da biblioteca colorama.</w:t>
+        <w:t xml:space="preserve">    Aplica estruturas condicionais if, elif e else estudadas nas Agendas 06 e 07.</w:t>
         <w:br/>
         <w:t xml:space="preserve">    """</w:t>
         <w:br/>
@@ -1509,126 +1519,113 @@
         <w:br/>
         <w:t xml:space="preserve">    else:</w:t>
         <w:br/>
-        <w:t xml:space="preserve">        # Cor neutra de segurança caso seja informado um nível fora da escala</w:t>
-        <w:br/>
         <w:t xml:space="preserve">        return Fore.WHITE</w:t>
         <w:br/>
         <w:br/>
         <w:br/>
-        <w:t>def gerar_barra_nivel(nivel, max_nivel=5):</w:t>
+        <w:t># ---------------------------------------------------------------------------</w:t>
+        <w:br/>
+        <w:t># AGENDA 10 &amp; 11: PROCEDIMENTO PARA EXIBIR A MENSAGEM COM COR E RESTAURAR</w:t>
+        <w:br/>
+        <w:t># ---------------------------------------------------------------------------</w:t>
+        <w:br/>
+        <w:br/>
+        <w:t>def exibir_situacao_reservatorio(nivel, situacao):</w:t>
         <w:br/>
         <w:t xml:space="preserve">    """</w:t>
         <w:br/>
-        <w:t xml:space="preserve">    Função utilitária que gera uma barra visual ASCII para o medidor de nível.</w:t>
+        <w:t xml:space="preserve">    Procedimento que exibe a situação atual do reservatório com a cor correspondente</w:t>
         <w:br/>
-        <w:t xml:space="preserve">    Totalmente compatível com qualquer terminal Windows (sem caracteres não-mapeados).</w:t>
-        <w:br/>
-        <w:br/>
-        <w:t xml:space="preserve">    Exemplo para nível 3: [###--] 60%</w:t>
-        <w:br/>
-        <w:t xml:space="preserve">    """</w:t>
-        <w:br/>
-        <w:t xml:space="preserve">    cheio = "#" * nivel</w:t>
-        <w:br/>
-        <w:t xml:space="preserve">    vazio = "-" * (max_nivel - nivel)</w:t>
-        <w:br/>
-        <w:t xml:space="preserve">    porcentagem = (nivel / max_nivel) * 100</w:t>
-        <w:br/>
-        <w:t xml:space="preserve">    return f"[{cheio}{vazio}] {porcentagem:&gt;3.0f}%"</w:t>
-        <w:br/>
-        <w:br/>
-        <w:br/>
-        <w:t>def exibir_alerta_nivel(item_reservatorio):</w:t>
-        <w:br/>
-        <w:t xml:space="preserve">    """</w:t>
-        <w:br/>
-        <w:t xml:space="preserve">    Procedimento responsável por formatar e imprimir na tela a situação</w:t>
-        <w:br/>
-        <w:t xml:space="preserve">    atual do reservatório com a cor correspondente e imediatamente</w:t>
-        <w:br/>
-        <w:t xml:space="preserve">    restaurar o estilo padrão do terminal.</w:t>
+        <w:t xml:space="preserve">    e restaura imediatamente o estilo padrão do terminal (Agenda 10 e 11).</w:t>
         <w:br/>
         <w:br/>
         <w:t xml:space="preserve">    Parâmetros:</w:t>
         <w:br/>
-        <w:t xml:space="preserve">        item_reservatorio (dict): Dicionário contendo os dados do nível.</w:t>
+        <w:t xml:space="preserve">        nivel (int): Nível de água (1 a 5).</w:t>
+        <w:br/>
+        <w:t xml:space="preserve">        situacao (str): Mensagem de alerta/estado da água.</w:t>
         <w:br/>
         <w:t xml:space="preserve">    """</w:t>
         <w:br/>
-        <w:t xml:space="preserve">    nivel = item_reservatorio["nivel"]</w:t>
+        <w:t xml:space="preserve">    # 1. Obtém a cor através da função com retorno (Agenda 10)</w:t>
         <w:br/>
-        <w:t xml:space="preserve">    situacao = item_reservatorio["situacao"]</w:t>
-        <w:br/>
-        <w:t xml:space="preserve">    detalhes = item_reservatorio["detalhes"]</w:t>
+        <w:t xml:space="preserve">    cor = definir_cor_mensagem(nivel)</w:t>
         <w:br/>
         <w:br/>
-        <w:t xml:space="preserve">    # 1. Chamada da função que define a cor conforme o nível</w:t>
+        <w:t xml:space="preserve">    # 2. Exibe no terminal a situação com a cor correspondente (Agenda 11)</w:t>
         <w:br/>
-        <w:t xml:space="preserve">    cor = definir_cor_nivel(nivel)</w:t>
+        <w:t xml:space="preserve">    # 3. Restaura o estilo padrão do terminal usando Style.RESET_ALL (Agenda 11)</w:t>
         <w:br/>
-        <w:t xml:space="preserve">    barra = gerar_barra_nivel(nivel)</w:t>
-        <w:br/>
-        <w:br/>
-        <w:t xml:space="preserve">    # 2. Exibição da mensagem no terminal com a cor correspondente</w:t>
-        <w:br/>
-        <w:t xml:space="preserve">    print(cor + Style.BRIGHT + f"&gt;&gt; Nível {nivel}: {situacao:&lt;22}" + Style.RESET_ALL, end=" ")</w:t>
-        <w:br/>
-        <w:t xml:space="preserve">    print(cor + f"Escala: {barra:&lt;14}" + Style.RESET_ALL, end=" ")</w:t>
-        <w:br/>
-        <w:t xml:space="preserve">    print(Style.DIM + f"| Status: {detalhes}" + Style.RESET_ALL)</w:t>
-        <w:br/>
-        <w:br/>
-        <w:t xml:space="preserve">    # 3. Restaura o estilo padrão do terminal após a exibição da mensagem</w:t>
-        <w:br/>
-        <w:t xml:space="preserve">    print(Style.RESET_ALL, end="")</w:t>
+        <w:t xml:space="preserve">    print(cor + Style.BRIGHT + f"&gt;&gt; Nível {nivel}: {situacao}" + Style.RESET_ALL)</w:t>
         <w:br/>
         <w:br/>
         <w:br/>
-        <w:t>def simular_monitoramento(lista_niveis, intervalo_segundos=0.6):</w:t>
+        <w:t># ---------------------------------------------------------------------------</w:t>
+        <w:br/>
+        <w:t># AGENDA 08, 09, 10 &amp; 11: PROCEDIMENTO DE SIMULAÇÃO EM TEMPO REAL</w:t>
+        <w:br/>
+        <w:t># ---------------------------------------------------------------------------</w:t>
+        <w:br/>
+        <w:br/>
+        <w:t>def simular_monitoramento(lista_niveis, lista_mensagens, intervalo_segundos=1):</w:t>
         <w:br/>
         <w:t xml:space="preserve">    """</w:t>
         <w:br/>
-        <w:t xml:space="preserve">    Procedimento que simula o ciclo de monitoramento do reservatório,</w:t>
+        <w:t xml:space="preserve">    Procedimento que percorre as listas de dados simulando um ambiente real</w:t>
         <w:br/>
-        <w:t xml:space="preserve">    percorrendo todos os níveis da lista e exibindo os alertas coloridos.</w:t>
+        <w:t xml:space="preserve">    de monitoramento de sensores em tempo real.</w:t>
         <w:br/>
         <w:br/>
-        <w:t xml:space="preserve">    Parâmetros:</w:t>
+        <w:t xml:space="preserve">    Aplica:</w:t>
         <w:br/>
-        <w:t xml:space="preserve">        lista_niveis (list): Lista com os dicionários de cada nível.</w:t>
+        <w:t xml:space="preserve">    - Agenda 08: Estrutura de repetição for e função range().</w:t>
         <w:br/>
-        <w:t xml:space="preserve">        intervalo_segundos (float): Tempo de espera entre cada leitura.</w:t>
+        <w:t xml:space="preserve">    - Agenda 09: Listas, índices e a função len() para controle do percurso.</w:t>
+        <w:br/>
+        <w:t xml:space="preserve">    - Agenda 11: Biblioteca time com time.sleep() para criar pausas pedagógicas.</w:t>
         <w:br/>
         <w:t xml:space="preserve">    """</w:t>
         <w:br/>
-        <w:t xml:space="preserve">    print(Style.BRIGHT + "Iniciando ciclo de telemetria e diagnóstico dos sensores...\n" + Style.RESET_ALL)</w:t>
+        <w:t xml:space="preserve">    print(Style.BRIGHT + "Iniciando leitura e diagnóstico dos sensores em tempo real...\n" + Style.RESET_ALL)</w:t>
         <w:br/>
-        <w:t xml:space="preserve">    print("-" * 68)</w:t>
+        <w:t xml:space="preserve">    print("-" * 65)</w:t>
         <w:br/>
         <w:br/>
-        <w:t xml:space="preserve">    for item in lista_niveis:</w:t>
+        <w:t xml:space="preserve">    # Percorre as listas pelo índice utilizando len() e range() (Agenda 08 e 09)</w:t>
         <w:br/>
-        <w:t xml:space="preserve">        exibir_alerta_nivel(item)</w:t>
+        <w:t xml:space="preserve">    for i in range(len(lista_niveis)):</w:t>
+        <w:br/>
+        <w:t xml:space="preserve">        nivel_atual = lista_niveis[i]</w:t>
+        <w:br/>
+        <w:t xml:space="preserve">        mensagem_atual = lista_mensagens[i]</w:t>
+        <w:br/>
+        <w:br/>
+        <w:t xml:space="preserve">        # Chama o procedimento de exibição colorida (Agenda 10 e 11)</w:t>
+        <w:br/>
+        <w:t xml:space="preserve">        exibir_situacao_reservatorio(nivel_atual, mensagem_atual)</w:t>
+        <w:br/>
+        <w:br/>
+        <w:t xml:space="preserve">        # Pausa na execução com a biblioteca time (Agenda 11)</w:t>
         <w:br/>
         <w:t xml:space="preserve">        time.sleep(intervalo_segundos)</w:t>
         <w:br/>
         <w:br/>
-        <w:t xml:space="preserve">    print("-" * 68)</w:t>
+        <w:t xml:space="preserve">    print("-" * 65)</w:t>
         <w:br/>
         <w:t xml:space="preserve">    print()</w:t>
         <w:br/>
         <w:br/>
         <w:br/>
-        <w:t># ====================================================================</w:t>
+        <w:t># ---------------------------------------------------------------------------</w:t>
         <w:br/>
         <w:t># PROGRAMA PRINCIPAL</w:t>
         <w:br/>
-        <w:t># ====================================================================</w:t>
+        <w:t># ---------------------------------------------------------------------------</w:t>
         <w:br/>
         <w:br/>
         <w:t>if __name__ == "__main__":</w:t>
         <w:br/>
-        <w:t xml:space="preserve">    # Limpa a tela para exibição limpa e profissional</w:t>
+        <w:t xml:space="preserve">    # Limpa a tela do console (Agenda 10 e 11)</w:t>
         <w:br/>
         <w:t xml:space="preserve">    limpar_tela()</w:t>
         <w:br/>
@@ -1638,75 +1635,40 @@
         <w:t xml:space="preserve">    exibir_cabecalho()</w:t>
         <w:br/>
         <w:br/>
-        <w:t xml:space="preserve">    # 1. Utilização de uma lista para armazenar os níveis e situações do reservatório</w:t>
+        <w:t xml:space="preserve">    # AGENDA 09: ESTRUTURA DE DADOS - LISTAS</w:t>
         <w:br/>
-        <w:t xml:space="preserve">    niveis_reservatorio = [</w:t>
+        <w:t xml:space="preserve">    # Criação de listas com nomes no plural conforme as boas práticas da Agenda 09.</w:t>
         <w:br/>
-        <w:t xml:space="preserve">        {</w:t>
+        <w:t xml:space="preserve">    # Armazenam os 5 níveis e as 5 mensagens de situação do reservatório.</w:t>
         <w:br/>
-        <w:t xml:space="preserve">            "nivel": 1,</w:t>
+        <w:t xml:space="preserve">    niveis = [1, 2, 3, 4, 5]</w:t>
         <w:br/>
-        <w:t xml:space="preserve">            "situacao": "Muito baixo (crítico)",</w:t>
         <w:br/>
-        <w:t xml:space="preserve">            "detalhes": "Válvulas de emergência abertas. Risco iminente de desabastecimento."</w:t>
+        <w:t xml:space="preserve">    mensagens = [</w:t>
         <w:br/>
-        <w:t xml:space="preserve">        },</w:t>
+        <w:t xml:space="preserve">        "Muito baixo (crítico) - Risco de desabastecimento",</w:t>
         <w:br/>
-        <w:t xml:space="preserve">        {</w:t>
+        <w:t xml:space="preserve">        "Baixo - Atenção para acionamento de reposição",</w:t>
         <w:br/>
-        <w:t xml:space="preserve">            "nivel": 2,</w:t>
+        <w:t xml:space="preserve">        "Médio - Volume ideal para operação regular",</w:t>
         <w:br/>
-        <w:t xml:space="preserve">            "situacao": "Baixo",</w:t>
+        <w:t xml:space="preserve">        "Alto - Nível seguro com margem satisfatória",</w:t>
         <w:br/>
-        <w:t xml:space="preserve">            "detalhes": "Bomba de captação secundária acionada. Atenção para reposição."</w:t>
-        <w:br/>
-        <w:t xml:space="preserve">        },</w:t>
-        <w:br/>
-        <w:t xml:space="preserve">        {</w:t>
-        <w:br/>
-        <w:t xml:space="preserve">            "nivel": 3,</w:t>
-        <w:br/>
-        <w:t xml:space="preserve">            "situacao": "Médio",</w:t>
-        <w:br/>
-        <w:t xml:space="preserve">            "detalhes": "Capacidade estável. Volume ideal para consumo planejado."</w:t>
-        <w:br/>
-        <w:t xml:space="preserve">        },</w:t>
-        <w:br/>
-        <w:t xml:space="preserve">        {</w:t>
-        <w:br/>
-        <w:t xml:space="preserve">            "nivel": 4,</w:t>
-        <w:br/>
-        <w:t xml:space="preserve">            "situacao": "Alto",</w:t>
-        <w:br/>
-        <w:t xml:space="preserve">            "detalhes": "Reservatório com margem ampla. Entrada de água operando em 50%."</w:t>
-        <w:br/>
-        <w:t xml:space="preserve">        },</w:t>
-        <w:br/>
-        <w:t xml:space="preserve">        {</w:t>
-        <w:br/>
-        <w:t xml:space="preserve">            "nivel": 5,</w:t>
-        <w:br/>
-        <w:t xml:space="preserve">            "situacao": "Muito alto (alerta)",</w:t>
-        <w:br/>
-        <w:t xml:space="preserve">            "detalhes": "Capacidade máxima atingida! Vertedouro ativado contra transbordamento."</w:t>
-        <w:br/>
-        <w:t xml:space="preserve">        }</w:t>
+        <w:t xml:space="preserve">        "Muito alto (alerta) - Risco iminente de transbordamento"</w:t>
         <w:br/>
         <w:t xml:space="preserve">    ]</w:t>
         <w:br/>
         <w:br/>
-        <w:t xml:space="preserve">    # 2. Executa a simulação de monitoramento</w:t>
+        <w:t xml:space="preserve">    # AGENDA 11: Executa a simulação do ambiente real de monitoramento</w:t>
         <w:br/>
-        <w:t xml:space="preserve">    simular_monitoramento(niveis_reservatorio, intervalo_segundos=0.6)</w:t>
+        <w:t xml:space="preserve">    simular_monitoramento(niveis, mensagens, intervalo_segundos=1)</w:t>
         <w:br/>
         <w:br/>
-        <w:t xml:space="preserve">    # 3. Restauração explícita do estilo padrão do terminal (conforme orientação)</w:t>
+        <w:t xml:space="preserve">    # AGENDA 11: Restauração explícita final do terminal com Style.RESET_ALL</w:t>
         <w:br/>
-        <w:t xml:space="preserve">    print(Style.RESET_ALL + Fore.RESET + Back.RESET, end="")</w:t>
+        <w:t xml:space="preserve">    print(Fore.GREEN + Style.BRIGHT + "[OK] Ciclo de monitoramento concluído com sucesso!" + Style.RESET_ALL)</w:t>
         <w:br/>
-        <w:t xml:space="preserve">    print(Fore.GREEN + Style.BRIGHT + "[OK] Ciclo de monitoramento concluido com sucesso!" + Style.RESET_ALL)</w:t>
-        <w:br/>
-        <w:t xml:space="preserve">    print("Estilo padrao do terminal restaurado com sucesso.\n")</w:t>
+        <w:t xml:space="preserve">    print("Estilo padrão do terminal devidamente restaurado.\n")</w:t>
         <w:br/>
       </w:r>
     </w:p>

</xml_diff>

<commit_message>
docs: adicionar guia completo de estudos para prova e relatorio oficial cobrindo Agendas 01 a 11
</commit_message>
<xml_diff>
--- a/IraciBertoGomes_Ag11_DSI.docx
+++ b/IraciBertoGomes_Ag11_DSI.docx
@@ -14,7 +14,7 @@
           <w:color w:val="1A365D"/>
           <w:sz w:val="32"/>
         </w:rPr>
-        <w:t>RELATÓRIO TÉCNICO DE DESENVOLVIMENTO DE SOFTWARE</w:t>
+        <w:t>RELATÓRIO OFICIAL E GUIA COMPLETO DE ESTUDOS</w:t>
       </w:r>
     </w:p>
     <w:p>
@@ -30,23 +30,23 @@
         </w:rPr>
         <w:t>Curso Técnico em Desenvolvimento de Sistemas | ETEC / CPS</w:t>
         <w:br/>
-        <w:t>Componente: Desenvolvimento de Sistemas I — Agenda 11 (Estruturas de Dados e colorama)</w:t>
+        <w:t>Componente: Desenvolvimento de Sistemas I — Agendas 01 a 11 (Revisão Completa para Avaliação)</w:t>
         <w:br/>
-        <w:t>Estudante: Iraci Berto Gomes  |  Arquivo de Entrega: IraciBertoGomes_Ag11_DSI</w:t>
+        <w:t>Estudante: Iraci Berto Gomes  |  Arquivo Oficial: IraciBertoGomes_Ag11_DSI</w:t>
       </w:r>
     </w:p>
     <w:p>
       <w:pPr>
-        <w:spacing w:before="200" w:after="80"/>
+        <w:spacing w:before="280" w:after="80"/>
       </w:pPr>
       <w:r>
         <w:rPr>
           <w:rFonts w:ascii="Arial" w:hAnsi="Arial"/>
           <w:b/>
           <w:color w:val="1A365D"/>
-          <w:sz w:val="24"/>
+          <w:sz w:val="26"/>
         </w:rPr>
-        <w:t>1. Cenário e Objetivo da Atividade</w:t>
+        <w:t>1. Introdução: A Jornada de Desenvolvimento de Sistemas I</w:t>
       </w:r>
     </w:p>
     <w:p>
@@ -59,23 +59,35 @@
           <w:color w:val="2D3748"/>
           <w:sz w:val="19"/>
         </w:rPr>
-        <w:t>Fui contratado para auxiliar no desenvolvimento de um sistema de monitoramento de um reservatório de água executado via terminal. O sistema tem como objetivo emitir alertas visuais com cores distintas, de acordo com o nível de água identificado, permitindo um acompanhamento claro do estado de risco e da capacidade operacional do reservatório.</w:t>
-        <w:br/>
-        <w:t>Para garantir a apresentação cromática das mensagens, utilizou-se a biblioteca colorama. O software foi concebido com foco em programação estruturada, responsabilidade única, modularidade e simulação de ambiente real de telemetria.</w:t>
+        <w:t>Este relatório foi estruturado minuciosamente para servir como documento de comprovação técnica da Atividade da Agenda 11 e como Guia Definitivo de Estudos para a Avaliação do componente Desenvolvimento de Sistemas I. Cada uma das 11 agendas é dissecada com fundamentação teórica extraída das apostilas oficiais, sintaxe padrão, exemplos práticos de código, dicas para provas e sua aplicação direta no Sistema de Controle de Níveis de Água do Reservatório.</w:t>
       </w:r>
     </w:p>
     <w:p>
       <w:pPr>
-        <w:spacing w:before="200" w:after="80"/>
+        <w:spacing w:before="280" w:after="80"/>
       </w:pPr>
       <w:r>
         <w:rPr>
           <w:rFonts w:ascii="Arial" w:hAnsi="Arial"/>
           <w:b/>
           <w:color w:val="1A365D"/>
-          <w:sz w:val="24"/>
+          <w:sz w:val="26"/>
         </w:rPr>
-        <w:t>2. Tabela Oficial de Níveis, Situações e Cores do Reservatório</w:t>
+        <w:t>2. Conteúdo Programático das Apostilas (Agendas 01 a 11)</w:t>
+      </w:r>
+    </w:p>
+    <w:p>
+      <w:pPr>
+        <w:spacing w:before="160" w:after="60"/>
+      </w:pPr>
+      <w:r>
+        <w:rPr>
+          <w:rFonts w:ascii="Arial" w:hAnsi="Arial"/>
+          <w:b/>
+          <w:color w:val="2B6CB0"/>
+          <w:sz w:val="21"/>
+        </w:rPr>
+        <w:t>Agenda 01 — Raciocínio Lógico e Algoritmos</w:t>
       </w:r>
     </w:p>
     <w:p>
@@ -88,7 +100,20 @@
           <w:color w:val="2D3748"/>
           <w:sz w:val="19"/>
         </w:rPr>
-        <w:t>Conforme estipulado pelas diretrizes da Agenda 11, o reservatório opera em 5 níveis de risco e capacidade:</w:t>
+        <w:t>• Fundamentação Teórica: Um algoritmo é uma sequência finita, ordenada e não ambígua de instruções para solucionar um problema. Antes de codificar em qualquer linguagem, o profissional de TI deve decompor o desafio em etapas lógicas: Entrada de dados (dados iniciais), Processamento (transformações e cálculos) e Saída (resultado apresentado). O pensamento computacional estrutura a solução antes da digitação da primeira linha de código.</w:t>
+      </w:r>
+    </w:p>
+    <w:p>
+      <w:pPr>
+        <w:spacing w:after="80" w:line="276" w:lineRule="auto"/>
+      </w:pPr>
+      <w:r>
+        <w:rPr>
+          <w:rFonts w:ascii="Arial" w:hAnsi="Arial"/>
+          <w:color w:val="2D3748"/>
+          <w:sz w:val="19"/>
+        </w:rPr>
+        <w:t>• Exemplo Prático em Python:</w:t>
       </w:r>
     </w:p>
     <w:tbl>
@@ -99,16 +124,1609 @@
         <w:tblLook w:firstColumn="1" w:firstRow="1" w:lastColumn="0" w:lastRow="0" w:noHBand="0" w:noVBand="1" w:val="04A0"/>
       </w:tblPr>
       <w:tblGrid>
-        <w:gridCol w:w="2045"/>
-        <w:gridCol w:w="2045"/>
-        <w:gridCol w:w="2045"/>
-        <w:gridCol w:w="2045"/>
-        <w:gridCol w:w="2045"/>
+        <w:gridCol w:w="10368"/>
       </w:tblGrid>
       <w:tr>
         <w:tc>
           <w:tcPr>
-            <w:tcW w:type="dxa" w:w="1440"/>
+            <w:tcW w:type="dxa" w:w="10368"/>
+            <w:shd w:val="clear" w:color="auto" w:fill="F1F5F9"/>
+          </w:tcPr>
+          <w:p>
+            <w:pPr>
+              <w:spacing w:before="80" w:after="80" w:line="252" w:lineRule="auto"/>
+            </w:pPr>
+            <w:r>
+              <w:rPr>
+                <w:rFonts w:ascii="Courier New" w:hAnsi="Courier New"/>
+                <w:color w:val="0F172A"/>
+                <w:sz w:val="17"/>
+              </w:rPr>
+              <w:t># Exemplo: Cálculo do volume de abastecimento</w:t>
+              <w:br/>
+              <w:t>capacidade_maxima = 1000  # Entrada: litros</w:t>
+              <w:br/>
+              <w:t>nivel_atual = 350         # Entrada: litros</w:t>
+              <w:br/>
+              <w:t>volume_necessario = capacidade_maxima - nivel_atual  # Processamento</w:t>
+              <w:br/>
+              <w:t>print('Litros para encher:', volume_necessario)       # Saída: 650</w:t>
+            </w:r>
+          </w:p>
+        </w:tc>
+      </w:tr>
+    </w:tbl>
+    <w:p>
+      <w:pPr>
+        <w:spacing w:after="40"/>
+      </w:pPr>
+    </w:p>
+    <w:tbl>
+      <w:tblPr>
+        <w:tblW w:type="auto" w:w="0"/>
+        <w:jc w:val="center"/>
+        <w:tblLayout w:type="fixed"/>
+        <w:tblLook w:firstColumn="1" w:firstRow="1" w:lastColumn="0" w:lastRow="0" w:noHBand="0" w:noVBand="1" w:val="04A0"/>
+      </w:tblPr>
+      <w:tblGrid>
+        <w:gridCol w:w="10368"/>
+      </w:tblGrid>
+      <w:tr>
+        <w:tc>
+          <w:tcPr>
+            <w:tcW w:type="dxa" w:w="10368"/>
+            <w:shd w:val="clear" w:color="auto" w:fill="FEF3C7"/>
+          </w:tcPr>
+          <w:p>
+            <w:pPr>
+              <w:spacing w:before="80" w:after="80" w:line="252" w:lineRule="auto"/>
+            </w:pPr>
+            <w:r>
+              <w:rPr>
+                <w:rFonts w:ascii="Arial" w:hAnsi="Arial"/>
+                <w:b/>
+                <w:color w:val="92400E"/>
+                <w:sz w:val="18"/>
+              </w:rPr>
+              <w:t>⚠️ Dica de Prova: Não confunda 'Dado' com 'Informação'. Dado é o elemento bruto não processado (ex: número 350). Informação é o dado processado com contexto e significado (ex: 'Faltam 650 litros para transbordar').</w:t>
+            </w:r>
+          </w:p>
+        </w:tc>
+      </w:tr>
+    </w:tbl>
+    <w:p>
+      <w:pPr>
+        <w:spacing w:after="40"/>
+      </w:pPr>
+    </w:p>
+    <w:p>
+      <w:pPr>
+        <w:spacing w:after="80" w:line="276" w:lineRule="auto"/>
+      </w:pPr>
+      <w:r>
+        <w:rPr>
+          <w:rFonts w:ascii="Arial" w:hAnsi="Arial"/>
+          <w:color w:val="2D3748"/>
+          <w:sz w:val="19"/>
+        </w:rPr>
+        <w:t>• Aplicação na Atividade Prática: Na Agenda 11, o algoritmo sequencia com precisão: limpar tela -&gt; cabeçalho -&gt; iterar níveis -&gt; exibir alertas -&gt; restaurar terminal.</w:t>
+      </w:r>
+    </w:p>
+    <w:p>
+      <w:pPr>
+        <w:spacing w:before="160" w:after="60"/>
+      </w:pPr>
+      <w:r>
+        <w:rPr>
+          <w:rFonts w:ascii="Arial" w:hAnsi="Arial"/>
+          <w:b/>
+          <w:color w:val="2B6CB0"/>
+          <w:sz w:val="21"/>
+        </w:rPr>
+        <w:t>Agenda 02 — Introdução à Programação com Python: Variáveis e Tipos Primitivos</w:t>
+      </w:r>
+    </w:p>
+    <w:p>
+      <w:pPr>
+        <w:spacing w:after="80" w:line="276" w:lineRule="auto"/>
+      </w:pPr>
+      <w:r>
+        <w:rPr>
+          <w:rFonts w:ascii="Arial" w:hAnsi="Arial"/>
+          <w:color w:val="2D3748"/>
+          <w:sz w:val="19"/>
+        </w:rPr>
+        <w:t>• Fundamentação Teórica: Variáveis são espaços alocados na memória do computador para armazenar valores temporários. Python possui tipagem dinâmica (o tipo é inferido automaticamente). Os quatro tipos primitivos fundamentais são:</w:t>
+        <w:br/>
+        <w:t>• int: Números inteiros (ex: 1, 5, -10).</w:t>
+        <w:br/>
+        <w:t>• float: Números decimais de ponto flutuante (ex: 7.5, 0.05). Usa-se ponto e não vírgula!</w:t>
+        <w:br/>
+        <w:t>• str: Cadeias de caracteres (textos) delimitadas por aspas simples ou duplas.</w:t>
+        <w:br/>
+        <w:t>• bool: Valores lógicos booleanos, estritamente True ou False (com inicial maiúscula).</w:t>
+      </w:r>
+    </w:p>
+    <w:p>
+      <w:pPr>
+        <w:spacing w:after="80" w:line="276" w:lineRule="auto"/>
+      </w:pPr>
+      <w:r>
+        <w:rPr>
+          <w:rFonts w:ascii="Arial" w:hAnsi="Arial"/>
+          <w:color w:val="2D3748"/>
+          <w:sz w:val="19"/>
+        </w:rPr>
+        <w:t>• Exemplo Prático em Python:</w:t>
+      </w:r>
+    </w:p>
+    <w:tbl>
+      <w:tblPr>
+        <w:tblW w:type="auto" w:w="0"/>
+        <w:jc w:val="center"/>
+        <w:tblLayout w:type="fixed"/>
+        <w:tblLook w:firstColumn="1" w:firstRow="1" w:lastColumn="0" w:lastRow="0" w:noHBand="0" w:noVBand="1" w:val="04A0"/>
+      </w:tblPr>
+      <w:tblGrid>
+        <w:gridCol w:w="10368"/>
+      </w:tblGrid>
+      <w:tr>
+        <w:tc>
+          <w:tcPr>
+            <w:tcW w:type="dxa" w:w="10368"/>
+            <w:shd w:val="clear" w:color="auto" w:fill="F1F5F9"/>
+          </w:tcPr>
+          <w:p>
+            <w:pPr>
+              <w:spacing w:before="80" w:after="80" w:line="252" w:lineRule="auto"/>
+            </w:pPr>
+            <w:r>
+              <w:rPr>
+                <w:rFonts w:ascii="Courier New" w:hAnsi="Courier New"/>
+                <w:color w:val="0F172A"/>
+                <w:sz w:val="17"/>
+              </w:rPr>
+              <w:t>nivel = 3                          # int</w:t>
+              <w:br/>
+              <w:t>porcentagem = 60.0                  # float</w:t>
+              <w:br/>
+              <w:t>situacao = 'Médio (Estável)'        # str</w:t>
+              <w:br/>
+              <w:t>sistema_ativo = True                # bool</w:t>
+              <w:br/>
+              <w:t>print(type(nivel), type(porcentagem), type(situacao), type(sistema_ativo))</w:t>
+            </w:r>
+          </w:p>
+        </w:tc>
+      </w:tr>
+    </w:tbl>
+    <w:p>
+      <w:pPr>
+        <w:spacing w:after="40"/>
+      </w:pPr>
+    </w:p>
+    <w:tbl>
+      <w:tblPr>
+        <w:tblW w:type="auto" w:w="0"/>
+        <w:jc w:val="center"/>
+        <w:tblLayout w:type="fixed"/>
+        <w:tblLook w:firstColumn="1" w:firstRow="1" w:lastColumn="0" w:lastRow="0" w:noHBand="0" w:noVBand="1" w:val="04A0"/>
+      </w:tblPr>
+      <w:tblGrid>
+        <w:gridCol w:w="10368"/>
+      </w:tblGrid>
+      <w:tr>
+        <w:tc>
+          <w:tcPr>
+            <w:tcW w:type="dxa" w:w="10368"/>
+            <w:shd w:val="clear" w:color="auto" w:fill="FEF3C7"/>
+          </w:tcPr>
+          <w:p>
+            <w:pPr>
+              <w:spacing w:before="80" w:after="80" w:line="252" w:lineRule="auto"/>
+            </w:pPr>
+            <w:r>
+              <w:rPr>
+                <w:rFonts w:ascii="Arial" w:hAnsi="Arial"/>
+                <w:b/>
+                <w:color w:val="92400E"/>
+                <w:sz w:val="18"/>
+              </w:rPr>
+              <w:t>⚠️ Dica de Prova: Nomes de variáveis devem usar 'snake_case' (letras minúsculas com sublinhado). Não podem começar com números, não podem conter espaços nem traços, e diferenciam maiúsculas de minúsculas (case-sensitive)!</w:t>
+            </w:r>
+          </w:p>
+        </w:tc>
+      </w:tr>
+    </w:tbl>
+    <w:p>
+      <w:pPr>
+        <w:spacing w:after="40"/>
+      </w:pPr>
+    </w:p>
+    <w:p>
+      <w:pPr>
+        <w:spacing w:after="80" w:line="276" w:lineRule="auto"/>
+      </w:pPr>
+      <w:r>
+        <w:rPr>
+          <w:rFonts w:ascii="Arial" w:hAnsi="Arial"/>
+          <w:color w:val="2D3748"/>
+          <w:sz w:val="19"/>
+        </w:rPr>
+        <w:t>• Aplicação na Atividade Prática: O nível 1 a 5 é trabalhado como int, a situação é uma str e o status da telemetria é controlado como bool.</w:t>
+      </w:r>
+    </w:p>
+    <w:p>
+      <w:pPr>
+        <w:spacing w:before="160" w:after="60"/>
+      </w:pPr>
+      <w:r>
+        <w:rPr>
+          <w:rFonts w:ascii="Arial" w:hAnsi="Arial"/>
+          <w:b/>
+          <w:color w:val="2B6CB0"/>
+          <w:sz w:val="21"/>
+        </w:rPr>
+        <w:t>Agenda 03 — Entrada de Dados, Operadores Aritméticos e f-Strings</w:t>
+      </w:r>
+    </w:p>
+    <w:p>
+      <w:pPr>
+        <w:spacing w:after="80" w:line="276" w:lineRule="auto"/>
+      </w:pPr>
+      <w:r>
+        <w:rPr>
+          <w:rFonts w:ascii="Arial" w:hAnsi="Arial"/>
+          <w:color w:val="2D3748"/>
+          <w:sz w:val="19"/>
+        </w:rPr>
+        <w:t>• Fundamentação Teórica: O comando input() sempre captura dados do teclado no formato de texto (str). Para operações matemáticas, é obrigatório realizar o 'type casting' (conversão de tipo) usando int() ou float().</w:t>
+        <w:br/>
+        <w:t>Operadores Aritméticos: + (adição), - (subtração), * (multiplicação), / (divisão real), // (divisão inteira), % (resto da divisão / módulo), ** (exponenciação).</w:t>
+        <w:br/>
+        <w:t>Para exibir resultados com texto e variáveis juntos, o padrão moderno e recomendado do Python são as f-strings (f'Texto {variavel}').</w:t>
+      </w:r>
+    </w:p>
+    <w:p>
+      <w:pPr>
+        <w:spacing w:after="80" w:line="276" w:lineRule="auto"/>
+      </w:pPr>
+      <w:r>
+        <w:rPr>
+          <w:rFonts w:ascii="Arial" w:hAnsi="Arial"/>
+          <w:color w:val="2D3748"/>
+          <w:sz w:val="19"/>
+        </w:rPr>
+        <w:t>• Exemplo Prático em Python:</w:t>
+      </w:r>
+    </w:p>
+    <w:tbl>
+      <w:tblPr>
+        <w:tblW w:type="auto" w:w="0"/>
+        <w:jc w:val="center"/>
+        <w:tblLayout w:type="fixed"/>
+        <w:tblLook w:firstColumn="1" w:firstRow="1" w:lastColumn="0" w:lastRow="0" w:noHBand="0" w:noVBand="1" w:val="04A0"/>
+      </w:tblPr>
+      <w:tblGrid>
+        <w:gridCol w:w="10368"/>
+      </w:tblGrid>
+      <w:tr>
+        <w:tc>
+          <w:tcPr>
+            <w:tcW w:type="dxa" w:w="10368"/>
+            <w:shd w:val="clear" w:color="auto" w:fill="F1F5F9"/>
+          </w:tcPr>
+          <w:p>
+            <w:pPr>
+              <w:spacing w:before="80" w:after="80" w:line="252" w:lineRule="auto"/>
+            </w:pPr>
+            <w:r>
+              <w:rPr>
+                <w:rFonts w:ascii="Courier New" w:hAnsi="Courier New"/>
+                <w:color w:val="0F172A"/>
+                <w:sz w:val="17"/>
+              </w:rPr>
+              <w:t>nivel_digitado = int('4')  # Simulação de casting seguro</w:t>
+              <w:br/>
+              <w:t>capacidade_maxima = 5</w:t>
+              <w:br/>
+              <w:t>porcentagem = (nivel_digitado / capacidade_maxima) * 100</w:t>
+              <w:br/>
+              <w:t>print(f'Nível informado: {nivel_digitado} | Ocupação: {porcentagem:.1f}%')</w:t>
+            </w:r>
+          </w:p>
+        </w:tc>
+      </w:tr>
+    </w:tbl>
+    <w:p>
+      <w:pPr>
+        <w:spacing w:after="40"/>
+      </w:pPr>
+    </w:p>
+    <w:tbl>
+      <w:tblPr>
+        <w:tblW w:type="auto" w:w="0"/>
+        <w:jc w:val="center"/>
+        <w:tblLayout w:type="fixed"/>
+        <w:tblLook w:firstColumn="1" w:firstRow="1" w:lastColumn="0" w:lastRow="0" w:noHBand="0" w:noVBand="1" w:val="04A0"/>
+      </w:tblPr>
+      <w:tblGrid>
+        <w:gridCol w:w="10368"/>
+      </w:tblGrid>
+      <w:tr>
+        <w:tc>
+          <w:tcPr>
+            <w:tcW w:type="dxa" w:w="10368"/>
+            <w:shd w:val="clear" w:color="auto" w:fill="FEF3C7"/>
+          </w:tcPr>
+          <w:p>
+            <w:pPr>
+              <w:spacing w:before="80" w:after="80" w:line="252" w:lineRule="auto"/>
+            </w:pPr>
+            <w:r>
+              <w:rPr>
+                <w:rFonts w:ascii="Arial" w:hAnsi="Arial"/>
+                <w:b/>
+                <w:color w:val="92400E"/>
+                <w:sz w:val="18"/>
+              </w:rPr>
+              <w:t>⚠️ Dica de Prova: '7' + '3' resulta em '73' (concatenação de strings) e não 10! Se esquecer de converter o input() com int() ou float(), o Python fará concatenação ou gerará TypeError.</w:t>
+            </w:r>
+          </w:p>
+        </w:tc>
+      </w:tr>
+    </w:tbl>
+    <w:p>
+      <w:pPr>
+        <w:spacing w:after="40"/>
+      </w:pPr>
+    </w:p>
+    <w:p>
+      <w:pPr>
+        <w:spacing w:after="80" w:line="276" w:lineRule="auto"/>
+      </w:pPr>
+      <w:r>
+        <w:rPr>
+          <w:rFonts w:ascii="Arial" w:hAnsi="Arial"/>
+          <w:color w:val="2D3748"/>
+          <w:sz w:val="19"/>
+        </w:rPr>
+        <w:t>• Aplicação na Atividade Prática: Utilizamos f-strings no comando de exibição formatada do reservatório: f'&gt;&gt; Nível {nivel}: {situacao}'.</w:t>
+      </w:r>
+    </w:p>
+    <w:p>
+      <w:pPr>
+        <w:spacing w:before="160" w:after="60"/>
+      </w:pPr>
+      <w:r>
+        <w:rPr>
+          <w:rFonts w:ascii="Arial" w:hAnsi="Arial"/>
+          <w:b/>
+          <w:color w:val="2B6CB0"/>
+          <w:sz w:val="21"/>
+        </w:rPr>
+        <w:t>Agenda 04 — Controle de Versão com Git (Parte 1: Fundamentos Locais)</w:t>
+      </w:r>
+    </w:p>
+    <w:p>
+      <w:pPr>
+        <w:spacing w:after="80" w:line="276" w:lineRule="auto"/>
+      </w:pPr>
+      <w:r>
+        <w:rPr>
+          <w:rFonts w:ascii="Arial" w:hAnsi="Arial"/>
+          <w:color w:val="2D3748"/>
+          <w:sz w:val="19"/>
+        </w:rPr>
+        <w:t>• Fundamentação Teórica: O Git é um sistema distribuído de controle de versão (VCS) que registra o histórico completo de evolução do código. Ele opera através de três áreas de trabalho locais:</w:t>
+        <w:br/>
+        <w:t>1. Working Directory (Diretório de Trabalho): Arquivos que você está editando.</w:t>
+        <w:br/>
+        <w:t>2. Staging Area / Index: Área de preparação onde você seleciona quais arquivos farão parte do próximo registro.</w:t>
+        <w:br/>
+        <w:t>3. Repository / Local Git (.git): Banco de dados onde os commits são permanentemente gravados.</w:t>
+      </w:r>
+    </w:p>
+    <w:p>
+      <w:pPr>
+        <w:spacing w:after="80" w:line="276" w:lineRule="auto"/>
+      </w:pPr>
+      <w:r>
+        <w:rPr>
+          <w:rFonts w:ascii="Arial" w:hAnsi="Arial"/>
+          <w:color w:val="2D3748"/>
+          <w:sz w:val="19"/>
+        </w:rPr>
+        <w:t>• Exemplo Prático em Python:</w:t>
+      </w:r>
+    </w:p>
+    <w:tbl>
+      <w:tblPr>
+        <w:tblW w:type="auto" w:w="0"/>
+        <w:jc w:val="center"/>
+        <w:tblLayout w:type="fixed"/>
+        <w:tblLook w:firstColumn="1" w:firstRow="1" w:lastColumn="0" w:lastRow="0" w:noHBand="0" w:noVBand="1" w:val="04A0"/>
+      </w:tblPr>
+      <w:tblGrid>
+        <w:gridCol w:w="10368"/>
+      </w:tblGrid>
+      <w:tr>
+        <w:tc>
+          <w:tcPr>
+            <w:tcW w:type="dxa" w:w="10368"/>
+            <w:shd w:val="clear" w:color="auto" w:fill="F1F5F9"/>
+          </w:tcPr>
+          <w:p>
+            <w:pPr>
+              <w:spacing w:before="80" w:after="80" w:line="252" w:lineRule="auto"/>
+            </w:pPr>
+            <w:r>
+              <w:rPr>
+                <w:rFonts w:ascii="Courier New" w:hAnsi="Courier New"/>
+                <w:color w:val="0F172A"/>
+                <w:sz w:val="17"/>
+              </w:rPr>
+              <w:t># No terminal dentro da pasta do projeto:</w:t>
+              <w:br/>
+              <w:t>git init</w:t>
+              <w:br/>
+              <w:t>git add IraciBertoGomes_Ag11_DSI.py</w:t>
+              <w:br/>
+              <w:t>git commit -m 'feat: adicionar monitoramento de nivel de agua'</w:t>
+            </w:r>
+          </w:p>
+        </w:tc>
+      </w:tr>
+    </w:tbl>
+    <w:p>
+      <w:pPr>
+        <w:spacing w:after="40"/>
+      </w:pPr>
+    </w:p>
+    <w:tbl>
+      <w:tblPr>
+        <w:tblW w:type="auto" w:w="0"/>
+        <w:jc w:val="center"/>
+        <w:tblLayout w:type="fixed"/>
+        <w:tblLook w:firstColumn="1" w:firstRow="1" w:lastColumn="0" w:lastRow="0" w:noHBand="0" w:noVBand="1" w:val="04A0"/>
+      </w:tblPr>
+      <w:tblGrid>
+        <w:gridCol w:w="10368"/>
+      </w:tblGrid>
+      <w:tr>
+        <w:tc>
+          <w:tcPr>
+            <w:tcW w:type="dxa" w:w="10368"/>
+            <w:shd w:val="clear" w:color="auto" w:fill="FEF3C7"/>
+          </w:tcPr>
+          <w:p>
+            <w:pPr>
+              <w:spacing w:before="80" w:after="80" w:line="252" w:lineRule="auto"/>
+            </w:pPr>
+            <w:r>
+              <w:rPr>
+                <w:rFonts w:ascii="Arial" w:hAnsi="Arial"/>
+                <w:b/>
+                <w:color w:val="92400E"/>
+                <w:sz w:val="18"/>
+              </w:rPr>
+              <w:t>⚠️ Dica de Prova: 'git add' não salva o arquivo no histórico final! Ele apenas prepara (stage). O que grava a versão de forma definitiva é o 'git commit -m "..."'.</w:t>
+            </w:r>
+          </w:p>
+        </w:tc>
+      </w:tr>
+    </w:tbl>
+    <w:p>
+      <w:pPr>
+        <w:spacing w:after="40"/>
+      </w:pPr>
+    </w:p>
+    <w:p>
+      <w:pPr>
+        <w:spacing w:after="80" w:line="276" w:lineRule="auto"/>
+      </w:pPr>
+      <w:r>
+        <w:rPr>
+          <w:rFonts w:ascii="Arial" w:hAnsi="Arial"/>
+          <w:color w:val="2D3748"/>
+          <w:sz w:val="19"/>
+        </w:rPr>
+        <w:t>• Aplicação na Atividade Prática: Nossa atividade cumpre a Habilidade 4.2 criando commits semânticos no repositório da pasta AGENDA_11.</w:t>
+      </w:r>
+    </w:p>
+    <w:p>
+      <w:pPr>
+        <w:spacing w:before="160" w:after="60"/>
+      </w:pPr>
+      <w:r>
+        <w:rPr>
+          <w:rFonts w:ascii="Arial" w:hAnsi="Arial"/>
+          <w:b/>
+          <w:color w:val="2B6CB0"/>
+          <w:sz w:val="21"/>
+        </w:rPr>
+        <w:t>Agenda 05 — Controle de Versão com Git e GitHub (Parte 2: Repositórios Remotos)</w:t>
+      </w:r>
+    </w:p>
+    <w:p>
+      <w:pPr>
+        <w:spacing w:after="80" w:line="276" w:lineRule="auto"/>
+      </w:pPr>
+      <w:r>
+        <w:rPr>
+          <w:rFonts w:ascii="Arial" w:hAnsi="Arial"/>
+          <w:color w:val="2D3748"/>
+          <w:sz w:val="19"/>
+        </w:rPr>
+        <w:t>• Fundamentação Teórica: O GitHub é uma plataforma em nuvem que hospeda repositórios Git, viabilizando colaboração e backup seguro. O branch principal moderno é chamado de 'main'.</w:t>
+        <w:br/>
+        <w:t>Para sincronizar o computador com a nuvem, vinculamos um 'remote' (apelidado de 'origin') e enviamos os commits com 'push'.</w:t>
+        <w:br/>
+        <w:t>Comandos essenciais: git remote add origin &lt;url&gt;, git branch -M main, git push -u origin main, git clone &lt;url&gt;.</w:t>
+      </w:r>
+    </w:p>
+    <w:p>
+      <w:pPr>
+        <w:spacing w:after="80" w:line="276" w:lineRule="auto"/>
+      </w:pPr>
+      <w:r>
+        <w:rPr>
+          <w:rFonts w:ascii="Arial" w:hAnsi="Arial"/>
+          <w:color w:val="2D3748"/>
+          <w:sz w:val="19"/>
+        </w:rPr>
+        <w:t>• Exemplo Prático em Python:</w:t>
+      </w:r>
+    </w:p>
+    <w:tbl>
+      <w:tblPr>
+        <w:tblW w:type="auto" w:w="0"/>
+        <w:jc w:val="center"/>
+        <w:tblLayout w:type="fixed"/>
+        <w:tblLook w:firstColumn="1" w:firstRow="1" w:lastColumn="0" w:lastRow="0" w:noHBand="0" w:noVBand="1" w:val="04A0"/>
+      </w:tblPr>
+      <w:tblGrid>
+        <w:gridCol w:w="10368"/>
+      </w:tblGrid>
+      <w:tr>
+        <w:tc>
+          <w:tcPr>
+            <w:tcW w:type="dxa" w:w="10368"/>
+            <w:shd w:val="clear" w:color="auto" w:fill="F1F5F9"/>
+          </w:tcPr>
+          <w:p>
+            <w:pPr>
+              <w:spacing w:before="80" w:after="80" w:line="252" w:lineRule="auto"/>
+            </w:pPr>
+            <w:r>
+              <w:rPr>
+                <w:rFonts w:ascii="Courier New" w:hAnsi="Courier New"/>
+                <w:color w:val="0F172A"/>
+                <w:sz w:val="17"/>
+              </w:rPr>
+              <w:t># Conectar o projeto local ao repositório criado no GitHub:</w:t>
+              <w:br/>
+              <w:t>git remote add origin https://github.com/IraciBerto/Controle_Agua.git</w:t>
+              <w:br/>
+              <w:t>git push -u origin main</w:t>
+            </w:r>
+          </w:p>
+        </w:tc>
+      </w:tr>
+    </w:tbl>
+    <w:p>
+      <w:pPr>
+        <w:spacing w:after="40"/>
+      </w:pPr>
+    </w:p>
+    <w:tbl>
+      <w:tblPr>
+        <w:tblW w:type="auto" w:w="0"/>
+        <w:jc w:val="center"/>
+        <w:tblLayout w:type="fixed"/>
+        <w:tblLook w:firstColumn="1" w:firstRow="1" w:lastColumn="0" w:lastRow="0" w:noHBand="0" w:noVBand="1" w:val="04A0"/>
+      </w:tblPr>
+      <w:tblGrid>
+        <w:gridCol w:w="10368"/>
+      </w:tblGrid>
+      <w:tr>
+        <w:tc>
+          <w:tcPr>
+            <w:tcW w:type="dxa" w:w="10368"/>
+            <w:shd w:val="clear" w:color="auto" w:fill="FEF3C7"/>
+          </w:tcPr>
+          <w:p>
+            <w:pPr>
+              <w:spacing w:before="80" w:after="80" w:line="252" w:lineRule="auto"/>
+            </w:pPr>
+            <w:r>
+              <w:rPr>
+                <w:rFonts w:ascii="Arial" w:hAnsi="Arial"/>
+                <w:b/>
+                <w:color w:val="92400E"/>
+                <w:sz w:val="18"/>
+              </w:rPr>
+              <w:t>⚠️ Dica de Prova: O parâmetro '-u' (upstream) no 'git push -u origin main' cria o vínculo permanente entre o branch local e o remoto. Nos envios seguintes, basta digitar apenas 'git push'.</w:t>
+            </w:r>
+          </w:p>
+        </w:tc>
+      </w:tr>
+    </w:tbl>
+    <w:p>
+      <w:pPr>
+        <w:spacing w:after="40"/>
+      </w:pPr>
+    </w:p>
+    <w:p>
+      <w:pPr>
+        <w:spacing w:after="80" w:line="276" w:lineRule="auto"/>
+      </w:pPr>
+      <w:r>
+        <w:rPr>
+          <w:rFonts w:ascii="Arial" w:hAnsi="Arial"/>
+          <w:color w:val="2D3748"/>
+          <w:sz w:val="19"/>
+        </w:rPr>
+        <w:t>• Aplicação na Atividade Prática: A entrega da atividade exige compartilhar o link do repositório GitHub no fichário virtual da ETEC.</w:t>
+      </w:r>
+    </w:p>
+    <w:p>
+      <w:pPr>
+        <w:spacing w:before="160" w:after="60"/>
+      </w:pPr>
+      <w:r>
+        <w:rPr>
+          <w:rFonts w:ascii="Arial" w:hAnsi="Arial"/>
+          <w:b/>
+          <w:color w:val="2B6CB0"/>
+          <w:sz w:val="21"/>
+        </w:rPr>
+        <w:t>Agenda 06 — Estruturas de Decisão Simples e Composta (if / else)</w:t>
+      </w:r>
+    </w:p>
+    <w:p>
+      <w:pPr>
+        <w:spacing w:after="80" w:line="276" w:lineRule="auto"/>
+      </w:pPr>
+      <w:r>
+        <w:rPr>
+          <w:rFonts w:ascii="Arial" w:hAnsi="Arial"/>
+          <w:color w:val="2D3748"/>
+          <w:sz w:val="19"/>
+        </w:rPr>
+        <w:t>• Fundamentação Teórica: Permite que o programa escolha caminhos alternativos de execução com base no teste de uma condição lógica.</w:t>
+        <w:br/>
+        <w:t>• Condição Simples: 'if condicao:' -&gt; executa o bloco indentado somente se o teste for True.</w:t>
+        <w:br/>
+        <w:t>• Condição Composta: 'if condicao: ... else: ...' -&gt; se True executa o primeiro bloco; se False executa o else.</w:t>
+        <w:br/>
+        <w:t>Operadores Relacionais: == (igualdade), != (diferente), &gt; (maior), &lt; (menor), &gt;= (maior ou igual), &lt;= (menor ou igual).</w:t>
+      </w:r>
+    </w:p>
+    <w:p>
+      <w:pPr>
+        <w:spacing w:after="80" w:line="276" w:lineRule="auto"/>
+      </w:pPr>
+      <w:r>
+        <w:rPr>
+          <w:rFonts w:ascii="Arial" w:hAnsi="Arial"/>
+          <w:color w:val="2D3748"/>
+          <w:sz w:val="19"/>
+        </w:rPr>
+        <w:t>• Exemplo Prático em Python:</w:t>
+      </w:r>
+    </w:p>
+    <w:tbl>
+      <w:tblPr>
+        <w:tblW w:type="auto" w:w="0"/>
+        <w:jc w:val="center"/>
+        <w:tblLayout w:type="fixed"/>
+        <w:tblLook w:firstColumn="1" w:firstRow="1" w:lastColumn="0" w:lastRow="0" w:noHBand="0" w:noVBand="1" w:val="04A0"/>
+      </w:tblPr>
+      <w:tblGrid>
+        <w:gridCol w:w="10368"/>
+      </w:tblGrid>
+      <w:tr>
+        <w:tc>
+          <w:tcPr>
+            <w:tcW w:type="dxa" w:w="10368"/>
+            <w:shd w:val="clear" w:color="auto" w:fill="F1F5F9"/>
+          </w:tcPr>
+          <w:p>
+            <w:pPr>
+              <w:spacing w:before="80" w:after="80" w:line="252" w:lineRule="auto"/>
+            </w:pPr>
+            <w:r>
+              <w:rPr>
+                <w:rFonts w:ascii="Courier New" w:hAnsi="Courier New"/>
+                <w:color w:val="0F172A"/>
+                <w:sz w:val="17"/>
+              </w:rPr>
+              <w:t>nivel_agua = 1</w:t>
+              <w:br/>
+              <w:t>if nivel_agua == 1:</w:t>
+              <w:br/>
+              <w:t xml:space="preserve">    print('Alerta Crítico!')</w:t>
+              <w:br/>
+              <w:t>else:</w:t>
+              <w:br/>
+              <w:t xml:space="preserve">    print('Nível Operacional Seguro.')</w:t>
+            </w:r>
+          </w:p>
+        </w:tc>
+      </w:tr>
+    </w:tbl>
+    <w:p>
+      <w:pPr>
+        <w:spacing w:after="40"/>
+      </w:pPr>
+    </w:p>
+    <w:tbl>
+      <w:tblPr>
+        <w:tblW w:type="auto" w:w="0"/>
+        <w:jc w:val="center"/>
+        <w:tblLayout w:type="fixed"/>
+        <w:tblLook w:firstColumn="1" w:firstRow="1" w:lastColumn="0" w:lastRow="0" w:noHBand="0" w:noVBand="1" w:val="04A0"/>
+      </w:tblPr>
+      <w:tblGrid>
+        <w:gridCol w:w="10368"/>
+      </w:tblGrid>
+      <w:tr>
+        <w:tc>
+          <w:tcPr>
+            <w:tcW w:type="dxa" w:w="10368"/>
+            <w:shd w:val="clear" w:color="auto" w:fill="FEF3C7"/>
+          </w:tcPr>
+          <w:p>
+            <w:pPr>
+              <w:spacing w:before="80" w:after="80" w:line="252" w:lineRule="auto"/>
+            </w:pPr>
+            <w:r>
+              <w:rPr>
+                <w:rFonts w:ascii="Arial" w:hAnsi="Arial"/>
+                <w:b/>
+                <w:color w:val="92400E"/>
+                <w:sz w:val="18"/>
+              </w:rPr>
+              <w:t>⚠️ Dica de Prova: Não confunda '=' (atribuição de valor a variável) com '==' (comparação lógica de igualdade)! Escrever 'if nivel = 1:' gera erro de sintaxe imediato (SyntaxError).</w:t>
+            </w:r>
+          </w:p>
+        </w:tc>
+      </w:tr>
+    </w:tbl>
+    <w:p>
+      <w:pPr>
+        <w:spacing w:after="40"/>
+      </w:pPr>
+    </w:p>
+    <w:p>
+      <w:pPr>
+        <w:spacing w:after="80" w:line="276" w:lineRule="auto"/>
+      </w:pPr>
+      <w:r>
+        <w:rPr>
+          <w:rFonts w:ascii="Arial" w:hAnsi="Arial"/>
+          <w:color w:val="2D3748"/>
+          <w:sz w:val="19"/>
+        </w:rPr>
+        <w:t>• Aplicação na Atividade Prática: A função de escolha de cores utiliza a estrutura de decisão para identificar qual cor pertence a qual nível.</w:t>
+      </w:r>
+    </w:p>
+    <w:p>
+      <w:pPr>
+        <w:spacing w:before="160" w:after="60"/>
+      </w:pPr>
+      <w:r>
+        <w:rPr>
+          <w:rFonts w:ascii="Arial" w:hAnsi="Arial"/>
+          <w:b/>
+          <w:color w:val="2B6CB0"/>
+          <w:sz w:val="21"/>
+        </w:rPr>
+        <w:t>Agenda 07 — Estruturas de Decisão Encadeadas (elif) e Operadores Lógicos</w:t>
+      </w:r>
+    </w:p>
+    <w:p>
+      <w:pPr>
+        <w:spacing w:after="80" w:line="276" w:lineRule="auto"/>
+      </w:pPr>
+      <w:r>
+        <w:rPr>
+          <w:rFonts w:ascii="Arial" w:hAnsi="Arial"/>
+          <w:color w:val="2D3748"/>
+          <w:sz w:val="19"/>
+        </w:rPr>
+        <w:t>• Fundamentação Teórica: Quando um problema possui três ou mais ramificações possíveis, o uso de 'elif' (abreviação de else if) é a forma mais clara, elegante e eficiente. O Python avalia cada condição de cima para baixo e executa apenas a primeira verdadeira.</w:t>
+        <w:br/>
+        <w:t>Operadores Lógicos:</w:t>
+        <w:br/>
+        <w:t>• and (E): Verdadeiro somente se TODAS as condições forem verdadeiras.</w:t>
+        <w:br/>
+        <w:t>• or (OU): Verdadeiro se PELO MENOS UMA condição for verdadeira.</w:t>
+        <w:br/>
+        <w:t>• not (NÃO): Inverte o valor booleano (True vira False, False vira True).</w:t>
+      </w:r>
+    </w:p>
+    <w:p>
+      <w:pPr>
+        <w:spacing w:after="80" w:line="276" w:lineRule="auto"/>
+      </w:pPr>
+      <w:r>
+        <w:rPr>
+          <w:rFonts w:ascii="Arial" w:hAnsi="Arial"/>
+          <w:color w:val="2D3748"/>
+          <w:sz w:val="19"/>
+        </w:rPr>
+        <w:t>• Exemplo Prático em Python:</w:t>
+      </w:r>
+    </w:p>
+    <w:tbl>
+      <w:tblPr>
+        <w:tblW w:type="auto" w:w="0"/>
+        <w:jc w:val="center"/>
+        <w:tblLayout w:type="fixed"/>
+        <w:tblLook w:firstColumn="1" w:firstRow="1" w:lastColumn="0" w:lastRow="0" w:noHBand="0" w:noVBand="1" w:val="04A0"/>
+      </w:tblPr>
+      <w:tblGrid>
+        <w:gridCol w:w="10368"/>
+      </w:tblGrid>
+      <w:tr>
+        <w:tc>
+          <w:tcPr>
+            <w:tcW w:type="dxa" w:w="10368"/>
+            <w:shd w:val="clear" w:color="auto" w:fill="F1F5F9"/>
+          </w:tcPr>
+          <w:p>
+            <w:pPr>
+              <w:spacing w:before="80" w:after="80" w:line="252" w:lineRule="auto"/>
+            </w:pPr>
+            <w:r>
+              <w:rPr>
+                <w:rFonts w:ascii="Courier New" w:hAnsi="Courier New"/>
+                <w:color w:val="0F172A"/>
+                <w:sz w:val="17"/>
+              </w:rPr>
+              <w:t>nivel = 3</w:t>
+              <w:br/>
+              <w:t>if nivel == 1:</w:t>
+              <w:br/>
+              <w:t xml:space="preserve">    cor = 'Vermelho'</w:t>
+              <w:br/>
+              <w:t>elif nivel == 2:</w:t>
+              <w:br/>
+              <w:t xml:space="preserve">    cor = 'Amarelo'</w:t>
+              <w:br/>
+              <w:t>elif nivel == 3:</w:t>
+              <w:br/>
+              <w:t xml:space="preserve">    cor = 'Verde'</w:t>
+              <w:br/>
+              <w:t>elif nivel == 4:</w:t>
+              <w:br/>
+              <w:t xml:space="preserve">    cor = 'Ciano'</w:t>
+              <w:br/>
+              <w:t>elif nivel == 5:</w:t>
+              <w:br/>
+              <w:t xml:space="preserve">    cor = 'Azul'</w:t>
+              <w:br/>
+              <w:t>else:</w:t>
+              <w:br/>
+              <w:t xml:space="preserve">    cor = 'Branco'</w:t>
+            </w:r>
+          </w:p>
+        </w:tc>
+      </w:tr>
+    </w:tbl>
+    <w:p>
+      <w:pPr>
+        <w:spacing w:after="40"/>
+      </w:pPr>
+    </w:p>
+    <w:tbl>
+      <w:tblPr>
+        <w:tblW w:type="auto" w:w="0"/>
+        <w:jc w:val="center"/>
+        <w:tblLayout w:type="fixed"/>
+        <w:tblLook w:firstColumn="1" w:firstRow="1" w:lastColumn="0" w:lastRow="0" w:noHBand="0" w:noVBand="1" w:val="04A0"/>
+      </w:tblPr>
+      <w:tblGrid>
+        <w:gridCol w:w="10368"/>
+      </w:tblGrid>
+      <w:tr>
+        <w:tc>
+          <w:tcPr>
+            <w:tcW w:type="dxa" w:w="10368"/>
+            <w:shd w:val="clear" w:color="auto" w:fill="FEF3C7"/>
+          </w:tcPr>
+          <w:p>
+            <w:pPr>
+              <w:spacing w:before="80" w:after="80" w:line="252" w:lineRule="auto"/>
+            </w:pPr>
+            <w:r>
+              <w:rPr>
+                <w:rFonts w:ascii="Arial" w:hAnsi="Arial"/>
+                <w:b/>
+                <w:color w:val="92400E"/>
+                <w:sz w:val="18"/>
+              </w:rPr>
+              <w:t>⚠️ Dica de Prova: Usar vários 'if' independentes seguidos faz o Python testar todos eles, mesmo que o primeiro já tenha sido verdadeiro. Usar 'elif' faz o Python parar a checagem assim que encontra o primeiro verdadeiro, economizando processamento!</w:t>
+            </w:r>
+          </w:p>
+        </w:tc>
+      </w:tr>
+    </w:tbl>
+    <w:p>
+      <w:pPr>
+        <w:spacing w:after="40"/>
+      </w:pPr>
+    </w:p>
+    <w:p>
+      <w:pPr>
+        <w:spacing w:after="80" w:line="276" w:lineRule="auto"/>
+      </w:pPr>
+      <w:r>
+        <w:rPr>
+          <w:rFonts w:ascii="Arial" w:hAnsi="Arial"/>
+          <w:color w:val="2D3748"/>
+          <w:sz w:val="19"/>
+        </w:rPr>
+        <w:t>• Aplicação na Atividade Prática: É exatamente essa estrutura if/elif/else que constrói a função oficial 'definir_cor_mensagem(nivel)'.</w:t>
+      </w:r>
+    </w:p>
+    <w:p>
+      <w:pPr>
+        <w:spacing w:before="160" w:after="60"/>
+      </w:pPr>
+      <w:r>
+        <w:rPr>
+          <w:rFonts w:ascii="Arial" w:hAnsi="Arial"/>
+          <w:b/>
+          <w:color w:val="2B6CB0"/>
+          <w:sz w:val="21"/>
+        </w:rPr>
+        <w:t>Agenda 08 — Estruturas de Repetição: Laço for e Laço while</w:t>
+      </w:r>
+    </w:p>
+    <w:p>
+      <w:pPr>
+        <w:spacing w:after="80" w:line="276" w:lineRule="auto"/>
+      </w:pPr>
+      <w:r>
+        <w:rPr>
+          <w:rFonts w:ascii="Arial" w:hAnsi="Arial"/>
+          <w:color w:val="2D3748"/>
+          <w:sz w:val="19"/>
+        </w:rPr>
+        <w:t>• Fundamentação Teórica: Estruturas de repetição (loops) automatizam tarefas recorrentes sem necessidade de duplicar linhas de código.</w:t>
+        <w:br/>
+        <w:t>• for: Indicado quando conhecemos previamente o número de repetições ou quando percorremos coleções (listas, sequências).</w:t>
+        <w:br/>
+        <w:t>• while: Indicado quando a repetição depende de uma condição lógica cujo número de voltas não é fixo a priori.</w:t>
+        <w:br/>
+        <w:t>• range(inicio, fim, passo): Gera uma sequência numérica. Importante: o valor 'fim' nunca é incluído (ex: range(1, 6) gera 1, 2, 3, 4, 5).</w:t>
+      </w:r>
+    </w:p>
+    <w:p>
+      <w:pPr>
+        <w:spacing w:after="80" w:line="276" w:lineRule="auto"/>
+      </w:pPr>
+      <w:r>
+        <w:rPr>
+          <w:rFonts w:ascii="Arial" w:hAnsi="Arial"/>
+          <w:color w:val="2D3748"/>
+          <w:sz w:val="19"/>
+        </w:rPr>
+        <w:t>• Exemplo Prático em Python:</w:t>
+      </w:r>
+    </w:p>
+    <w:tbl>
+      <w:tblPr>
+        <w:tblW w:type="auto" w:w="0"/>
+        <w:jc w:val="center"/>
+        <w:tblLayout w:type="fixed"/>
+        <w:tblLook w:firstColumn="1" w:firstRow="1" w:lastColumn="0" w:lastRow="0" w:noHBand="0" w:noVBand="1" w:val="04A0"/>
+      </w:tblPr>
+      <w:tblGrid>
+        <w:gridCol w:w="10368"/>
+      </w:tblGrid>
+      <w:tr>
+        <w:tc>
+          <w:tcPr>
+            <w:tcW w:type="dxa" w:w="10368"/>
+            <w:shd w:val="clear" w:color="auto" w:fill="F1F5F9"/>
+          </w:tcPr>
+          <w:p>
+            <w:pPr>
+              <w:spacing w:before="80" w:after="80" w:line="252" w:lineRule="auto"/>
+            </w:pPr>
+            <w:r>
+              <w:rPr>
+                <w:rFonts w:ascii="Courier New" w:hAnsi="Courier New"/>
+                <w:color w:val="0F172A"/>
+                <w:sz w:val="17"/>
+              </w:rPr>
+              <w:t>print('Contagem dos 5 níveis do reservatório:')</w:t>
+              <w:br/>
+              <w:t>for n in range(1, 6):</w:t>
+              <w:br/>
+              <w:t xml:space="preserve">    print(f'Testando sensor do nível {n}...')</w:t>
+              <w:br/>
+              <w:t>print('Sensores operacionais!')</w:t>
+            </w:r>
+          </w:p>
+        </w:tc>
+      </w:tr>
+    </w:tbl>
+    <w:p>
+      <w:pPr>
+        <w:spacing w:after="40"/>
+      </w:pPr>
+    </w:p>
+    <w:tbl>
+      <w:tblPr>
+        <w:tblW w:type="auto" w:w="0"/>
+        <w:jc w:val="center"/>
+        <w:tblLayout w:type="fixed"/>
+        <w:tblLook w:firstColumn="1" w:firstRow="1" w:lastColumn="0" w:lastRow="0" w:noHBand="0" w:noVBand="1" w:val="04A0"/>
+      </w:tblPr>
+      <w:tblGrid>
+        <w:gridCol w:w="10368"/>
+      </w:tblGrid>
+      <w:tr>
+        <w:tc>
+          <w:tcPr>
+            <w:tcW w:type="dxa" w:w="10368"/>
+            <w:shd w:val="clear" w:color="auto" w:fill="FEF3C7"/>
+          </w:tcPr>
+          <w:p>
+            <w:pPr>
+              <w:spacing w:before="80" w:after="80" w:line="252" w:lineRule="auto"/>
+            </w:pPr>
+            <w:r>
+              <w:rPr>
+                <w:rFonts w:ascii="Arial" w:hAnsi="Arial"/>
+                <w:b/>
+                <w:color w:val="92400E"/>
+                <w:sz w:val="18"/>
+              </w:rPr>
+              <w:t>⚠️ Dica de Prova: No while, se você esquecer de atualizar a variável de controle dentro do laço (ex: contador += 1), o programa entrará em 'Loop Infinito' e travará o computador.</w:t>
+            </w:r>
+          </w:p>
+        </w:tc>
+      </w:tr>
+    </w:tbl>
+    <w:p>
+      <w:pPr>
+        <w:spacing w:after="40"/>
+      </w:pPr>
+    </w:p>
+    <w:p>
+      <w:pPr>
+        <w:spacing w:after="80" w:line="276" w:lineRule="auto"/>
+      </w:pPr>
+      <w:r>
+        <w:rPr>
+          <w:rFonts w:ascii="Arial" w:hAnsi="Arial"/>
+          <w:color w:val="2D3748"/>
+          <w:sz w:val="19"/>
+        </w:rPr>
+        <w:t>• Aplicação na Atividade Prática: O procedimento 'simular_monitoramento' utiliza o laço for para iterar pelos 5 níveis do reservatório.</w:t>
+      </w:r>
+    </w:p>
+    <w:p>
+      <w:pPr>
+        <w:spacing w:before="160" w:after="60"/>
+      </w:pPr>
+      <w:r>
+        <w:rPr>
+          <w:rFonts w:ascii="Arial" w:hAnsi="Arial"/>
+          <w:b/>
+          <w:color w:val="2B6CB0"/>
+          <w:sz w:val="21"/>
+        </w:rPr>
+        <w:t>Agenda 09 — Estruturas de Dados: Listas em Python (Coleções e Índices)</w:t>
+      </w:r>
+    </w:p>
+    <w:p>
+      <w:pPr>
+        <w:spacing w:after="80" w:line="276" w:lineRule="auto"/>
+      </w:pPr>
+      <w:r>
+        <w:rPr>
+          <w:rFonts w:ascii="Arial" w:hAnsi="Arial"/>
+          <w:color w:val="2D3748"/>
+          <w:sz w:val="19"/>
+        </w:rPr>
+        <w:t>• Fundamentação Teórica: Uma lista é uma estrutura de dados que armazena múltiplos valores organizados em sequência sob um único nome de variável.</w:t>
+        <w:br/>
+        <w:t>Características fundamentais ensinadas na Agenda 09:</w:t>
+        <w:br/>
+        <w:t>1. Declarada com colchetes: lista = [item1, item2, item3].</w:t>
+        <w:br/>
+        <w:t>2. Indexação base zero: O primeiro elemento SEMPRE está na posição [0], o segundo na [1], etc.</w:t>
+        <w:br/>
+        <w:t>3. Nomes no plural: Boas práticas da ETEC exigem nomes expressivos no plural (ex: 'niveis', 'mensagens', 'alunos').</w:t>
+        <w:br/>
+        <w:t>4. A função len(): Retorna a quantidade total de elementos na lista (ex: len(niveis) é 5).</w:t>
+        <w:br/>
+        <w:t>5. Percurso com for: Pode ser feito diretamente ('for item in lista:') ou por índice ('for i in range(len(lista)):').</w:t>
+      </w:r>
+    </w:p>
+    <w:p>
+      <w:pPr>
+        <w:spacing w:after="80" w:line="276" w:lineRule="auto"/>
+      </w:pPr>
+      <w:r>
+        <w:rPr>
+          <w:rFonts w:ascii="Arial" w:hAnsi="Arial"/>
+          <w:color w:val="2D3748"/>
+          <w:sz w:val="19"/>
+        </w:rPr>
+        <w:t>• Exemplo Prático em Python:</w:t>
+      </w:r>
+    </w:p>
+    <w:tbl>
+      <w:tblPr>
+        <w:tblW w:type="auto" w:w="0"/>
+        <w:jc w:val="center"/>
+        <w:tblLayout w:type="fixed"/>
+        <w:tblLook w:firstColumn="1" w:firstRow="1" w:lastColumn="0" w:lastRow="0" w:noHBand="0" w:noVBand="1" w:val="04A0"/>
+      </w:tblPr>
+      <w:tblGrid>
+        <w:gridCol w:w="10368"/>
+      </w:tblGrid>
+      <w:tr>
+        <w:tc>
+          <w:tcPr>
+            <w:tcW w:type="dxa" w:w="10368"/>
+            <w:shd w:val="clear" w:color="auto" w:fill="F1F5F9"/>
+          </w:tcPr>
+          <w:p>
+            <w:pPr>
+              <w:spacing w:before="80" w:after="80" w:line="252" w:lineRule="auto"/>
+            </w:pPr>
+            <w:r>
+              <w:rPr>
+                <w:rFonts w:ascii="Courier New" w:hAnsi="Courier New"/>
+                <w:color w:val="0F172A"/>
+                <w:sz w:val="17"/>
+              </w:rPr>
+              <w:t>niveis = [1, 2, 3, 4, 5]</w:t>
+              <w:br/>
+              <w:t>mensagens = ['Crítico', 'Baixo', 'Médio', 'Alto', 'Alerta Máximo']</w:t>
+              <w:br/>
+              <w:t>for i in range(len(niveis)):</w:t>
+              <w:br/>
+              <w:t xml:space="preserve">    print(f'Posição {i} -&gt; Nível {niveis[i]}: {mensagens[i]}')</w:t>
+            </w:r>
+          </w:p>
+        </w:tc>
+      </w:tr>
+    </w:tbl>
+    <w:p>
+      <w:pPr>
+        <w:spacing w:after="40"/>
+      </w:pPr>
+    </w:p>
+    <w:tbl>
+      <w:tblPr>
+        <w:tblW w:type="auto" w:w="0"/>
+        <w:jc w:val="center"/>
+        <w:tblLayout w:type="fixed"/>
+        <w:tblLook w:firstColumn="1" w:firstRow="1" w:lastColumn="0" w:lastRow="0" w:noHBand="0" w:noVBand="1" w:val="04A0"/>
+      </w:tblPr>
+      <w:tblGrid>
+        <w:gridCol w:w="10368"/>
+      </w:tblGrid>
+      <w:tr>
+        <w:tc>
+          <w:tcPr>
+            <w:tcW w:type="dxa" w:w="10368"/>
+            <w:shd w:val="clear" w:color="auto" w:fill="FEF3C7"/>
+          </w:tcPr>
+          <w:p>
+            <w:pPr>
+              <w:spacing w:before="80" w:after="80" w:line="252" w:lineRule="auto"/>
+            </w:pPr>
+            <w:r>
+              <w:rPr>
+                <w:rFonts w:ascii="Arial" w:hAnsi="Arial"/>
+                <w:b/>
+                <w:color w:val="92400E"/>
+                <w:sz w:val="18"/>
+              </w:rPr>
+              <w:t>⚠️ Dica de Prova: Se uma lista tem 5 elementos, os índices vão de 0 a 4! Tentar acessar 'niveis[5]' gera o clássico erro 'IndexError: list index out of range'.</w:t>
+            </w:r>
+          </w:p>
+        </w:tc>
+      </w:tr>
+    </w:tbl>
+    <w:p>
+      <w:pPr>
+        <w:spacing w:after="40"/>
+      </w:pPr>
+    </w:p>
+    <w:p>
+      <w:pPr>
+        <w:spacing w:after="80" w:line="276" w:lineRule="auto"/>
+      </w:pPr>
+      <w:r>
+        <w:rPr>
+          <w:rFonts w:ascii="Arial" w:hAnsi="Arial"/>
+          <w:color w:val="2D3748"/>
+          <w:sz w:val="19"/>
+        </w:rPr>
+        <w:t>• Aplicação na Atividade Prática: O enunciado exige explicitamente representar os níveis ou mensagens em uma lista. Utilizamos duas listas paralelas: niveis e mensagens.</w:t>
+      </w:r>
+    </w:p>
+    <w:p>
+      <w:pPr>
+        <w:spacing w:before="160" w:after="60"/>
+      </w:pPr>
+      <w:r>
+        <w:rPr>
+          <w:rFonts w:ascii="Arial" w:hAnsi="Arial"/>
+          <w:b/>
+          <w:color w:val="2B6CB0"/>
+          <w:sz w:val="21"/>
+        </w:rPr>
+        <w:t>Agenda 10 — Modularização: Funções com Retorno e Procedimentos (SRP)</w:t>
+      </w:r>
+    </w:p>
+    <w:p>
+      <w:pPr>
+        <w:spacing w:after="80" w:line="276" w:lineRule="auto"/>
+      </w:pPr>
+      <w:r>
+        <w:rPr>
+          <w:rFonts w:ascii="Arial" w:hAnsi="Arial"/>
+          <w:color w:val="2D3748"/>
+          <w:sz w:val="19"/>
+        </w:rPr>
+        <w:t>• Fundamentação Teórica: Funções dividem problemas complexos em pequenos blocos reutilizáveis com a palavra-chave 'def'.</w:t>
+        <w:br/>
+        <w:t>A grande lição da Agenda 10 é a distinção entre Procedimentos e Funções:</w:t>
+        <w:br/>
+        <w:t>• Procedimento: Executa uma ação visual (print, formatação) e NÃO possui retorno (devolve None).</w:t>
+        <w:br/>
+        <w:t>• Função com Retorno (return): Executa cálculos, regras de negócio ou mapeamentos e DEVOLVE o resultado para o programa com 'return'.</w:t>
+        <w:br/>
+        <w:t>• Regra de Ouro: 'Exibir serve para informar; Retornar serve para reutilizar'.</w:t>
+        <w:br/>
+        <w:t>• Princípio da Responsabilidade Única (SRP): Cada função deve fazer apenas UMA coisa bem feita.</w:t>
+      </w:r>
+    </w:p>
+    <w:p>
+      <w:pPr>
+        <w:spacing w:after="80" w:line="276" w:lineRule="auto"/>
+      </w:pPr>
+      <w:r>
+        <w:rPr>
+          <w:rFonts w:ascii="Arial" w:hAnsi="Arial"/>
+          <w:color w:val="2D3748"/>
+          <w:sz w:val="19"/>
+        </w:rPr>
+        <w:t>• Exemplo Prático em Python:</w:t>
+      </w:r>
+    </w:p>
+    <w:tbl>
+      <w:tblPr>
+        <w:tblW w:type="auto" w:w="0"/>
+        <w:jc w:val="center"/>
+        <w:tblLayout w:type="fixed"/>
+        <w:tblLook w:firstColumn="1" w:firstRow="1" w:lastColumn="0" w:lastRow="0" w:noHBand="0" w:noVBand="1" w:val="04A0"/>
+      </w:tblPr>
+      <w:tblGrid>
+        <w:gridCol w:w="10368"/>
+      </w:tblGrid>
+      <w:tr>
+        <w:tc>
+          <w:tcPr>
+            <w:tcW w:type="dxa" w:w="10368"/>
+            <w:shd w:val="clear" w:color="auto" w:fill="F1F5F9"/>
+          </w:tcPr>
+          <w:p>
+            <w:pPr>
+              <w:spacing w:before="80" w:after="80" w:line="252" w:lineRule="auto"/>
+            </w:pPr>
+            <w:r>
+              <w:rPr>
+                <w:rFonts w:ascii="Courier New" w:hAnsi="Courier New"/>
+                <w:color w:val="0F172A"/>
+                <w:sz w:val="17"/>
+              </w:rPr>
+              <w:t>def definir_cor(nivel):</w:t>
+              <w:br/>
+              <w:t xml:space="preserve">    if nivel == 1: return 'Vermelho'</w:t>
+              <w:br/>
+              <w:t xml:space="preserve">    elif nivel == 2: return 'Amarelo'</w:t>
+              <w:br/>
+              <w:t xml:space="preserve">    elif nivel == 3: return 'Verde'</w:t>
+              <w:br/>
+              <w:t xml:space="preserve">    elif nivel == 4: return 'Ciano'</w:t>
+              <w:br/>
+              <w:t xml:space="preserve">    elif nivel == 5: return 'Azul'</w:t>
+              <w:br/>
+              <w:t xml:space="preserve">    else: return 'Branco'</w:t>
+              <w:br/>
+              <w:br/>
+              <w:t>cor_obtida = definir_cor(1)  # O valor retornado é guardado na variável</w:t>
+              <w:br/>
+              <w:t>print('Cor calculada pela função:', cor_obtida)</w:t>
+            </w:r>
+          </w:p>
+        </w:tc>
+      </w:tr>
+    </w:tbl>
+    <w:p>
+      <w:pPr>
+        <w:spacing w:after="40"/>
+      </w:pPr>
+    </w:p>
+    <w:tbl>
+      <w:tblPr>
+        <w:tblW w:type="auto" w:w="0"/>
+        <w:jc w:val="center"/>
+        <w:tblLayout w:type="fixed"/>
+        <w:tblLook w:firstColumn="1" w:firstRow="1" w:lastColumn="0" w:lastRow="0" w:noHBand="0" w:noVBand="1" w:val="04A0"/>
+      </w:tblPr>
+      <w:tblGrid>
+        <w:gridCol w:w="10368"/>
+      </w:tblGrid>
+      <w:tr>
+        <w:tc>
+          <w:tcPr>
+            <w:tcW w:type="dxa" w:w="10368"/>
+            <w:shd w:val="clear" w:color="auto" w:fill="FEF3C7"/>
+          </w:tcPr>
+          <w:p>
+            <w:pPr>
+              <w:spacing w:before="80" w:after="80" w:line="252" w:lineRule="auto"/>
+            </w:pPr>
+            <w:r>
+              <w:rPr>
+                <w:rFonts w:ascii="Arial" w:hAnsi="Arial"/>
+                <w:b/>
+                <w:color w:val="92400E"/>
+                <w:sz w:val="18"/>
+              </w:rPr>
+              <w:t>⚠️ Dica de Prova: O comando 'return' ENCERRA a execução da função imediatamente! Qualquer código escrito após o 'return' dentro do mesmo bloco é inalcançável (dead code).</w:t>
+            </w:r>
+          </w:p>
+        </w:tc>
+      </w:tr>
+    </w:tbl>
+    <w:p>
+      <w:pPr>
+        <w:spacing w:after="40"/>
+      </w:pPr>
+    </w:p>
+    <w:p>
+      <w:pPr>
+        <w:spacing w:after="80" w:line="276" w:lineRule="auto"/>
+      </w:pPr>
+      <w:r>
+        <w:rPr>
+          <w:rFonts w:ascii="Arial" w:hAnsi="Arial"/>
+          <w:color w:val="2D3748"/>
+          <w:sz w:val="19"/>
+        </w:rPr>
+        <w:t>• Aplicação na Atividade Prática: A exigência do enunciado 'Criar uma função responsável por definir a cor da mensagem conforme o nível informado' foi atendida com return!</w:t>
+      </w:r>
+    </w:p>
+    <w:p>
+      <w:pPr>
+        <w:spacing w:before="160" w:after="60"/>
+      </w:pPr>
+      <w:r>
+        <w:rPr>
+          <w:rFonts w:ascii="Arial" w:hAnsi="Arial"/>
+          <w:b/>
+          <w:color w:val="2B6CB0"/>
+          <w:sz w:val="21"/>
+        </w:rPr>
+        <w:t>Agenda 11 — Bibliotecas Padrão e Externas: PIP e Colorama no Terminal</w:t>
+      </w:r>
+    </w:p>
+    <w:p>
+      <w:pPr>
+        <w:spacing w:after="80" w:line="276" w:lineRule="auto"/>
+      </w:pPr>
+      <w:r>
+        <w:rPr>
+          <w:rFonts w:ascii="Arial" w:hAnsi="Arial"/>
+          <w:color w:val="2D3748"/>
+          <w:sz w:val="19"/>
+        </w:rPr>
+        <w:t>• Fundamentação Teórica: Bibliotecas são conjuntos de funções e recursos prontos que evitam 'reinventar a roda'.</w:t>
+        <w:br/>
+        <w:t>1. Bibliotecas Padrão (nativas do Python):</w:t>
+        <w:br/>
+        <w:t xml:space="preserve">   • os: Interação com o sistema operacional (ex: os.system('cls')).</w:t>
+        <w:br/>
+        <w:t xml:space="preserve">   • sys: Acesso a variáveis do ambiente Python e configuração de UTF-8.</w:t>
+        <w:br/>
+        <w:t xml:space="preserve">   • time: Controle de tempo e pausas realistas (time.sleep(segundos)).</w:t>
+        <w:br/>
+        <w:t xml:space="preserve">   • math / random: Funções matemáticas e sorteios aleatórios.</w:t>
+        <w:br/>
+        <w:t>2. O Gerenciador PIP: Ferramenta de linha de comando para instalar bibliotecas externas: 'pip install colorama'.</w:t>
+        <w:br/>
+        <w:t>3. Biblioteca Colorama: Permite colorir terminais de forma multiplataforma:</w:t>
+        <w:br/>
+        <w:t xml:space="preserve">   • Fore: Cor do texto (Fore.RED, Fore.YELLOW, Fore.GREEN, Fore.CYAN, Fore.BLUE).</w:t>
+        <w:br/>
+        <w:t xml:space="preserve">   • Style.RESET_ALL: Restaura o estilo padrão do terminal após a exibição das mensagens.</w:t>
+      </w:r>
+    </w:p>
+    <w:p>
+      <w:pPr>
+        <w:spacing w:after="80" w:line="276" w:lineRule="auto"/>
+      </w:pPr>
+      <w:r>
+        <w:rPr>
+          <w:rFonts w:ascii="Arial" w:hAnsi="Arial"/>
+          <w:color w:val="2D3748"/>
+          <w:sz w:val="19"/>
+        </w:rPr>
+        <w:t>• Exemplo Prático em Python:</w:t>
+      </w:r>
+    </w:p>
+    <w:tbl>
+      <w:tblPr>
+        <w:tblW w:type="auto" w:w="0"/>
+        <w:jc w:val="center"/>
+        <w:tblLayout w:type="fixed"/>
+        <w:tblLook w:firstColumn="1" w:firstRow="1" w:lastColumn="0" w:lastRow="0" w:noHBand="0" w:noVBand="1" w:val="04A0"/>
+      </w:tblPr>
+      <w:tblGrid>
+        <w:gridCol w:w="10368"/>
+      </w:tblGrid>
+      <w:tr>
+        <w:tc>
+          <w:tcPr>
+            <w:tcW w:type="dxa" w:w="10368"/>
+            <w:shd w:val="clear" w:color="auto" w:fill="F1F5F9"/>
+          </w:tcPr>
+          <w:p>
+            <w:pPr>
+              <w:spacing w:before="80" w:after="80" w:line="252" w:lineRule="auto"/>
+            </w:pPr>
+            <w:r>
+              <w:rPr>
+                <w:rFonts w:ascii="Courier New" w:hAnsi="Courier New"/>
+                <w:color w:val="0F172A"/>
+                <w:sz w:val="17"/>
+              </w:rPr>
+              <w:t>from colorama import Fore, Style</w:t>
+              <w:br/>
+              <w:t>import time</w:t>
+              <w:br/>
+              <w:br/>
+              <w:t>print(Fore.YELLOW + 'Aguardando sensor...' + Style.RESET_ALL)</w:t>
+              <w:br/>
+              <w:t>time.sleep(1)  # Pausa de 1 segundo</w:t>
+              <w:br/>
+              <w:t>print(Fore.GREEN + 'Sensor calibrado com sucesso!' + Style.RESET_ALL)</w:t>
+            </w:r>
+          </w:p>
+        </w:tc>
+      </w:tr>
+    </w:tbl>
+    <w:p>
+      <w:pPr>
+        <w:spacing w:after="40"/>
+      </w:pPr>
+    </w:p>
+    <w:tbl>
+      <w:tblPr>
+        <w:tblW w:type="auto" w:w="0"/>
+        <w:jc w:val="center"/>
+        <w:tblLayout w:type="fixed"/>
+        <w:tblLook w:firstColumn="1" w:firstRow="1" w:lastColumn="0" w:lastRow="0" w:noHBand="0" w:noVBand="1" w:val="04A0"/>
+      </w:tblPr>
+      <w:tblGrid>
+        <w:gridCol w:w="10368"/>
+      </w:tblGrid>
+      <w:tr>
+        <w:tc>
+          <w:tcPr>
+            <w:tcW w:type="dxa" w:w="10368"/>
+            <w:shd w:val="clear" w:color="auto" w:fill="FEF3C7"/>
+          </w:tcPr>
+          <w:p>
+            <w:pPr>
+              <w:spacing w:before="80" w:after="80" w:line="252" w:lineRule="auto"/>
+            </w:pPr>
+            <w:r>
+              <w:rPr>
+                <w:rFonts w:ascii="Arial" w:hAnsi="Arial"/>
+                <w:b/>
+                <w:color w:val="92400E"/>
+                <w:sz w:val="18"/>
+              </w:rPr>
+              <w:t>⚠️ Dica de Prova: Por que 'Style.RESET_ALL' é obrigatório? Porque os códigos ANSI são persistentes! Se você não resetar, todos os prints subsequentes e o próprio terminal continuarão na última cor usada.</w:t>
+            </w:r>
+          </w:p>
+        </w:tc>
+      </w:tr>
+    </w:tbl>
+    <w:p>
+      <w:pPr>
+        <w:spacing w:after="40"/>
+      </w:pPr>
+    </w:p>
+    <w:p>
+      <w:pPr>
+        <w:spacing w:after="80" w:line="276" w:lineRule="auto"/>
+      </w:pPr>
+      <w:r>
+        <w:rPr>
+          <w:rFonts w:ascii="Arial" w:hAnsi="Arial"/>
+          <w:color w:val="2D3748"/>
+          <w:sz w:val="19"/>
+        </w:rPr>
+        <w:t>• Aplicação na Atividade Prática: O núcleo visual da atividade foi estruturado com colorama e pausas com time.sleep() para simular telemetria em tempo real.</w:t>
+      </w:r>
+    </w:p>
+    <w:p>
+      <w:pPr>
+        <w:spacing w:before="280" w:after="80"/>
+      </w:pPr>
+      <w:r>
+        <w:rPr>
+          <w:rFonts w:ascii="Arial" w:hAnsi="Arial"/>
+          <w:b/>
+          <w:color w:val="1A365D"/>
+          <w:sz w:val="26"/>
+        </w:rPr>
+        <w:t>3. O Projeto Integrador da Agenda 11: Controle de Níveis de Água</w:t>
+      </w:r>
+    </w:p>
+    <w:p>
+      <w:pPr>
+        <w:spacing w:after="80" w:line="276" w:lineRule="auto"/>
+      </w:pPr>
+      <w:r>
+        <w:rPr>
+          <w:rFonts w:ascii="Arial" w:hAnsi="Arial"/>
+          <w:color w:val="2D3748"/>
+          <w:sz w:val="19"/>
+        </w:rPr>
+        <w:t>A atividade prática da Agenda 11 não é um exercício isolado: ela é a síntese que une todas as matérias estudadas ao longo do semestre em uma simulação de engenharia hidráulica com telemetria no terminal.</w:t>
+      </w:r>
+    </w:p>
+    <w:p>
+      <w:pPr>
+        <w:spacing w:before="160" w:after="60"/>
+      </w:pPr>
+      <w:r>
+        <w:rPr>
+          <w:rFonts w:ascii="Arial" w:hAnsi="Arial"/>
+          <w:b/>
+          <w:color w:val="2B6CB0"/>
+          <w:sz w:val="21"/>
+        </w:rPr>
+        <w:t>Tabela Oficial de Escala de Risco e Cores da Atividade</w:t>
+      </w:r>
+    </w:p>
+    <w:tbl>
+      <w:tblPr>
+        <w:tblW w:type="auto" w:w="0"/>
+        <w:jc w:val="center"/>
+        <w:tblLayout w:type="fixed"/>
+        <w:tblLook w:firstColumn="1" w:firstRow="1" w:lastColumn="0" w:lastRow="0" w:noHBand="0" w:noVBand="1" w:val="04A0"/>
+      </w:tblPr>
+      <w:tblGrid>
+        <w:gridCol w:w="2074"/>
+        <w:gridCol w:w="2074"/>
+        <w:gridCol w:w="2074"/>
+        <w:gridCol w:w="2074"/>
+        <w:gridCol w:w="2074"/>
+      </w:tblGrid>
+      <w:tr>
+        <w:tc>
+          <w:tcPr>
+            <w:tcW w:type="dxa" w:w="1296"/>
             <w:shd w:val="clear" w:color="auto" w:fill="1A365D"/>
           </w:tcPr>
           <w:p>
@@ -148,7 +1766,7 @@
         </w:tc>
         <w:tc>
           <w:tcPr>
-            <w:tcW w:type="dxa" w:w="1440"/>
+            <w:tcW w:type="dxa" w:w="1584"/>
             <w:shd w:val="clear" w:color="auto" w:fill="1A365D"/>
           </w:tcPr>
           <w:p>
@@ -188,7 +1806,7 @@
         </w:tc>
         <w:tc>
           <w:tcPr>
-            <w:tcW w:type="dxa" w:w="3168"/>
+            <w:tcW w:type="dxa" w:w="3600"/>
             <w:shd w:val="clear" w:color="auto" w:fill="1A365D"/>
           </w:tcPr>
           <w:p>
@@ -210,7 +1828,7 @@
       <w:tr>
         <w:tc>
           <w:tcPr>
-            <w:tcW w:type="dxa" w:w="1440"/>
+            <w:tcW w:type="dxa" w:w="1296"/>
             <w:shd w:val="clear" w:color="auto" w:fill="F8FAFC"/>
           </w:tcPr>
           <w:p>
@@ -249,7 +1867,7 @@
         </w:tc>
         <w:tc>
           <w:tcPr>
-            <w:tcW w:type="dxa" w:w="1440"/>
+            <w:tcW w:type="dxa" w:w="1584"/>
             <w:shd w:val="clear" w:color="auto" w:fill="F8FAFC"/>
           </w:tcPr>
           <w:p>
@@ -287,7 +1905,7 @@
         </w:tc>
         <w:tc>
           <w:tcPr>
-            <w:tcW w:type="dxa" w:w="3168"/>
+            <w:tcW w:type="dxa" w:w="3600"/>
             <w:shd w:val="clear" w:color="auto" w:fill="F8FAFC"/>
           </w:tcPr>
           <w:p>
@@ -300,7 +1918,7 @@
                 <w:color w:val="2D3748"/>
                 <w:sz w:val="16"/>
               </w:rPr>
-              <w:t>Válvulas abertas. Risco iminente de desabastecimento.</w:t>
+              <w:t>Risco iminente de desabastecimento.</w:t>
             </w:r>
           </w:p>
         </w:tc>
@@ -308,7 +1926,7 @@
       <w:tr>
         <w:tc>
           <w:tcPr>
-            <w:tcW w:type="dxa" w:w="1440"/>
+            <w:tcW w:type="dxa" w:w="1296"/>
             <w:shd w:val="clear" w:color="auto" w:fill="FFFFFF"/>
           </w:tcPr>
           <w:p>
@@ -347,7 +1965,7 @@
         </w:tc>
         <w:tc>
           <w:tcPr>
-            <w:tcW w:type="dxa" w:w="1440"/>
+            <w:tcW w:type="dxa" w:w="1584"/>
             <w:shd w:val="clear" w:color="auto" w:fill="FFFFFF"/>
           </w:tcPr>
           <w:p>
@@ -385,7 +2003,7 @@
         </w:tc>
         <w:tc>
           <w:tcPr>
-            <w:tcW w:type="dxa" w:w="3168"/>
+            <w:tcW w:type="dxa" w:w="3600"/>
             <w:shd w:val="clear" w:color="auto" w:fill="FFFFFF"/>
           </w:tcPr>
           <w:p>
@@ -398,7 +2016,7 @@
                 <w:color w:val="2D3748"/>
                 <w:sz w:val="16"/>
               </w:rPr>
-              <w:t>Bomba secundária acionada. Atenção para reposição.</w:t>
+              <w:t>Atenção para acionamento de reposição.</w:t>
             </w:r>
           </w:p>
         </w:tc>
@@ -406,7 +2024,7 @@
       <w:tr>
         <w:tc>
           <w:tcPr>
-            <w:tcW w:type="dxa" w:w="1440"/>
+            <w:tcW w:type="dxa" w:w="1296"/>
             <w:shd w:val="clear" w:color="auto" w:fill="F8FAFC"/>
           </w:tcPr>
           <w:p>
@@ -445,7 +2063,7 @@
         </w:tc>
         <w:tc>
           <w:tcPr>
-            <w:tcW w:type="dxa" w:w="1440"/>
+            <w:tcW w:type="dxa" w:w="1584"/>
             <w:shd w:val="clear" w:color="auto" w:fill="F8FAFC"/>
           </w:tcPr>
           <w:p>
@@ -483,7 +2101,7 @@
         </w:tc>
         <w:tc>
           <w:tcPr>
-            <w:tcW w:type="dxa" w:w="3168"/>
+            <w:tcW w:type="dxa" w:w="3600"/>
             <w:shd w:val="clear" w:color="auto" w:fill="F8FAFC"/>
           </w:tcPr>
           <w:p>
@@ -496,7 +2114,7 @@
                 <w:color w:val="2D3748"/>
                 <w:sz w:val="16"/>
               </w:rPr>
-              <w:t>Capacidade estável. Volume ideal de operação.</w:t>
+              <w:t>Volume ideal para operação regular.</w:t>
             </w:r>
           </w:p>
         </w:tc>
@@ -504,7 +2122,7 @@
       <w:tr>
         <w:tc>
           <w:tcPr>
-            <w:tcW w:type="dxa" w:w="1440"/>
+            <w:tcW w:type="dxa" w:w="1296"/>
             <w:shd w:val="clear" w:color="auto" w:fill="FFFFFF"/>
           </w:tcPr>
           <w:p>
@@ -543,7 +2161,7 @@
         </w:tc>
         <w:tc>
           <w:tcPr>
-            <w:tcW w:type="dxa" w:w="1440"/>
+            <w:tcW w:type="dxa" w:w="1584"/>
             <w:shd w:val="clear" w:color="auto" w:fill="FFFFFF"/>
           </w:tcPr>
           <w:p>
@@ -581,7 +2199,7 @@
         </w:tc>
         <w:tc>
           <w:tcPr>
-            <w:tcW w:type="dxa" w:w="3168"/>
+            <w:tcW w:type="dxa" w:w="3600"/>
             <w:shd w:val="clear" w:color="auto" w:fill="FFFFFF"/>
           </w:tcPr>
           <w:p>
@@ -594,7 +2212,7 @@
                 <w:color w:val="2D3748"/>
                 <w:sz w:val="16"/>
               </w:rPr>
-              <w:t>Margem ampla. Entrada de água operando em 50%.</w:t>
+              <w:t>Nível seguro com margem satisfatória.</w:t>
             </w:r>
           </w:p>
         </w:tc>
@@ -602,7 +2220,7 @@
       <w:tr>
         <w:tc>
           <w:tcPr>
-            <w:tcW w:type="dxa" w:w="1440"/>
+            <w:tcW w:type="dxa" w:w="1296"/>
             <w:shd w:val="clear" w:color="auto" w:fill="F8FAFC"/>
           </w:tcPr>
           <w:p>
@@ -641,7 +2259,7 @@
         </w:tc>
         <w:tc>
           <w:tcPr>
-            <w:tcW w:type="dxa" w:w="1440"/>
+            <w:tcW w:type="dxa" w:w="1584"/>
             <w:shd w:val="clear" w:color="auto" w:fill="F8FAFC"/>
           </w:tcPr>
           <w:p>
@@ -679,7 +2297,7 @@
         </w:tc>
         <w:tc>
           <w:tcPr>
-            <w:tcW w:type="dxa" w:w="3168"/>
+            <w:tcW w:type="dxa" w:w="3600"/>
             <w:shd w:val="clear" w:color="auto" w:fill="F8FAFC"/>
           </w:tcPr>
           <w:p>
@@ -692,7 +2310,7 @@
                 <w:color w:val="2D3748"/>
                 <w:sz w:val="16"/>
               </w:rPr>
-              <w:t>Capacidade máxima! Vertedouro acionado contra transbordo.</w:t>
+              <w:t>Risco iminente de transbordamento.</w:t>
             </w:r>
           </w:p>
         </w:tc>
@@ -700,29 +2318,16 @@
     </w:tbl>
     <w:p>
       <w:pPr>
-        <w:spacing w:before="200" w:after="80"/>
+        <w:spacing w:before="160" w:after="60"/>
       </w:pPr>
       <w:r>
         <w:rPr>
           <w:rFonts w:ascii="Arial" w:hAnsi="Arial"/>
           <w:b/>
-          <w:color w:val="1A365D"/>
-          <w:sz w:val="24"/>
+          <w:color w:val="2B6CB0"/>
+          <w:sz w:val="21"/>
         </w:rPr>
-        <w:t>3. Arquitetura Modular: Funções e Procedimentos</w:t>
-      </w:r>
-    </w:p>
-    <w:p>
-      <w:pPr>
-        <w:spacing w:after="80" w:line="276" w:lineRule="auto"/>
-      </w:pPr>
-      <w:r>
-        <w:rPr>
-          <w:rFonts w:ascii="Arial" w:hAnsi="Arial"/>
-          <w:color w:val="2D3748"/>
-          <w:sz w:val="19"/>
-        </w:rPr>
-        <w:t>Em aderência aos princípios da Programação Estruturada e ao Princípio da Responsabilidade Única (SRP), o código foi particionado em funções com retorno e procedimentos dedicados:</w:t>
+        <w:t>Código-Fonte Oficial na Íntegra (IraciBertoGomes_Ag11_DSI.py)</w:t>
       </w:r>
     </w:p>
     <w:tbl>
@@ -733,600 +2338,338 @@
         <w:tblLook w:firstColumn="1" w:firstRow="1" w:lastColumn="0" w:lastRow="0" w:noHBand="0" w:noVBand="1" w:val="04A0"/>
       </w:tblPr>
       <w:tblGrid>
-        <w:gridCol w:w="2045"/>
-        <w:gridCol w:w="2045"/>
-        <w:gridCol w:w="2045"/>
-        <w:gridCol w:w="2045"/>
-        <w:gridCol w:w="2045"/>
+        <w:gridCol w:w="10368"/>
       </w:tblGrid>
       <w:tr>
         <w:tc>
           <w:tcPr>
-            <w:tcW w:type="dxa" w:w="2160"/>
-            <w:shd w:val="clear" w:color="auto" w:fill="2B6CB0"/>
+            <w:tcW w:type="dxa" w:w="10368"/>
+            <w:shd w:val="clear" w:color="auto" w:fill="F1F5F9"/>
           </w:tcPr>
           <w:p>
             <w:pPr>
-              <w:jc w:val="center"/>
+              <w:spacing w:before="80" w:after="80" w:line="252" w:lineRule="auto"/>
             </w:pPr>
             <w:r>
               <w:rPr>
-                <w:rFonts w:ascii="Arial" w:hAnsi="Arial"/>
-                <w:b/>
-                <w:color w:val="FFFFFF"/>
+                <w:rFonts w:ascii="Courier New" w:hAnsi="Courier New"/>
+                <w:color w:val="0F172A"/>
                 <w:sz w:val="17"/>
               </w:rPr>
-              <w:t>Identificador</w:t>
-            </w:r>
-          </w:p>
-        </w:tc>
-        <w:tc>
-          <w:tcPr>
-            <w:tcW w:type="dxa" w:w="1584"/>
-            <w:shd w:val="clear" w:color="auto" w:fill="2B6CB0"/>
-          </w:tcPr>
-          <w:p>
-            <w:pPr>
-              <w:jc w:val="center"/>
-            </w:pPr>
-            <w:r>
-              <w:rPr>
-                <w:rFonts w:ascii="Arial" w:hAnsi="Arial"/>
-                <w:b/>
-                <w:color w:val="FFFFFF"/>
-                <w:sz w:val="17"/>
-              </w:rPr>
-              <w:t>Tipo</w:t>
-            </w:r>
-          </w:p>
-        </w:tc>
-        <w:tc>
-          <w:tcPr>
-            <w:tcW w:type="dxa" w:w="1728"/>
-            <w:shd w:val="clear" w:color="auto" w:fill="2B6CB0"/>
-          </w:tcPr>
-          <w:p>
-            <w:pPr>
-              <w:jc w:val="center"/>
-            </w:pPr>
-            <w:r>
-              <w:rPr>
-                <w:rFonts w:ascii="Arial" w:hAnsi="Arial"/>
-                <w:b/>
-                <w:color w:val="FFFFFF"/>
-                <w:sz w:val="17"/>
-              </w:rPr>
-              <w:t>Parâmetros</w:t>
-            </w:r>
-          </w:p>
-        </w:tc>
-        <w:tc>
-          <w:tcPr>
-            <w:tcW w:type="dxa" w:w="1296"/>
-            <w:shd w:val="clear" w:color="auto" w:fill="2B6CB0"/>
-          </w:tcPr>
-          <w:p>
-            <w:pPr>
-              <w:jc w:val="center"/>
-            </w:pPr>
-            <w:r>
-              <w:rPr>
-                <w:rFonts w:ascii="Arial" w:hAnsi="Arial"/>
-                <w:b/>
-                <w:color w:val="FFFFFF"/>
-                <w:sz w:val="17"/>
-              </w:rPr>
-              <w:t>Retorno</w:t>
-            </w:r>
-          </w:p>
-        </w:tc>
-        <w:tc>
-          <w:tcPr>
-            <w:tcW w:type="dxa" w:w="3168"/>
-            <w:shd w:val="clear" w:color="auto" w:fill="2B6CB0"/>
-          </w:tcPr>
-          <w:p>
-            <w:pPr>
-              <w:jc w:val="center"/>
-            </w:pPr>
-            <w:r>
-              <w:rPr>
-                <w:rFonts w:ascii="Arial" w:hAnsi="Arial"/>
-                <w:b/>
-                <w:color w:val="FFFFFF"/>
-                <w:sz w:val="17"/>
-              </w:rPr>
-              <w:t>Responsabilidade Principal</w:t>
-            </w:r>
-          </w:p>
-        </w:tc>
-      </w:tr>
-      <w:tr>
-        <w:tc>
-          <w:tcPr>
-            <w:tcW w:type="dxa" w:w="2160"/>
-            <w:shd w:val="clear" w:color="auto" w:fill="F8FAFC"/>
-          </w:tcPr>
-          <w:p>
-            <w:pPr>
-              <w:jc w:val="left"/>
-            </w:pPr>
-            <w:r>
-              <w:rPr>
-                <w:rFonts w:ascii="Arial" w:hAnsi="Arial"/>
-                <w:b/>
-                <w:color w:val="2D3748"/>
-                <w:sz w:val="16"/>
-              </w:rPr>
-              <w:t>limpar_tela()</w:t>
-            </w:r>
-          </w:p>
-        </w:tc>
-        <w:tc>
-          <w:tcPr>
-            <w:tcW w:type="dxa" w:w="1584"/>
-            <w:shd w:val="clear" w:color="auto" w:fill="F8FAFC"/>
-          </w:tcPr>
-          <w:p>
-            <w:pPr>
-              <w:jc w:val="center"/>
-            </w:pPr>
-            <w:r>
-              <w:rPr>
-                <w:rFonts w:ascii="Arial" w:hAnsi="Arial"/>
-                <w:color w:val="2D3748"/>
-                <w:sz w:val="16"/>
-              </w:rPr>
-              <w:t>Procedimento</w:t>
-            </w:r>
-          </w:p>
-        </w:tc>
-        <w:tc>
-          <w:tcPr>
-            <w:tcW w:type="dxa" w:w="1728"/>
-            <w:shd w:val="clear" w:color="auto" w:fill="F8FAFC"/>
-          </w:tcPr>
-          <w:p>
-            <w:pPr>
-              <w:jc w:val="center"/>
-            </w:pPr>
-            <w:r>
-              <w:rPr>
-                <w:rFonts w:ascii="Arial" w:hAnsi="Arial"/>
-                <w:color w:val="2D3748"/>
-                <w:sz w:val="16"/>
-              </w:rPr>
-              <w:t>Nenhum</w:t>
-            </w:r>
-          </w:p>
-        </w:tc>
-        <w:tc>
-          <w:tcPr>
-            <w:tcW w:type="dxa" w:w="1296"/>
-            <w:shd w:val="clear" w:color="auto" w:fill="F8FAFC"/>
-          </w:tcPr>
-          <w:p>
-            <w:pPr>
-              <w:jc w:val="center"/>
-            </w:pPr>
-            <w:r>
-              <w:rPr>
-                <w:rFonts w:ascii="Arial" w:hAnsi="Arial"/>
-                <w:color w:val="2D3748"/>
-                <w:sz w:val="16"/>
-              </w:rPr>
-              <w:t>None</w:t>
-            </w:r>
-          </w:p>
-        </w:tc>
-        <w:tc>
-          <w:tcPr>
-            <w:tcW w:type="dxa" w:w="3168"/>
-            <w:shd w:val="clear" w:color="auto" w:fill="F8FAFC"/>
-          </w:tcPr>
-          <w:p>
-            <w:pPr>
-              <w:jc w:val="left"/>
-            </w:pPr>
-            <w:r>
-              <w:rPr>
-                <w:rFonts w:ascii="Arial" w:hAnsi="Arial"/>
-                <w:color w:val="2D3748"/>
-                <w:sz w:val="16"/>
-              </w:rPr>
-              <w:t>Limpa o terminal multiplataforma (cls/clear) de forma segura.</w:t>
-            </w:r>
-          </w:p>
-        </w:tc>
-      </w:tr>
-      <w:tr>
-        <w:tc>
-          <w:tcPr>
-            <w:tcW w:type="dxa" w:w="2160"/>
-            <w:shd w:val="clear" w:color="auto" w:fill="FFFFFF"/>
-          </w:tcPr>
-          <w:p>
-            <w:pPr>
-              <w:jc w:val="left"/>
-            </w:pPr>
-            <w:r>
-              <w:rPr>
-                <w:rFonts w:ascii="Arial" w:hAnsi="Arial"/>
-                <w:b/>
-                <w:color w:val="2D3748"/>
-                <w:sz w:val="16"/>
-              </w:rPr>
-              <w:t>exibir_cabecalho()</w:t>
-            </w:r>
-          </w:p>
-        </w:tc>
-        <w:tc>
-          <w:tcPr>
-            <w:tcW w:type="dxa" w:w="1584"/>
-            <w:shd w:val="clear" w:color="auto" w:fill="FFFFFF"/>
-          </w:tcPr>
-          <w:p>
-            <w:pPr>
-              <w:jc w:val="center"/>
-            </w:pPr>
-            <w:r>
-              <w:rPr>
-                <w:rFonts w:ascii="Arial" w:hAnsi="Arial"/>
-                <w:color w:val="2D3748"/>
-                <w:sz w:val="16"/>
-              </w:rPr>
-              <w:t>Procedimento</w:t>
-            </w:r>
-          </w:p>
-        </w:tc>
-        <w:tc>
-          <w:tcPr>
-            <w:tcW w:type="dxa" w:w="1728"/>
-            <w:shd w:val="clear" w:color="auto" w:fill="FFFFFF"/>
-          </w:tcPr>
-          <w:p>
-            <w:pPr>
-              <w:jc w:val="center"/>
-            </w:pPr>
-            <w:r>
-              <w:rPr>
-                <w:rFonts w:ascii="Arial" w:hAnsi="Arial"/>
-                <w:color w:val="2D3748"/>
-                <w:sz w:val="16"/>
-              </w:rPr>
-              <w:t>Nenhum</w:t>
-            </w:r>
-          </w:p>
-        </w:tc>
-        <w:tc>
-          <w:tcPr>
-            <w:tcW w:type="dxa" w:w="1296"/>
-            <w:shd w:val="clear" w:color="auto" w:fill="FFFFFF"/>
-          </w:tcPr>
-          <w:p>
-            <w:pPr>
-              <w:jc w:val="center"/>
-            </w:pPr>
-            <w:r>
-              <w:rPr>
-                <w:rFonts w:ascii="Arial" w:hAnsi="Arial"/>
-                <w:color w:val="2D3748"/>
-                <w:sz w:val="16"/>
-              </w:rPr>
-              <w:t>None</w:t>
-            </w:r>
-          </w:p>
-        </w:tc>
-        <w:tc>
-          <w:tcPr>
-            <w:tcW w:type="dxa" w:w="3168"/>
-            <w:shd w:val="clear" w:color="auto" w:fill="FFFFFF"/>
-          </w:tcPr>
-          <w:p>
-            <w:pPr>
-              <w:jc w:val="left"/>
-            </w:pPr>
-            <w:r>
-              <w:rPr>
-                <w:rFonts w:ascii="Arial" w:hAnsi="Arial"/>
-                <w:color w:val="2D3748"/>
-                <w:sz w:val="16"/>
-              </w:rPr>
-              <w:t>Apresenta o título visual estilizado do sistema.</w:t>
-            </w:r>
-          </w:p>
-        </w:tc>
-      </w:tr>
-      <w:tr>
-        <w:tc>
-          <w:tcPr>
-            <w:tcW w:type="dxa" w:w="2160"/>
-            <w:shd w:val="clear" w:color="auto" w:fill="F8FAFC"/>
-          </w:tcPr>
-          <w:p>
-            <w:pPr>
-              <w:jc w:val="left"/>
-            </w:pPr>
-            <w:r>
-              <w:rPr>
-                <w:rFonts w:ascii="Arial" w:hAnsi="Arial"/>
-                <w:b/>
-                <w:color w:val="2D3748"/>
-                <w:sz w:val="16"/>
-              </w:rPr>
-              <w:t>definir_cor_nivel(nivel)</w:t>
-            </w:r>
-          </w:p>
-        </w:tc>
-        <w:tc>
-          <w:tcPr>
-            <w:tcW w:type="dxa" w:w="1584"/>
-            <w:shd w:val="clear" w:color="auto" w:fill="F8FAFC"/>
-          </w:tcPr>
-          <w:p>
-            <w:pPr>
-              <w:jc w:val="center"/>
-            </w:pPr>
-            <w:r>
-              <w:rPr>
-                <w:rFonts w:ascii="Arial" w:hAnsi="Arial"/>
-                <w:color w:val="2D3748"/>
-                <w:sz w:val="16"/>
-              </w:rPr>
-              <w:t>Função</w:t>
-            </w:r>
-          </w:p>
-        </w:tc>
-        <w:tc>
-          <w:tcPr>
-            <w:tcW w:type="dxa" w:w="1728"/>
-            <w:shd w:val="clear" w:color="auto" w:fill="F8FAFC"/>
-          </w:tcPr>
-          <w:p>
-            <w:pPr>
-              <w:jc w:val="center"/>
-            </w:pPr>
-            <w:r>
-              <w:rPr>
-                <w:rFonts w:ascii="Arial" w:hAnsi="Arial"/>
-                <w:color w:val="2D3748"/>
-                <w:sz w:val="16"/>
-              </w:rPr>
-              <w:t>nivel (int)</w:t>
-            </w:r>
-          </w:p>
-        </w:tc>
-        <w:tc>
-          <w:tcPr>
-            <w:tcW w:type="dxa" w:w="1296"/>
-            <w:shd w:val="clear" w:color="auto" w:fill="F8FAFC"/>
-          </w:tcPr>
-          <w:p>
-            <w:pPr>
-              <w:jc w:val="center"/>
-            </w:pPr>
-            <w:r>
-              <w:rPr>
-                <w:rFonts w:ascii="Arial" w:hAnsi="Arial"/>
-                <w:color w:val="2D3748"/>
-                <w:sz w:val="16"/>
-              </w:rPr>
-              <w:t>str (ANSI)</w:t>
-            </w:r>
-          </w:p>
-        </w:tc>
-        <w:tc>
-          <w:tcPr>
-            <w:tcW w:type="dxa" w:w="3168"/>
-            <w:shd w:val="clear" w:color="auto" w:fill="F8FAFC"/>
-          </w:tcPr>
-          <w:p>
-            <w:pPr>
-              <w:jc w:val="left"/>
-            </w:pPr>
-            <w:r>
-              <w:rPr>
-                <w:rFonts w:ascii="Arial" w:hAnsi="Arial"/>
-                <w:color w:val="2D3748"/>
-                <w:sz w:val="16"/>
-              </w:rPr>
-              <w:t>Responsável exclusiva por definir e retornar a cor do colorama.</w:t>
-            </w:r>
-          </w:p>
-        </w:tc>
-      </w:tr>
-      <w:tr>
-        <w:tc>
-          <w:tcPr>
-            <w:tcW w:type="dxa" w:w="2160"/>
-            <w:shd w:val="clear" w:color="auto" w:fill="FFFFFF"/>
-          </w:tcPr>
-          <w:p>
-            <w:pPr>
-              <w:jc w:val="left"/>
-            </w:pPr>
-            <w:r>
-              <w:rPr>
-                <w:rFonts w:ascii="Arial" w:hAnsi="Arial"/>
-                <w:b/>
-                <w:color w:val="2D3748"/>
-                <w:sz w:val="16"/>
-              </w:rPr>
-              <w:t>gerar_barra_nivel(nivel)</w:t>
-            </w:r>
-          </w:p>
-        </w:tc>
-        <w:tc>
-          <w:tcPr>
-            <w:tcW w:type="dxa" w:w="1584"/>
-            <w:shd w:val="clear" w:color="auto" w:fill="FFFFFF"/>
-          </w:tcPr>
-          <w:p>
-            <w:pPr>
-              <w:jc w:val="center"/>
-            </w:pPr>
-            <w:r>
-              <w:rPr>
-                <w:rFonts w:ascii="Arial" w:hAnsi="Arial"/>
-                <w:color w:val="2D3748"/>
-                <w:sz w:val="16"/>
-              </w:rPr>
-              <w:t>Função</w:t>
-            </w:r>
-          </w:p>
-        </w:tc>
-        <w:tc>
-          <w:tcPr>
-            <w:tcW w:type="dxa" w:w="1728"/>
-            <w:shd w:val="clear" w:color="auto" w:fill="FFFFFF"/>
-          </w:tcPr>
-          <w:p>
-            <w:pPr>
-              <w:jc w:val="center"/>
-            </w:pPr>
-            <w:r>
-              <w:rPr>
-                <w:rFonts w:ascii="Arial" w:hAnsi="Arial"/>
-                <w:color w:val="2D3748"/>
-                <w:sz w:val="16"/>
-              </w:rPr>
-              <w:t>nivel, max</w:t>
-            </w:r>
-          </w:p>
-        </w:tc>
-        <w:tc>
-          <w:tcPr>
-            <w:tcW w:type="dxa" w:w="1296"/>
-            <w:shd w:val="clear" w:color="auto" w:fill="FFFFFF"/>
-          </w:tcPr>
-          <w:p>
-            <w:pPr>
-              <w:jc w:val="center"/>
-            </w:pPr>
-            <w:r>
-              <w:rPr>
-                <w:rFonts w:ascii="Arial" w:hAnsi="Arial"/>
-                <w:color w:val="2D3748"/>
-                <w:sz w:val="16"/>
-              </w:rPr>
-              <w:t>str</w:t>
-            </w:r>
-          </w:p>
-        </w:tc>
-        <w:tc>
-          <w:tcPr>
-            <w:tcW w:type="dxa" w:w="3168"/>
-            <w:shd w:val="clear" w:color="auto" w:fill="FFFFFF"/>
-          </w:tcPr>
-          <w:p>
-            <w:pPr>
-              <w:jc w:val="left"/>
-            </w:pPr>
-            <w:r>
-              <w:rPr>
-                <w:rFonts w:ascii="Arial" w:hAnsi="Arial"/>
-                <w:color w:val="2D3748"/>
-                <w:sz w:val="16"/>
-              </w:rPr>
-              <w:t>Gera régua visual de preenchimento percentual em ASCII.</w:t>
-            </w:r>
-          </w:p>
-        </w:tc>
-      </w:tr>
-      <w:tr>
-        <w:tc>
-          <w:tcPr>
-            <w:tcW w:type="dxa" w:w="2160"/>
-            <w:shd w:val="clear" w:color="auto" w:fill="F8FAFC"/>
-          </w:tcPr>
-          <w:p>
-            <w:pPr>
-              <w:jc w:val="left"/>
-            </w:pPr>
-            <w:r>
-              <w:rPr>
-                <w:rFonts w:ascii="Arial" w:hAnsi="Arial"/>
-                <w:b/>
-                <w:color w:val="2D3748"/>
-                <w:sz w:val="16"/>
-              </w:rPr>
-              <w:t>exibir_alerta_nivel(item)</w:t>
-            </w:r>
-          </w:p>
-        </w:tc>
-        <w:tc>
-          <w:tcPr>
-            <w:tcW w:type="dxa" w:w="1584"/>
-            <w:shd w:val="clear" w:color="auto" w:fill="F8FAFC"/>
-          </w:tcPr>
-          <w:p>
-            <w:pPr>
-              <w:jc w:val="center"/>
-            </w:pPr>
-            <w:r>
-              <w:rPr>
-                <w:rFonts w:ascii="Arial" w:hAnsi="Arial"/>
-                <w:color w:val="2D3748"/>
-                <w:sz w:val="16"/>
-              </w:rPr>
-              <w:t>Procedimento</w:t>
-            </w:r>
-          </w:p>
-        </w:tc>
-        <w:tc>
-          <w:tcPr>
-            <w:tcW w:type="dxa" w:w="1728"/>
-            <w:shd w:val="clear" w:color="auto" w:fill="F8FAFC"/>
-          </w:tcPr>
-          <w:p>
-            <w:pPr>
-              <w:jc w:val="center"/>
-            </w:pPr>
-            <w:r>
-              <w:rPr>
-                <w:rFonts w:ascii="Arial" w:hAnsi="Arial"/>
-                <w:color w:val="2D3748"/>
-                <w:sz w:val="16"/>
-              </w:rPr>
-              <w:t>item (dict)</w:t>
-            </w:r>
-          </w:p>
-        </w:tc>
-        <w:tc>
-          <w:tcPr>
-            <w:tcW w:type="dxa" w:w="1296"/>
-            <w:shd w:val="clear" w:color="auto" w:fill="F8FAFC"/>
-          </w:tcPr>
-          <w:p>
-            <w:pPr>
-              <w:jc w:val="center"/>
-            </w:pPr>
-            <w:r>
-              <w:rPr>
-                <w:rFonts w:ascii="Arial" w:hAnsi="Arial"/>
-                <w:color w:val="2D3748"/>
-                <w:sz w:val="16"/>
-              </w:rPr>
-              <w:t>None</w:t>
-            </w:r>
-          </w:p>
-        </w:tc>
-        <w:tc>
-          <w:tcPr>
-            <w:tcW w:type="dxa" w:w="3168"/>
-            <w:shd w:val="clear" w:color="auto" w:fill="F8FAFC"/>
-          </w:tcPr>
-          <w:p>
-            <w:pPr>
-              <w:jc w:val="left"/>
-            </w:pPr>
-            <w:r>
-              <w:rPr>
-                <w:rFonts w:ascii="Arial" w:hAnsi="Arial"/>
-                <w:color w:val="2D3748"/>
-                <w:sz w:val="16"/>
-              </w:rPr>
-              <w:t>Imprime o alerta com cor correspondente e restaura o terminal.</w:t>
+              <w:t>"""</w:t>
+              <w:br/>
+              <w:t>=============================================================================</w:t>
+              <w:br/>
+              <w:t>CURSO TÉCNICO EM DESENVOLVIMENTO DE SISTEMAS - ETEC / CPS</w:t>
+              <w:br/>
+              <w:t>Componente Curricular: Desenvolvimento de Sistemas I (DS I)</w:t>
+              <w:br/>
+              <w:t>Atividade da Agenda 11: Controle de Níveis de Água no Reservatório</w:t>
+              <w:br/>
+              <w:t>Estudante: Iraci Berto Gomes</w:t>
+              <w:br/>
+              <w:t>Arquivo de Entrega: IraciBertoGomes_Ag11_DSI.py</w:t>
+              <w:br/>
+              <w:br/>
+              <w:t>CONCEITOS APLICADOS DAS APOSTILAS DO CURSO (AGENDAS 1 A 11):</w:t>
+              <w:br/>
+              <w:t>- Agenda 02 e 03: Variáveis, tipos de dados primitivos e f-strings.</w:t>
+              <w:br/>
+              <w:t>- Agenda 04 e 05: Versionamento do código com Git e GitHub.</w:t>
+              <w:br/>
+              <w:t>- Agenda 06 e 07: Estruturas de Decisão com if, elif e else.</w:t>
+              <w:br/>
+              <w:t>- Agenda 08: Estruturas de Repetição com for e range().</w:t>
+              <w:br/>
+              <w:t>- Agenda 09: Estruturas de Dados - Listas ([]), índices e função len().</w:t>
+              <w:br/>
+              <w:t>- Agenda 10: Funções com retorno (return) e Procedimentos (SRP).</w:t>
+              <w:br/>
+              <w:t>- Agenda 11: Bibliotecas padrão (os, sys, time) e externa (colorama).</w:t>
+              <w:br/>
+              <w:t>=============================================================================</w:t>
+              <w:br/>
+              <w:t>"""</w:t>
+              <w:br/>
+              <w:br/>
+              <w:t># ---------------------------------------------------------------------------</w:t>
+              <w:br/>
+              <w:t># AGENDA 11: IMPORTAÇÃO DE BIBLIOTECAS (Padrão e Externas)</w:t>
+              <w:br/>
+              <w:t># ---------------------------------------------------------------------------</w:t>
+              <w:br/>
+              <w:t>import os               # Biblioteca padrão: interação com o sistema operacional</w:t>
+              <w:br/>
+              <w:t>import sys              # Biblioteca padrão: recursos do ambiente Python</w:t>
+              <w:br/>
+              <w:t>import time             # Biblioteca padrão: controle de intervalos e pausas (time.sleep)</w:t>
+              <w:br/>
+              <w:t>from colorama import Fore, Style  # Biblioteca externa: cores e estilos no terminal</w:t>
+              <w:br/>
+              <w:br/>
+              <w:t># Configuração de compatibilidade de codificação UTF-8 para o console Windows</w:t>
+              <w:br/>
+              <w:t>if sys.platform == 'win32':</w:t>
+              <w:br/>
+              <w:t xml:space="preserve">    try:</w:t>
+              <w:br/>
+              <w:t xml:space="preserve">        sys.stdout.reconfigure(encoding='utf-8')</w:t>
+              <w:br/>
+              <w:t xml:space="preserve">    except AttributeError:</w:t>
+              <w:br/>
+              <w:t xml:space="preserve">        pass</w:t>
+              <w:br/>
+              <w:br/>
+              <w:br/>
+              <w:t># ---------------------------------------------------------------------------</w:t>
+              <w:br/>
+              <w:t># AGENDA 10: PROCEDIMENTOS DE INTERFACE E APRESENTAÇÃO (Sem retorno - None)</w:t>
+              <w:br/>
+              <w:t># ---------------------------------------------------------------------------</w:t>
+              <w:br/>
+              <w:br/>
+              <w:t>def limpar_tela():</w:t>
+              <w:br/>
+              <w:t xml:space="preserve">    """</w:t>
+              <w:br/>
+              <w:t xml:space="preserve">    Procedimento para limpar o terminal de forma multiplataforma (Agenda 10 e 11).</w:t>
+              <w:br/>
+              <w:t xml:space="preserve">    Utiliza a biblioteca 'os' estudada na Agenda 11.</w:t>
+              <w:br/>
+              <w:t xml:space="preserve">    """</w:t>
+              <w:br/>
+              <w:t xml:space="preserve">    os.system('cls' if os.name == 'nt' else 'clear')</w:t>
+              <w:br/>
+              <w:br/>
+              <w:br/>
+              <w:t>def exibir_cabecalho():</w:t>
+              <w:br/>
+              <w:t xml:space="preserve">    """</w:t>
+              <w:br/>
+              <w:t xml:space="preserve">    Procedimento que exibe o cabeçalho do sistema de monitoramento (Agenda 10).</w:t>
+              <w:br/>
+              <w:t xml:space="preserve">    Aplica formatação com a biblioteca colorama (Agenda 11).</w:t>
+              <w:br/>
+              <w:t xml:space="preserve">    """</w:t>
+              <w:br/>
+              <w:t xml:space="preserve">    print(Style.BRIGHT + Fore.CYAN + "=" * 65)</w:t>
+              <w:br/>
+              <w:t xml:space="preserve">    print("   SISTEMA DE MONITORAMENTO DE NÍVEIS DE ÁGUA - RESERVATÓRIO")</w:t>
+              <w:br/>
+              <w:t xml:space="preserve">    print("        Telemetria e Controle Automatizado em Terminal")</w:t>
+              <w:br/>
+              <w:t xml:space="preserve">    print("=" * 65 + Style.RESET_ALL)</w:t>
+              <w:br/>
+              <w:t xml:space="preserve">    print()</w:t>
+              <w:br/>
+              <w:br/>
+              <w:br/>
+              <w:t># ---------------------------------------------------------------------------</w:t>
+              <w:br/>
+              <w:t># AGENDA 10 &amp; 11: FUNÇÃO COM RETORNO PARA DEFINIR A COR (Regra da Atividade)</w:t>
+              <w:br/>
+              <w:t># ---------------------------------------------------------------------------</w:t>
+              <w:br/>
+              <w:br/>
+              <w:t>def definir_cor_mensagem(nivel):</w:t>
+              <w:br/>
+              <w:t xml:space="preserve">    """</w:t>
+              <w:br/>
+              <w:t xml:space="preserve">    Função com retorno (Agenda 10):</w:t>
+              <w:br/>
+              <w:t xml:space="preserve">    Responsável estritamente por definir e retornar a cor da biblioteca colorama</w:t>
+              <w:br/>
+              <w:t xml:space="preserve">    conforme o nível de água informado, seguindo a tabela de risco da Agenda 11:</w:t>
+              <w:br/>
+              <w:br/>
+              <w:t xml:space="preserve">    - Nível 1: Muito baixo (crítico) -&gt; Vermelho (Fore.RED)</w:t>
+              <w:br/>
+              <w:t xml:space="preserve">    - Nível 2: Baixo                -&gt; Amarelo  (Fore.YELLOW)</w:t>
+              <w:br/>
+              <w:t xml:space="preserve">    - Nível 3: Médio                -&gt; Verde    (Fore.GREEN)</w:t>
+              <w:br/>
+              <w:t xml:space="preserve">    - Nível 4: Alto                 -&gt; Ciano    (Fore.CYAN)</w:t>
+              <w:br/>
+              <w:t xml:space="preserve">    - Nível 5: Muito alto (alerta)  -&gt; Azul     (Fore.BLUE)</w:t>
+              <w:br/>
+              <w:br/>
+              <w:t xml:space="preserve">    Aplica estruturas condicionais if, elif e else estudadas nas Agendas 06 e 07.</w:t>
+              <w:br/>
+              <w:t xml:space="preserve">    """</w:t>
+              <w:br/>
+              <w:t xml:space="preserve">    if nivel == 1:</w:t>
+              <w:br/>
+              <w:t xml:space="preserve">        return Fore.RED</w:t>
+              <w:br/>
+              <w:t xml:space="preserve">    elif nivel == 2:</w:t>
+              <w:br/>
+              <w:t xml:space="preserve">        return Fore.YELLOW</w:t>
+              <w:br/>
+              <w:t xml:space="preserve">    elif nivel == 3:</w:t>
+              <w:br/>
+              <w:t xml:space="preserve">        return Fore.GREEN</w:t>
+              <w:br/>
+              <w:t xml:space="preserve">    elif nivel == 4:</w:t>
+              <w:br/>
+              <w:t xml:space="preserve">        return Fore.CYAN</w:t>
+              <w:br/>
+              <w:t xml:space="preserve">    elif nivel == 5:</w:t>
+              <w:br/>
+              <w:t xml:space="preserve">        return Fore.BLUE</w:t>
+              <w:br/>
+              <w:t xml:space="preserve">    else:</w:t>
+              <w:br/>
+              <w:t xml:space="preserve">        return Fore.WHITE</w:t>
+              <w:br/>
+              <w:br/>
+              <w:br/>
+              <w:t># ---------------------------------------------------------------------------</w:t>
+              <w:br/>
+              <w:t># AGENDA 10 &amp; 11: PROCEDIMENTO PARA EXIBIR A MENSAGEM COM COR E RESTAURAR</w:t>
+              <w:br/>
+              <w:t># ---------------------------------------------------------------------------</w:t>
+              <w:br/>
+              <w:br/>
+              <w:t>def exibir_situacao_reservatorio(nivel, situacao):</w:t>
+              <w:br/>
+              <w:t xml:space="preserve">    """</w:t>
+              <w:br/>
+              <w:t xml:space="preserve">    Procedimento que exibe a situação atual do reservatório com a cor correspondente</w:t>
+              <w:br/>
+              <w:t xml:space="preserve">    e restaura imediatamente o estilo padrão do terminal (Agenda 10 e 11).</w:t>
+              <w:br/>
+              <w:br/>
+              <w:t xml:space="preserve">    Parâmetros:</w:t>
+              <w:br/>
+              <w:t xml:space="preserve">        nivel (int): Nível de água (1 a 5).</w:t>
+              <w:br/>
+              <w:t xml:space="preserve">        situacao (str): Mensagem de alerta/estado da água.</w:t>
+              <w:br/>
+              <w:t xml:space="preserve">    """</w:t>
+              <w:br/>
+              <w:t xml:space="preserve">    # 1. Obtém a cor através da função com retorno (Agenda 10)</w:t>
+              <w:br/>
+              <w:t xml:space="preserve">    cor = definir_cor_mensagem(nivel)</w:t>
+              <w:br/>
+              <w:br/>
+              <w:t xml:space="preserve">    # 2. Exibe no terminal a situação com a cor correspondente (Agenda 11)</w:t>
+              <w:br/>
+              <w:t xml:space="preserve">    # 3. Restaura o estilo padrão do terminal usando Style.RESET_ALL (Agenda 11)</w:t>
+              <w:br/>
+              <w:t xml:space="preserve">    print(cor + Style.BRIGHT + f"&gt;&gt; Nível {nivel}: {situacao}" + Style.RESET_ALL)</w:t>
+              <w:br/>
+              <w:br/>
+              <w:br/>
+              <w:t># ---------------------------------------------------------------------------</w:t>
+              <w:br/>
+              <w:t># AGENDA 08, 09, 10 &amp; 11: PROCEDIMENTO DE SIMULAÇÃO EM TEMPO REAL</w:t>
+              <w:br/>
+              <w:t># ---------------------------------------------------------------------------</w:t>
+              <w:br/>
+              <w:br/>
+              <w:t>def simular_monitoramento(lista_niveis, lista_mensagens, intervalo_segundos=1):</w:t>
+              <w:br/>
+              <w:t xml:space="preserve">    """</w:t>
+              <w:br/>
+              <w:t xml:space="preserve">    Procedimento que percorre as listas de dados simulando um ambiente real</w:t>
+              <w:br/>
+              <w:t xml:space="preserve">    de monitoramento de sensores em tempo real.</w:t>
+              <w:br/>
+              <w:br/>
+              <w:t xml:space="preserve">    Aplica:</w:t>
+              <w:br/>
+              <w:t xml:space="preserve">    - Agenda 08: Estrutura de repetição for e função range().</w:t>
+              <w:br/>
+              <w:t xml:space="preserve">    - Agenda 09: Listas, índices e a função len() para controle do percurso.</w:t>
+              <w:br/>
+              <w:t xml:space="preserve">    - Agenda 11: Biblioteca time com time.sleep() para criar pausas pedagógicas.</w:t>
+              <w:br/>
+              <w:t xml:space="preserve">    """</w:t>
+              <w:br/>
+              <w:t xml:space="preserve">    print(Style.BRIGHT + "Iniciando leitura e diagnóstico dos sensores em tempo real...\n" + Style.RESET_ALL)</w:t>
+              <w:br/>
+              <w:t xml:space="preserve">    print("-" * 65)</w:t>
+              <w:br/>
+              <w:br/>
+              <w:t xml:space="preserve">    # Percorre as listas pelo índice utilizando len() e range() (Agenda 08 e 09)</w:t>
+              <w:br/>
+              <w:t xml:space="preserve">    for i in range(len(lista_niveis)):</w:t>
+              <w:br/>
+              <w:t xml:space="preserve">        nivel_atual = lista_niveis[i]</w:t>
+              <w:br/>
+              <w:t xml:space="preserve">        mensagem_atual = lista_mensagens[i]</w:t>
+              <w:br/>
+              <w:br/>
+              <w:t xml:space="preserve">        # Chama o procedimento de exibição colorida (Agenda 10 e 11)</w:t>
+              <w:br/>
+              <w:t xml:space="preserve">        exibir_situacao_reservatorio(nivel_atual, mensagem_atual)</w:t>
+              <w:br/>
+              <w:br/>
+              <w:t xml:space="preserve">        # Pausa na execução com a biblioteca time (Agenda 11)</w:t>
+              <w:br/>
+              <w:t xml:space="preserve">        time.sleep(intervalo_segundos)</w:t>
+              <w:br/>
+              <w:br/>
+              <w:t xml:space="preserve">    print("-" * 65)</w:t>
+              <w:br/>
+              <w:t xml:space="preserve">    print()</w:t>
+              <w:br/>
+              <w:br/>
+              <w:br/>
+              <w:t># ---------------------------------------------------------------------------</w:t>
+              <w:br/>
+              <w:t># PROGRAMA PRINCIPAL</w:t>
+              <w:br/>
+              <w:t># ---------------------------------------------------------------------------</w:t>
+              <w:br/>
+              <w:br/>
+              <w:t>if __name__ == "__main__":</w:t>
+              <w:br/>
+              <w:t xml:space="preserve">    # Limpa a tela do console (Agenda 10 e 11)</w:t>
+              <w:br/>
+              <w:t xml:space="preserve">    limpar_tela()</w:t>
+              <w:br/>
+              <w:br/>
+              <w:t xml:space="preserve">    # Exibe cabeçalho formatado</w:t>
+              <w:br/>
+              <w:t xml:space="preserve">    exibir_cabecalho()</w:t>
+              <w:br/>
+              <w:br/>
+              <w:t xml:space="preserve">    # AGENDA 09: ESTRUTURA DE DADOS - LISTAS</w:t>
+              <w:br/>
+              <w:t xml:space="preserve">    # Criação de listas com nomes no plural conforme as boas práticas da Agenda 09.</w:t>
+              <w:br/>
+              <w:t xml:space="preserve">    # Armazenam os 5 níveis e as 5 mensagens de situação do reservatório.</w:t>
+              <w:br/>
+              <w:t xml:space="preserve">    niveis = [1, 2, 3, 4, 5]</w:t>
+              <w:br/>
+              <w:br/>
+              <w:t xml:space="preserve">    mensagens = [</w:t>
+              <w:br/>
+              <w:t xml:space="preserve">        "Muito baixo (crítico) - Risco de desabastecimento",</w:t>
+              <w:br/>
+              <w:t xml:space="preserve">        "Baixo - Atenção para acionamento de reposição",</w:t>
+              <w:br/>
+              <w:t xml:space="preserve">        "Médio - Volume ideal para operação regular",</w:t>
+              <w:br/>
+              <w:t xml:space="preserve">        "Alto - Nível seguro com margem satisfatória",</w:t>
+              <w:br/>
+              <w:t xml:space="preserve">        "Muito alto (alerta) - Risco iminente de transbordamento"</w:t>
+              <w:br/>
+              <w:t xml:space="preserve">    ]</w:t>
+              <w:br/>
+              <w:br/>
+              <w:t xml:space="preserve">    # AGENDA 11: Executa a simulação do ambiente real de monitoramento</w:t>
+              <w:br/>
+              <w:t xml:space="preserve">    simular_monitoramento(niveis, mensagens, intervalo_segundos=1)</w:t>
+              <w:br/>
+              <w:br/>
+              <w:t xml:space="preserve">    # AGENDA 11: Restauração explícita final do terminal com Style.RESET_ALL</w:t>
+              <w:br/>
+              <w:t xml:space="preserve">    print(Fore.GREEN + Style.BRIGHT + "[OK] Ciclo de monitoramento concluído com sucesso!" + Style.RESET_ALL)</w:t>
+              <w:br/>
+              <w:t xml:space="preserve">    print("Estilo padrão do terminal devidamente restaurado.\n")</w:t>
+              <w:br/>
             </w:r>
           </w:p>
         </w:tc>
@@ -1334,426 +2677,102 @@
     </w:tbl>
     <w:p>
       <w:pPr>
-        <w:spacing w:before="200" w:after="80"/>
+        <w:spacing w:after="40"/>
+      </w:pPr>
+    </w:p>
+    <w:p>
+      <w:pPr>
+        <w:spacing w:before="160" w:after="60"/>
+      </w:pPr>
+      <w:r>
+        <w:rPr>
+          <w:rFonts w:ascii="Arial" w:hAnsi="Arial"/>
+          <w:b/>
+          <w:color w:val="2B6CB0"/>
+          <w:sz w:val="21"/>
+        </w:rPr>
+        <w:t>Evidência de Execução Real no Terminal</w:t>
+      </w:r>
+    </w:p>
+    <w:tbl>
+      <w:tblPr>
+        <w:tblW w:type="auto" w:w="0"/>
+        <w:jc w:val="center"/>
+        <w:tblLayout w:type="fixed"/>
+        <w:tblLook w:firstColumn="1" w:firstRow="1" w:lastColumn="0" w:lastRow="0" w:noHBand="0" w:noVBand="1" w:val="04A0"/>
+      </w:tblPr>
+      <w:tblGrid>
+        <w:gridCol w:w="10368"/>
+      </w:tblGrid>
+      <w:tr>
+        <w:tc>
+          <w:tcPr>
+            <w:tcW w:type="dxa" w:w="10368"/>
+            <w:shd w:val="clear" w:color="auto" w:fill="F1F5F9"/>
+          </w:tcPr>
+          <w:p>
+            <w:pPr>
+              <w:spacing w:before="80" w:after="80" w:line="252" w:lineRule="auto"/>
+            </w:pPr>
+            <w:r>
+              <w:rPr>
+                <w:rFonts w:ascii="Courier New" w:hAnsi="Courier New"/>
+                <w:color w:val="0F172A"/>
+                <w:sz w:val="17"/>
+              </w:rPr>
+              <w:t>=================================================================</w:t>
+              <w:br/>
+              <w:t xml:space="preserve">   SISTEMA DE MONITORAMENTO DE NÍVEIS DE ÁGUA - RESERVATÓRIO</w:t>
+              <w:br/>
+              <w:t xml:space="preserve">        Telemetria e Controle Automatizado em Terminal</w:t>
+              <w:br/>
+              <w:t>=================================================================</w:t>
+              <w:br/>
+              <w:br/>
+              <w:t>Iniciando leitura e diagnóstico dos sensores em tempo real...</w:t>
+              <w:br/>
+              <w:br/>
+              <w:t>-----------------------------------------------------------------</w:t>
+              <w:br/>
+              <w:t>&gt;&gt; Nível 1: Muito baixo (crítico) - Risco de desabastecimento</w:t>
+              <w:br/>
+              <w:t>&gt;&gt; Nível 2: Baixo - Atenção para acionamento de reposição</w:t>
+              <w:br/>
+              <w:t>&gt;&gt; Nível 3: Médio - Volume ideal para operação regular</w:t>
+              <w:br/>
+              <w:t>&gt;&gt; Nível 4: Alto - Nível seguro com margem satisfatória</w:t>
+              <w:br/>
+              <w:t>&gt;&gt; Nível 5: Muito alto (alerta) - Risco iminente de transbordamento</w:t>
+              <w:br/>
+              <w:t>-----------------------------------------------------------------</w:t>
+              <w:br/>
+              <w:br/>
+              <w:t>[OK] Ciclo de monitoramento concluído com sucesso!</w:t>
+              <w:br/>
+              <w:t>Estilo padrão do terminal devidamente restaurado.</w:t>
+              <w:br/>
+            </w:r>
+          </w:p>
+        </w:tc>
+      </w:tr>
+    </w:tbl>
+    <w:p>
+      <w:pPr>
+        <w:spacing w:after="40"/>
+      </w:pPr>
+    </w:p>
+    <w:p>
+      <w:pPr>
+        <w:spacing w:before="280" w:after="80"/>
       </w:pPr>
       <w:r>
         <w:rPr>
           <w:rFonts w:ascii="Arial" w:hAnsi="Arial"/>
           <w:b/>
           <w:color w:val="1A365D"/>
-          <w:sz w:val="24"/>
+          <w:sz w:val="26"/>
         </w:rPr>
-        <w:t>4. Código-Fonte Oficial Comentado (IraciBertoGomes_Ag11_DSI.py)</w:t>
-      </w:r>
-    </w:p>
-    <w:p>
-      <w:pPr>
-        <w:spacing w:before="80" w:after="120" w:line="240" w:lineRule="auto"/>
-      </w:pPr>
-      <w:r>
-        <w:rPr>
-          <w:rFonts w:ascii="Courier New" w:hAnsi="Courier New"/>
-          <w:color w:val="1E293B"/>
-          <w:sz w:val="14"/>
-        </w:rPr>
-        <w:t>"""</w:t>
-        <w:br/>
-        <w:t>=============================================================================</w:t>
-        <w:br/>
-        <w:t>CURSO TÉCNICO EM DESENVOLVIMENTO DE SISTEMAS - ETEC / CPS</w:t>
-        <w:br/>
-        <w:t>Componente Curricular: Desenvolvimento de Sistemas I (DS I)</w:t>
-        <w:br/>
-        <w:t>Atividade da Agenda 11: Controle de Níveis de Água no Reservatório</w:t>
-        <w:br/>
-        <w:t>Estudante: Iraci Berto Gomes</w:t>
-        <w:br/>
-        <w:t>Arquivo de Entrega: IraciBertoGomes_Ag11_DSI.py</w:t>
-        <w:br/>
-        <w:br/>
-        <w:t>CONCEITOS APLICADOS DAS APOSTILAS DO CURSO (AGENDAS 1 A 11):</w:t>
-        <w:br/>
-        <w:t>- Agenda 02 e 03: Variáveis, tipos de dados primitivos e f-strings.</w:t>
-        <w:br/>
-        <w:t>- Agenda 04 e 05: Versionamento do código com Git e GitHub.</w:t>
-        <w:br/>
-        <w:t>- Agenda 06 e 07: Estruturas de Decisão com if, elif e else.</w:t>
-        <w:br/>
-        <w:t>- Agenda 08: Estruturas de Repetição com for e range().</w:t>
-        <w:br/>
-        <w:t>- Agenda 09: Estruturas de Dados - Listas ([]), índices e função len().</w:t>
-        <w:br/>
-        <w:t>- Agenda 10: Funções com retorno (return) e Procedimentos (SRP).</w:t>
-        <w:br/>
-        <w:t>- Agenda 11: Bibliotecas padrão (os, sys, time) e externa (colorama).</w:t>
-        <w:br/>
-        <w:t>=============================================================================</w:t>
-        <w:br/>
-        <w:t>"""</w:t>
-        <w:br/>
-        <w:br/>
-        <w:t># ---------------------------------------------------------------------------</w:t>
-        <w:br/>
-        <w:t># AGENDA 11: IMPORTAÇÃO DE BIBLIOTECAS (Padrão e Externas)</w:t>
-        <w:br/>
-        <w:t># ---------------------------------------------------------------------------</w:t>
-        <w:br/>
-        <w:t>import os               # Biblioteca padrão: interação com o sistema operacional</w:t>
-        <w:br/>
-        <w:t>import sys              # Biblioteca padrão: recursos do ambiente Python</w:t>
-        <w:br/>
-        <w:t>import time             # Biblioteca padrão: controle de intervalos e pausas (time.sleep)</w:t>
-        <w:br/>
-        <w:t>from colorama import Fore, Style  # Biblioteca externa: cores e estilos no terminal</w:t>
-        <w:br/>
-        <w:br/>
-        <w:t># Configuração de compatibilidade de codificação UTF-8 para o console Windows</w:t>
-        <w:br/>
-        <w:t>if sys.platform == 'win32':</w:t>
-        <w:br/>
-        <w:t xml:space="preserve">    try:</w:t>
-        <w:br/>
-        <w:t xml:space="preserve">        sys.stdout.reconfigure(encoding='utf-8')</w:t>
-        <w:br/>
-        <w:t xml:space="preserve">    except AttributeError:</w:t>
-        <w:br/>
-        <w:t xml:space="preserve">        pass</w:t>
-        <w:br/>
-        <w:br/>
-        <w:br/>
-        <w:t># ---------------------------------------------------------------------------</w:t>
-        <w:br/>
-        <w:t># AGENDA 10: PROCEDIMENTOS DE INTERFACE E APRESENTAÇÃO (Sem retorno - None)</w:t>
-        <w:br/>
-        <w:t># ---------------------------------------------------------------------------</w:t>
-        <w:br/>
-        <w:br/>
-        <w:t>def limpar_tela():</w:t>
-        <w:br/>
-        <w:t xml:space="preserve">    """</w:t>
-        <w:br/>
-        <w:t xml:space="preserve">    Procedimento para limpar o terminal de forma multiplataforma (Agenda 10 e 11).</w:t>
-        <w:br/>
-        <w:t xml:space="preserve">    Utiliza a biblioteca 'os' estudada na Agenda 11.</w:t>
-        <w:br/>
-        <w:t xml:space="preserve">    """</w:t>
-        <w:br/>
-        <w:t xml:space="preserve">    os.system('cls' if os.name == 'nt' else 'clear')</w:t>
-        <w:br/>
-        <w:br/>
-        <w:br/>
-        <w:t>def exibir_cabecalho():</w:t>
-        <w:br/>
-        <w:t xml:space="preserve">    """</w:t>
-        <w:br/>
-        <w:t xml:space="preserve">    Procedimento que exibe o cabeçalho do sistema de monitoramento (Agenda 10).</w:t>
-        <w:br/>
-        <w:t xml:space="preserve">    Aplica formatação com a biblioteca colorama (Agenda 11).</w:t>
-        <w:br/>
-        <w:t xml:space="preserve">    """</w:t>
-        <w:br/>
-        <w:t xml:space="preserve">    print(Style.BRIGHT + Fore.CYAN + "=" * 65)</w:t>
-        <w:br/>
-        <w:t xml:space="preserve">    print("   SISTEMA DE MONITORAMENTO DE NÍVEIS DE ÁGUA - RESERVATÓRIO")</w:t>
-        <w:br/>
-        <w:t xml:space="preserve">    print("        Telemetria e Controle Automatizado em Terminal")</w:t>
-        <w:br/>
-        <w:t xml:space="preserve">    print("=" * 65 + Style.RESET_ALL)</w:t>
-        <w:br/>
-        <w:t xml:space="preserve">    print()</w:t>
-        <w:br/>
-        <w:br/>
-        <w:br/>
-        <w:t># ---------------------------------------------------------------------------</w:t>
-        <w:br/>
-        <w:t># AGENDA 10 &amp; 11: FUNÇÃO COM RETORNO PARA DEFINIR A COR (Regra da Atividade)</w:t>
-        <w:br/>
-        <w:t># ---------------------------------------------------------------------------</w:t>
-        <w:br/>
-        <w:br/>
-        <w:t>def definir_cor_mensagem(nivel):</w:t>
-        <w:br/>
-        <w:t xml:space="preserve">    """</w:t>
-        <w:br/>
-        <w:t xml:space="preserve">    Função com retorno (Agenda 10):</w:t>
-        <w:br/>
-        <w:t xml:space="preserve">    Responsável estritamente por definir e retornar a cor da biblioteca colorama</w:t>
-        <w:br/>
-        <w:t xml:space="preserve">    conforme o nível de água informado, seguindo a tabela de risco da Agenda 11:</w:t>
-        <w:br/>
-        <w:br/>
-        <w:t xml:space="preserve">    - Nível 1: Muito baixo (crítico) -&gt; Vermelho (Fore.RED)</w:t>
-        <w:br/>
-        <w:t xml:space="preserve">    - Nível 2: Baixo                -&gt; Amarelo  (Fore.YELLOW)</w:t>
-        <w:br/>
-        <w:t xml:space="preserve">    - Nível 3: Médio                -&gt; Verde    (Fore.GREEN)</w:t>
-        <w:br/>
-        <w:t xml:space="preserve">    - Nível 4: Alto                 -&gt; Ciano    (Fore.CYAN)</w:t>
-        <w:br/>
-        <w:t xml:space="preserve">    - Nível 5: Muito alto (alerta)  -&gt; Azul     (Fore.BLUE)</w:t>
-        <w:br/>
-        <w:br/>
-        <w:t xml:space="preserve">    Aplica estruturas condicionais if, elif e else estudadas nas Agendas 06 e 07.</w:t>
-        <w:br/>
-        <w:t xml:space="preserve">    """</w:t>
-        <w:br/>
-        <w:t xml:space="preserve">    if nivel == 1:</w:t>
-        <w:br/>
-        <w:t xml:space="preserve">        return Fore.RED</w:t>
-        <w:br/>
-        <w:t xml:space="preserve">    elif nivel == 2:</w:t>
-        <w:br/>
-        <w:t xml:space="preserve">        return Fore.YELLOW</w:t>
-        <w:br/>
-        <w:t xml:space="preserve">    elif nivel == 3:</w:t>
-        <w:br/>
-        <w:t xml:space="preserve">        return Fore.GREEN</w:t>
-        <w:br/>
-        <w:t xml:space="preserve">    elif nivel == 4:</w:t>
-        <w:br/>
-        <w:t xml:space="preserve">        return Fore.CYAN</w:t>
-        <w:br/>
-        <w:t xml:space="preserve">    elif nivel == 5:</w:t>
-        <w:br/>
-        <w:t xml:space="preserve">        return Fore.BLUE</w:t>
-        <w:br/>
-        <w:t xml:space="preserve">    else:</w:t>
-        <w:br/>
-        <w:t xml:space="preserve">        return Fore.WHITE</w:t>
-        <w:br/>
-        <w:br/>
-        <w:br/>
-        <w:t># ---------------------------------------------------------------------------</w:t>
-        <w:br/>
-        <w:t># AGENDA 10 &amp; 11: PROCEDIMENTO PARA EXIBIR A MENSAGEM COM COR E RESTAURAR</w:t>
-        <w:br/>
-        <w:t># ---------------------------------------------------------------------------</w:t>
-        <w:br/>
-        <w:br/>
-        <w:t>def exibir_situacao_reservatorio(nivel, situacao):</w:t>
-        <w:br/>
-        <w:t xml:space="preserve">    """</w:t>
-        <w:br/>
-        <w:t xml:space="preserve">    Procedimento que exibe a situação atual do reservatório com a cor correspondente</w:t>
-        <w:br/>
-        <w:t xml:space="preserve">    e restaura imediatamente o estilo padrão do terminal (Agenda 10 e 11).</w:t>
-        <w:br/>
-        <w:br/>
-        <w:t xml:space="preserve">    Parâmetros:</w:t>
-        <w:br/>
-        <w:t xml:space="preserve">        nivel (int): Nível de água (1 a 5).</w:t>
-        <w:br/>
-        <w:t xml:space="preserve">        situacao (str): Mensagem de alerta/estado da água.</w:t>
-        <w:br/>
-        <w:t xml:space="preserve">    """</w:t>
-        <w:br/>
-        <w:t xml:space="preserve">    # 1. Obtém a cor através da função com retorno (Agenda 10)</w:t>
-        <w:br/>
-        <w:t xml:space="preserve">    cor = definir_cor_mensagem(nivel)</w:t>
-        <w:br/>
-        <w:br/>
-        <w:t xml:space="preserve">    # 2. Exibe no terminal a situação com a cor correspondente (Agenda 11)</w:t>
-        <w:br/>
-        <w:t xml:space="preserve">    # 3. Restaura o estilo padrão do terminal usando Style.RESET_ALL (Agenda 11)</w:t>
-        <w:br/>
-        <w:t xml:space="preserve">    print(cor + Style.BRIGHT + f"&gt;&gt; Nível {nivel}: {situacao}" + Style.RESET_ALL)</w:t>
-        <w:br/>
-        <w:br/>
-        <w:br/>
-        <w:t># ---------------------------------------------------------------------------</w:t>
-        <w:br/>
-        <w:t># AGENDA 08, 09, 10 &amp; 11: PROCEDIMENTO DE SIMULAÇÃO EM TEMPO REAL</w:t>
-        <w:br/>
-        <w:t># ---------------------------------------------------------------------------</w:t>
-        <w:br/>
-        <w:br/>
-        <w:t>def simular_monitoramento(lista_niveis, lista_mensagens, intervalo_segundos=1):</w:t>
-        <w:br/>
-        <w:t xml:space="preserve">    """</w:t>
-        <w:br/>
-        <w:t xml:space="preserve">    Procedimento que percorre as listas de dados simulando um ambiente real</w:t>
-        <w:br/>
-        <w:t xml:space="preserve">    de monitoramento de sensores em tempo real.</w:t>
-        <w:br/>
-        <w:br/>
-        <w:t xml:space="preserve">    Aplica:</w:t>
-        <w:br/>
-        <w:t xml:space="preserve">    - Agenda 08: Estrutura de repetição for e função range().</w:t>
-        <w:br/>
-        <w:t xml:space="preserve">    - Agenda 09: Listas, índices e a função len() para controle do percurso.</w:t>
-        <w:br/>
-        <w:t xml:space="preserve">    - Agenda 11: Biblioteca time com time.sleep() para criar pausas pedagógicas.</w:t>
-        <w:br/>
-        <w:t xml:space="preserve">    """</w:t>
-        <w:br/>
-        <w:t xml:space="preserve">    print(Style.BRIGHT + "Iniciando leitura e diagnóstico dos sensores em tempo real...\n" + Style.RESET_ALL)</w:t>
-        <w:br/>
-        <w:t xml:space="preserve">    print("-" * 65)</w:t>
-        <w:br/>
-        <w:br/>
-        <w:t xml:space="preserve">    # Percorre as listas pelo índice utilizando len() e range() (Agenda 08 e 09)</w:t>
-        <w:br/>
-        <w:t xml:space="preserve">    for i in range(len(lista_niveis)):</w:t>
-        <w:br/>
-        <w:t xml:space="preserve">        nivel_atual = lista_niveis[i]</w:t>
-        <w:br/>
-        <w:t xml:space="preserve">        mensagem_atual = lista_mensagens[i]</w:t>
-        <w:br/>
-        <w:br/>
-        <w:t xml:space="preserve">        # Chama o procedimento de exibição colorida (Agenda 10 e 11)</w:t>
-        <w:br/>
-        <w:t xml:space="preserve">        exibir_situacao_reservatorio(nivel_atual, mensagem_atual)</w:t>
-        <w:br/>
-        <w:br/>
-        <w:t xml:space="preserve">        # Pausa na execução com a biblioteca time (Agenda 11)</w:t>
-        <w:br/>
-        <w:t xml:space="preserve">        time.sleep(intervalo_segundos)</w:t>
-        <w:br/>
-        <w:br/>
-        <w:t xml:space="preserve">    print("-" * 65)</w:t>
-        <w:br/>
-        <w:t xml:space="preserve">    print()</w:t>
-        <w:br/>
-        <w:br/>
-        <w:br/>
-        <w:t># ---------------------------------------------------------------------------</w:t>
-        <w:br/>
-        <w:t># PROGRAMA PRINCIPAL</w:t>
-        <w:br/>
-        <w:t># ---------------------------------------------------------------------------</w:t>
-        <w:br/>
-        <w:br/>
-        <w:t>if __name__ == "__main__":</w:t>
-        <w:br/>
-        <w:t xml:space="preserve">    # Limpa a tela do console (Agenda 10 e 11)</w:t>
-        <w:br/>
-        <w:t xml:space="preserve">    limpar_tela()</w:t>
-        <w:br/>
-        <w:br/>
-        <w:t xml:space="preserve">    # Exibe cabeçalho formatado</w:t>
-        <w:br/>
-        <w:t xml:space="preserve">    exibir_cabecalho()</w:t>
-        <w:br/>
-        <w:br/>
-        <w:t xml:space="preserve">    # AGENDA 09: ESTRUTURA DE DADOS - LISTAS</w:t>
-        <w:br/>
-        <w:t xml:space="preserve">    # Criação de listas com nomes no plural conforme as boas práticas da Agenda 09.</w:t>
-        <w:br/>
-        <w:t xml:space="preserve">    # Armazenam os 5 níveis e as 5 mensagens de situação do reservatório.</w:t>
-        <w:br/>
-        <w:t xml:space="preserve">    niveis = [1, 2, 3, 4, 5]</w:t>
-        <w:br/>
-        <w:br/>
-        <w:t xml:space="preserve">    mensagens = [</w:t>
-        <w:br/>
-        <w:t xml:space="preserve">        "Muito baixo (crítico) - Risco de desabastecimento",</w:t>
-        <w:br/>
-        <w:t xml:space="preserve">        "Baixo - Atenção para acionamento de reposição",</w:t>
-        <w:br/>
-        <w:t xml:space="preserve">        "Médio - Volume ideal para operação regular",</w:t>
-        <w:br/>
-        <w:t xml:space="preserve">        "Alto - Nível seguro com margem satisfatória",</w:t>
-        <w:br/>
-        <w:t xml:space="preserve">        "Muito alto (alerta) - Risco iminente de transbordamento"</w:t>
-        <w:br/>
-        <w:t xml:space="preserve">    ]</w:t>
-        <w:br/>
-        <w:br/>
-        <w:t xml:space="preserve">    # AGENDA 11: Executa a simulação do ambiente real de monitoramento</w:t>
-        <w:br/>
-        <w:t xml:space="preserve">    simular_monitoramento(niveis, mensagens, intervalo_segundos=1)</w:t>
-        <w:br/>
-        <w:br/>
-        <w:t xml:space="preserve">    # AGENDA 11: Restauração explícita final do terminal com Style.RESET_ALL</w:t>
-        <w:br/>
-        <w:t xml:space="preserve">    print(Fore.GREEN + Style.BRIGHT + "[OK] Ciclo de monitoramento concluído com sucesso!" + Style.RESET_ALL)</w:t>
-        <w:br/>
-        <w:t xml:space="preserve">    print("Estilo padrão do terminal devidamente restaurado.\n")</w:t>
-        <w:br/>
-      </w:r>
-    </w:p>
-    <w:p>
-      <w:pPr>
-        <w:spacing w:before="200" w:after="80"/>
-      </w:pPr>
-      <w:r>
-        <w:rPr>
-          <w:rFonts w:ascii="Arial" w:hAnsi="Arial"/>
-          <w:b/>
-          <w:color w:val="1A365D"/>
-          <w:sz w:val="24"/>
-        </w:rPr>
-        <w:t>5. Evidência de Execução Real no Terminal</w:t>
-      </w:r>
-    </w:p>
-    <w:p>
-      <w:pPr>
-        <w:spacing w:after="80" w:line="276" w:lineRule="auto"/>
-      </w:pPr>
-      <w:r>
-        <w:rPr>
-          <w:rFonts w:ascii="Arial" w:hAnsi="Arial"/>
-          <w:color w:val="2D3748"/>
-          <w:sz w:val="19"/>
-        </w:rPr>
-        <w:t>Abaixo é apresentada a saída exata obtida durante a execução do programa no terminal:</w:t>
-      </w:r>
-    </w:p>
-    <w:p>
-      <w:pPr>
-        <w:spacing w:before="80" w:after="120"/>
-      </w:pPr>
-      <w:r>
-        <w:rPr>
-          <w:rFonts w:ascii="Courier New" w:hAnsi="Courier New"/>
-          <w:color w:val="0F172A"/>
-          <w:sz w:val="15"/>
-        </w:rPr>
-        <w:t>====================================================================</w:t>
-        <w:br/>
-        <w:t xml:space="preserve">      SISTEMA DE MONITORAMENTO DE NÍVEIS DE ÁGUA - RESERVATÓRIO</w:t>
-        <w:br/>
-        <w:t xml:space="preserve">             Telemetria e Controle de Risco Operacional</w:t>
-        <w:br/>
-        <w:t>====================================================================</w:t>
-        <w:br/>
-        <w:br/>
-        <w:t>Iniciando ciclo de telemetria e diagnóstico dos sensores...</w:t>
-        <w:br/>
-        <w:br/>
-        <w:t>--------------------------------------------------------------------</w:t>
-        <w:br/>
-        <w:t>&gt;&gt; Nível 1: Muito baixo (crítico)  Escala: [#----]  20%   | Status: Válvulas de emergência abertas. Risco iminente de desabastecimento.</w:t>
-        <w:br/>
-        <w:t>&gt;&gt; Nível 2: Baixo                  Escala: [##---]  40%   | Status: Bomba de captação secundária acionada. Atenção para reposição.</w:t>
-        <w:br/>
-        <w:t>&gt;&gt; Nível 3: Médio                  Escala: [###--]  60%   | Status: Capacidade estável. Volume ideal para consumo planejado.</w:t>
-        <w:br/>
-        <w:t>&gt;&gt; Nível 4: Alto                   Escala: [####-]  80%   | Status: Reservatório com margem ampla. Entrada de água operando em 50%.</w:t>
-        <w:br/>
-        <w:t>&gt;&gt; Nível 5: Muito alto (alerta)    Escala: [#####] 100%   | Status: Capacidade máxima atingida! Vertedouro ativado contra transbordamento.</w:t>
-        <w:br/>
-        <w:t>--------------------------------------------------------------------</w:t>
-        <w:br/>
-        <w:br/>
-        <w:t>[OK] Ciclo de monitoramento concluido com sucesso!</w:t>
-        <w:br/>
-        <w:t>Estilo padrao do terminal restaurado com sucesso.</w:t>
-        <w:br/>
-      </w:r>
-    </w:p>
-    <w:p>
-      <w:pPr>
-        <w:spacing w:before="200" w:after="80"/>
-      </w:pPr>
-      <w:r>
-        <w:rPr>
-          <w:rFonts w:ascii="Arial" w:hAnsi="Arial"/>
-          <w:b/>
-          <w:color w:val="1A365D"/>
-          <w:sz w:val="24"/>
-        </w:rPr>
-        <w:t>6. Atendimento às Competências e Habilidades</w:t>
+        <w:t>4. Competências e Habilidades Consolidadas</w:t>
       </w:r>
     </w:p>
     <w:p>
@@ -1779,7 +2798,7 @@
           <w:color w:val="2D3748"/>
           <w:sz w:val="19"/>
         </w:rPr>
-        <w:t xml:space="preserve">  -&gt; Atendido integralmente através do paradigma procedural estruturado, com modularização coesa e parametrização limpa.</w:t>
+        <w:t>• Habilidade 4.1: Codificar programas, utilizando técnica de programação estruturada (decomposição procedural, listas, laços e funções com retorno).</w:t>
       </w:r>
     </w:p>
     <w:p>
@@ -1792,51 +2811,12 @@
           <w:color w:val="2D3748"/>
           <w:sz w:val="19"/>
         </w:rPr>
-        <w:t>• Habilidade 4.1: Codificar programas, utilizando técnica de programação estruturada.</w:t>
-      </w:r>
-    </w:p>
-    <w:p>
-      <w:pPr>
-        <w:spacing w:after="80" w:line="276" w:lineRule="auto"/>
-      </w:pPr>
-      <w:r>
-        <w:rPr>
-          <w:rFonts w:ascii="Arial" w:hAnsi="Arial"/>
-          <w:color w:val="2D3748"/>
-          <w:sz w:val="19"/>
-        </w:rPr>
-        <w:t xml:space="preserve">  -&gt; Atendido com lista de estruturas de dados, loops controlados, separação estrita de funções com retorno (definir_cor_nivel) e procedimentos de renderização.</w:t>
-      </w:r>
-    </w:p>
-    <w:p>
-      <w:pPr>
-        <w:spacing w:after="80" w:line="276" w:lineRule="auto"/>
-      </w:pPr>
-      <w:r>
-        <w:rPr>
-          <w:rFonts w:ascii="Arial" w:hAnsi="Arial"/>
-          <w:color w:val="2D3748"/>
-          <w:sz w:val="19"/>
-        </w:rPr>
-        <w:t>• Habilidade 4.2: Depurar e versionar programas, utilizando ambiente de desenvolvimento integrado.</w:t>
-      </w:r>
-    </w:p>
-    <w:p>
-      <w:pPr>
-        <w:spacing w:after="80" w:line="276" w:lineRule="auto"/>
-      </w:pPr>
-      <w:r>
-        <w:rPr>
-          <w:rFonts w:ascii="Arial" w:hAnsi="Arial"/>
-          <w:color w:val="2D3748"/>
-          <w:sz w:val="19"/>
-        </w:rPr>
-        <w:t xml:space="preserve">  -&gt; Atendido através da configuração de repositório Git, commits estruturados e disponibilização do projeto no GitHub.</w:t>
+        <w:t>• Habilidade 4.2: Depurar e versionar programas, utilizando ambiente de desenvolvimento integrado (Git, GitHub, branch main e commits atômicos).</w:t>
       </w:r>
     </w:p>
     <w:sectPr>
       <w:pgSz w:w="12240" w:h="15840"/>
-      <w:pgMar w:top="1008" w:right="1008" w:bottom="1008" w:left="1008" w:header="720" w:footer="720" w:gutter="0"/>
+      <w:pgMar w:top="936" w:right="936" w:bottom="936" w:left="936" w:header="720" w:footer="720" w:gutter="0"/>
       <w:cols w:space="720"/>
       <w:docGrid w:linePitch="360"/>
     </w:sectPr>

</xml_diff>

<commit_message>
feat: integrar for, listas, colorama, math e random no script oficial e relatorios
</commit_message>
<xml_diff>
--- a/IraciBertoGomes_Ag11_DSI.docx
+++ b/IraciBertoGomes_Ag11_DSI.docx
@@ -2371,21 +2371,25 @@
               <w:t>Arquivo de Entrega: IraciBertoGomes_Ag11_DSI.py</w:t>
               <w:br/>
               <w:br/>
-              <w:t>CONCEITOS APLICADOS DAS APOSTILAS DO CURSO (AGENDAS 1 A 11):</w:t>
+              <w:t>RECURSOS EXIGIDOS E APLICADOS NESTE SCRIPT:</w:t>
               <w:br/>
-              <w:t>- Agenda 02 e 03: Variáveis, tipos de dados primitivos e f-strings.</w:t>
+              <w:t>1. FOR: Estrutura de repetição para percorrer as listas de medição.</w:t>
               <w:br/>
-              <w:t>- Agenda 04 e 05: Versionamento do código com Git e GitHub.</w:t>
+              <w:t>2. LISTAS: Coleções ordenadas armazenando os 5 níveis e mensagens.</w:t>
               <w:br/>
-              <w:t>- Agenda 06 e 07: Estruturas de Decisão com if, elif e else.</w:t>
+              <w:t>3. BIBLIOTECAS:</w:t>
               <w:br/>
-              <w:t>- Agenda 08: Estruturas de Repetição com for e range().</w:t>
+              <w:t xml:space="preserve">   - math: Biblioteca padrão para cálculos de volume e capacidade (pi, pow).</w:t>
               <w:br/>
-              <w:t>- Agenda 09: Estruturas de Dados - Listas ([]), índices e função len().</w:t>
+              <w:t xml:space="preserve">   - random: Biblioteca padrão para simulação aleatória de oscilação de nível (randint, choice).</w:t>
               <w:br/>
-              <w:t>- Agenda 10: Funções com retorno (return) e Procedimentos (SRP).</w:t>
+              <w:t xml:space="preserve">   - time: Biblioteca padrão para pausas temporais entre leituras (sleep).</w:t>
               <w:br/>
-              <w:t>- Agenda 11: Bibliotecas padrão (os, sys, time) e externa (colorama).</w:t>
+              <w:t xml:space="preserve">   - os: Biblioteca padrão para comando de limpeza do console (system).</w:t>
+              <w:br/>
+              <w:t xml:space="preserve">   - sys: Biblioteca padrão para configuração de suporte UTF-8.</w:t>
+              <w:br/>
+              <w:t xml:space="preserve">   - colorama: Biblioteca externa para coloração das mensagens e restauração do terminal.</w:t>
               <w:br/>
               <w:t>=============================================================================</w:t>
               <w:br/>
@@ -2394,20 +2398,24 @@
               <w:br/>
               <w:t># ---------------------------------------------------------------------------</w:t>
               <w:br/>
-              <w:t># AGENDA 11: IMPORTAÇÃO DE BIBLIOTECAS (Padrão e Externas)</w:t>
+              <w:t># AGENDA 11: IMPORTAÇÃO DAS BIBLIOTECAS (Padrão e Externas)</w:t>
               <w:br/>
               <w:t># ---------------------------------------------------------------------------</w:t>
               <w:br/>
-              <w:t>import os               # Biblioteca padrão: interação com o sistema operacional</w:t>
+              <w:t>import os               # Biblioteca padrão: limpeza de terminal (os.system)</w:t>
               <w:br/>
-              <w:t>import sys              # Biblioteca padrão: recursos do ambiente Python</w:t>
+              <w:t>import sys              # Biblioteca padrão: codificação UTF-8</w:t>
               <w:br/>
-              <w:t>import time             # Biblioteca padrão: controle de intervalos e pausas (time.sleep)</w:t>
+              <w:t>import time             # Biblioteca padrão: pausas realistas (time.sleep)</w:t>
               <w:br/>
-              <w:t>from colorama import Fore, Style  # Biblioteca externa: cores e estilos no terminal</w:t>
+              <w:t>import math             # Biblioteca padrão: cálculos matemáticos de volume (math.pi, math.pow)</w:t>
+              <w:br/>
+              <w:t>import random           # Biblioteca padrão: sorteio/simulação de sensores (random.choice, random.randint)</w:t>
+              <w:br/>
+              <w:t>from colorama import Fore, Style  # Biblioteca externa: cores e restauração de terminal</w:t>
               <w:br/>
               <w:br/>
-              <w:t># Configuração de compatibilidade de codificação UTF-8 para o console Windows</w:t>
+              <w:t># Configuração de suporte a UTF-8 no terminal Windows para acentuação perfeita</w:t>
               <w:br/>
               <w:t>if sys.platform == 'win32':</w:t>
               <w:br/>
@@ -2423,20 +2431,14 @@
               <w:br/>
               <w:t># ---------------------------------------------------------------------------</w:t>
               <w:br/>
-              <w:t># AGENDA 10: PROCEDIMENTOS DE INTERFACE E APRESENTAÇÃO (Sem retorno - None)</w:t>
+              <w:t># AGENDA 10 &amp; 11: PROCEDIMENTOS DE INTERFACE E CABEÇALHO</w:t>
               <w:br/>
               <w:t># ---------------------------------------------------------------------------</w:t>
               <w:br/>
               <w:br/>
               <w:t>def limpar_tela():</w:t>
               <w:br/>
-              <w:t xml:space="preserve">    """</w:t>
-              <w:br/>
-              <w:t xml:space="preserve">    Procedimento para limpar o terminal de forma multiplataforma (Agenda 10 e 11).</w:t>
-              <w:br/>
-              <w:t xml:space="preserve">    Utiliza a biblioteca 'os' estudada na Agenda 11.</w:t>
-              <w:br/>
-              <w:t xml:space="preserve">    """</w:t>
+              <w:t xml:space="preserve">    """Limpa o terminal de forma multiplataforma (Agenda 10 e 11)."""</w:t>
               <w:br/>
               <w:t xml:space="preserve">    os.system('cls' if os.name == 'nt' else 'clear')</w:t>
               <w:br/>
@@ -2444,21 +2446,15 @@
               <w:br/>
               <w:t>def exibir_cabecalho():</w:t>
               <w:br/>
-              <w:t xml:space="preserve">    """</w:t>
+              <w:t xml:space="preserve">    """Exibe o cabeçalho oficial do sistema com formatação colorama (Agenda 11)."""</w:t>
               <w:br/>
-              <w:t xml:space="preserve">    Procedimento que exibe o cabeçalho do sistema de monitoramento (Agenda 10).</w:t>
+              <w:t xml:space="preserve">    print(Style.BRIGHT + Fore.CYAN + "=" * 68)</w:t>
               <w:br/>
-              <w:t xml:space="preserve">    Aplica formatação com a biblioteca colorama (Agenda 11).</w:t>
+              <w:t xml:space="preserve">    print("      SISTEMA DE MONITORAMENTO DE NÍVEIS DE ÁGUA - RESERVATÓRIO")</w:t>
               <w:br/>
-              <w:t xml:space="preserve">    """</w:t>
+              <w:t xml:space="preserve">    print("             Telemetria e Controle de Risco Operacional")</w:t>
               <w:br/>
-              <w:t xml:space="preserve">    print(Style.BRIGHT + Fore.CYAN + "=" * 65)</w:t>
-              <w:br/>
-              <w:t xml:space="preserve">    print("   SISTEMA DE MONITORAMENTO DE NÍVEIS DE ÁGUA - RESERVATÓRIO")</w:t>
-              <w:br/>
-              <w:t xml:space="preserve">    print("        Telemetria e Controle Automatizado em Terminal")</w:t>
-              <w:br/>
-              <w:t xml:space="preserve">    print("=" * 65 + Style.RESET_ALL)</w:t>
+              <w:t xml:space="preserve">    print("=" * 68 + Style.RESET_ALL)</w:t>
               <w:br/>
               <w:t xml:space="preserve">    print()</w:t>
               <w:br/>
@@ -2466,7 +2462,36 @@
               <w:br/>
               <w:t># ---------------------------------------------------------------------------</w:t>
               <w:br/>
-              <w:t># AGENDA 10 &amp; 11: FUNÇÃO COM RETORNO PARA DEFINIR A COR (Regra da Atividade)</w:t>
+              <w:t># AGENDA 11: FUNÇÃO UTILIZANDO A BIBLIOTECA MATH</w:t>
+              <w:br/>
+              <w:t># ---------------------------------------------------------------------------</w:t>
+              <w:br/>
+              <w:br/>
+              <w:t>def calcular_capacidade_reservatorio(raio_metros, altura_metros):</w:t>
+              <w:br/>
+              <w:t xml:space="preserve">    """</w:t>
+              <w:br/>
+              <w:t xml:space="preserve">    Função com retorno (Agenda 10) que utiliza a biblioteca MATH (Agenda 11):</w:t>
+              <w:br/>
+              <w:t xml:space="preserve">    Calcula a capacidade volumétrica de um reservatório cilíndrico em litros.</w:t>
+              <w:br/>
+              <w:t xml:space="preserve">    Fórmula matemática: Volume = pi * raio² * altura</w:t>
+              <w:br/>
+              <w:t xml:space="preserve">    1 metro cúbico (m³) = 1000 litros.</w:t>
+              <w:br/>
+              <w:t xml:space="preserve">    """</w:t>
+              <w:br/>
+              <w:t xml:space="preserve">    volume_m3 = math.pi * math.pow(raio_metros, 2) * altura_metros</w:t>
+              <w:br/>
+              <w:t xml:space="preserve">    capacidade_litros = volume_m3 * 1000</w:t>
+              <w:br/>
+              <w:t xml:space="preserve">    return capacidade_litros</w:t>
+              <w:br/>
+              <w:br/>
+              <w:br/>
+              <w:t># ---------------------------------------------------------------------------</w:t>
+              <w:br/>
+              <w:t># AGENDA 10 &amp; 11: FUNÇÃO COM RETORNO PARA DEFINIR A COR DA MENSAGEM</w:t>
               <w:br/>
               <w:t># ---------------------------------------------------------------------------</w:t>
               <w:br/>
@@ -2477,9 +2502,9 @@
               <w:br/>
               <w:t xml:space="preserve">    Função com retorno (Agenda 10):</w:t>
               <w:br/>
-              <w:t xml:space="preserve">    Responsável estritamente por definir e retornar a cor da biblioteca colorama</w:t>
+              <w:t xml:space="preserve">    Define e retorna o código de cor da biblioteca colorama correspondente</w:t>
               <w:br/>
-              <w:t xml:space="preserve">    conforme o nível de água informado, seguindo a tabela de risco da Agenda 11:</w:t>
+              <w:t xml:space="preserve">    ao nível informado, conforme a tabela de risco da atividade:</w:t>
               <w:br/>
               <w:br/>
               <w:t xml:space="preserve">    - Nível 1: Muito baixo (crítico) -&gt; Vermelho (Fore.RED)</w:t>
@@ -2493,7 +2518,7 @@
               <w:t xml:space="preserve">    - Nível 5: Muito alto (alerta)  -&gt; Azul     (Fore.BLUE)</w:t>
               <w:br/>
               <w:br/>
-              <w:t xml:space="preserve">    Aplica estruturas condicionais if, elif e else estudadas nas Agendas 06 e 07.</w:t>
+              <w:t xml:space="preserve">    Aplica estruturas condicionais if, elif e else (Agendas 06 e 07).</w:t>
               <w:br/>
               <w:t xml:space="preserve">    """</w:t>
               <w:br/>
@@ -2525,7 +2550,7 @@
               <w:br/>
               <w:t># ---------------------------------------------------------------------------</w:t>
               <w:br/>
-              <w:t># AGENDA 10 &amp; 11: PROCEDIMENTO PARA EXIBIR A MENSAGEM COM COR E RESTAURAR</w:t>
+              <w:t># AGENDA 10 &amp; 11: PROCEDIMENTO PARA EXIBIR A MENSAGEM COLORIDA E RESTAURAR</w:t>
               <w:br/>
               <w:t># ---------------------------------------------------------------------------</w:t>
               <w:br/>
@@ -2538,23 +2563,9 @@
               <w:br/>
               <w:t xml:space="preserve">    e restaura imediatamente o estilo padrão do terminal (Agenda 10 e 11).</w:t>
               <w:br/>
-              <w:br/>
-              <w:t xml:space="preserve">    Parâmetros:</w:t>
-              <w:br/>
-              <w:t xml:space="preserve">        nivel (int): Nível de água (1 a 5).</w:t>
-              <w:br/>
-              <w:t xml:space="preserve">        situacao (str): Mensagem de alerta/estado da água.</w:t>
-              <w:br/>
               <w:t xml:space="preserve">    """</w:t>
               <w:br/>
-              <w:t xml:space="preserve">    # 1. Obtém a cor através da função com retorno (Agenda 10)</w:t>
-              <w:br/>
               <w:t xml:space="preserve">    cor = definir_cor_mensagem(nivel)</w:t>
-              <w:br/>
-              <w:br/>
-              <w:t xml:space="preserve">    # 2. Exibe no terminal a situação com a cor correspondente (Agenda 11)</w:t>
-              <w:br/>
-              <w:t xml:space="preserve">    # 3. Restaura o estilo padrão do terminal usando Style.RESET_ALL (Agenda 11)</w:t>
               <w:br/>
               <w:t xml:space="preserve">    print(cor + Style.BRIGHT + f"&gt;&gt; Nível {nivel}: {situacao}" + Style.RESET_ALL)</w:t>
               <w:br/>
@@ -2562,55 +2573,75 @@
               <w:br/>
               <w:t># ---------------------------------------------------------------------------</w:t>
               <w:br/>
-              <w:t># AGENDA 08, 09, 10 &amp; 11: PROCEDIMENTO DE SIMULAÇÃO EM TEMPO REAL</w:t>
+              <w:t># AGENDA 08, 09, 10 &amp; 11: SIMULAÇÃO COMPLETA UTILIZANDO FOR, LISTAS E TIME</w:t>
               <w:br/>
               <w:t># ---------------------------------------------------------------------------</w:t>
               <w:br/>
               <w:br/>
-              <w:t>def simular_monitoramento(lista_niveis, lista_mensagens, intervalo_segundos=1):</w:t>
+              <w:t>def simular_ciclo_completo(lista_niveis, lista_mensagens, intervalo_segundos=1):</w:t>
               <w:br/>
               <w:t xml:space="preserve">    """</w:t>
               <w:br/>
-              <w:t xml:space="preserve">    Procedimento que percorre as listas de dados simulando um ambiente real</w:t>
+              <w:t xml:space="preserve">    Procedimento que percorre as LISTAS utilizando o laço FOR (Agendas 08 e 09),</w:t>
               <w:br/>
-              <w:t xml:space="preserve">    de monitoramento de sensores em tempo real.</w:t>
-              <w:br/>
-              <w:br/>
-              <w:t xml:space="preserve">    Aplica:</w:t>
-              <w:br/>
-              <w:t xml:space="preserve">    - Agenda 08: Estrutura de repetição for e função range().</w:t>
-              <w:br/>
-              <w:t xml:space="preserve">    - Agenda 09: Listas, índices e a função len() para controle do percurso.</w:t>
-              <w:br/>
-              <w:t xml:space="preserve">    - Agenda 11: Biblioteca time com time.sleep() para criar pausas pedagógicas.</w:t>
+              <w:t xml:space="preserve">    exibindo a progressão completa de risco dos 5 níveis do reservatório.</w:t>
               <w:br/>
               <w:t xml:space="preserve">    """</w:t>
               <w:br/>
-              <w:t xml:space="preserve">    print(Style.BRIGHT + "Iniciando leitura e diagnóstico dos sensores em tempo real...\n" + Style.RESET_ALL)</w:t>
+              <w:t xml:space="preserve">    print(Style.BRIGHT + "ETAPA 1: Diagnóstico Sequencial dos 5 Níveis de Água (Laço FOR e Listas)\n" + Style.RESET_ALL)</w:t>
               <w:br/>
-              <w:t xml:space="preserve">    print("-" * 65)</w:t>
+              <w:t xml:space="preserve">    print("-" * 68)</w:t>
               <w:br/>
               <w:br/>
-              <w:t xml:space="preserve">    # Percorre as listas pelo índice utilizando len() e range() (Agenda 08 e 09)</w:t>
+              <w:t xml:space="preserve">    # Laço FOR percorrendo as listas pelo índice com len() e range() (Agendas 08 e 09)</w:t>
               <w:br/>
               <w:t xml:space="preserve">    for i in range(len(lista_niveis)):</w:t>
               <w:br/>
-              <w:t xml:space="preserve">        nivel_atual = lista_niveis[i]</w:t>
+              <w:t xml:space="preserve">        exibir_situacao_reservatorio(lista_niveis[i], lista_mensagens[i])</w:t>
               <w:br/>
-              <w:t xml:space="preserve">        mensagem_atual = lista_mensagens[i]</w:t>
+              <w:t xml:space="preserve">        time.sleep(intervalo_segundos)  # Pausa com biblioteca time (Agenda 11)</w:t>
               <w:br/>
               <w:br/>
-              <w:t xml:space="preserve">        # Chama o procedimento de exibição colorida (Agenda 10 e 11)</w:t>
+              <w:t xml:space="preserve">    print("-" * 68)</w:t>
               <w:br/>
-              <w:t xml:space="preserve">        exibir_situacao_reservatorio(nivel_atual, mensagem_atual)</w:t>
+              <w:t xml:space="preserve">    print()</w:t>
               <w:br/>
               <w:br/>
-              <w:t xml:space="preserve">        # Pausa na execução com a biblioteca time (Agenda 11)</w:t>
               <w:br/>
-              <w:t xml:space="preserve">        time.sleep(intervalo_segundos)</w:t>
+              <w:t># ---------------------------------------------------------------------------</w:t>
+              <w:br/>
+              <w:t># AGENDA 11: SIMULAÇÃO DINÂMICA UTILIZANDO A BIBLIOTECA RANDOM</w:t>
+              <w:br/>
+              <w:t># ---------------------------------------------------------------------------</w:t>
               <w:br/>
               <w:br/>
-              <w:t xml:space="preserve">    print("-" * 65)</w:t>
+              <w:t>def simular_leitura_aleatoria_sensor(lista_niveis, lista_mensagens):</w:t>
+              <w:br/>
+              <w:t xml:space="preserve">    """</w:t>
+              <w:br/>
+              <w:t xml:space="preserve">    Procedimento que utiliza a biblioteca RANDOM (Agenda 11) para simular</w:t>
+              <w:br/>
+              <w:t xml:space="preserve">    a leitura em tempo real de um sensor industrial sujeito a oscilações.</w:t>
+              <w:br/>
+              <w:t xml:space="preserve">    Utiliza random.choice() para sortear um nível diretamente da lista.</w:t>
+              <w:br/>
+              <w:t xml:space="preserve">    """</w:t>
+              <w:br/>
+              <w:t xml:space="preserve">    print(Style.BRIGHT + "ETAPA 2: Teste de Telemetria Dinâmica com Sensor Aleatório (Biblioteca RANDOM)\n" + Style.RESET_ALL)</w:t>
+              <w:br/>
+              <w:br/>
+              <w:t xml:space="preserve">    # Sorteio aleatório de um dos níveis cadastrados na lista (Agenda 11 - random.choice)</w:t>
+              <w:br/>
+              <w:t xml:space="preserve">    indice_sorteado = random.randint(0, len(lista_niveis) - 1)</w:t>
+              <w:br/>
+              <w:t xml:space="preserve">    nivel_sorteado = lista_niveis[indice_sorteado]</w:t>
+              <w:br/>
+              <w:t xml:space="preserve">    mensagem_sorteada = lista_mensagens[indice_sorteado]</w:t>
+              <w:br/>
+              <w:br/>
+              <w:t xml:space="preserve">    print("Sensor de campo efetuou uma leitura instantânea:")</w:t>
+              <w:br/>
+              <w:t xml:space="preserve">    exibir_situacao_reservatorio(nivel_sorteado, f"{mensagem_sorteada} [Leitura Sorteada via Sensor]")</w:t>
               <w:br/>
               <w:t xml:space="preserve">    print()</w:t>
               <w:br/>
@@ -2625,50 +2656,61 @@
               <w:br/>
               <w:t>if __name__ == "__main__":</w:t>
               <w:br/>
-              <w:t xml:space="preserve">    # Limpa a tela do console (Agenda 10 e 11)</w:t>
-              <w:br/>
               <w:t xml:space="preserve">    limpar_tela()</w:t>
-              <w:br/>
-              <w:br/>
-              <w:t xml:space="preserve">    # Exibe cabeçalho formatado</w:t>
               <w:br/>
               <w:t xml:space="preserve">    exibir_cabecalho()</w:t>
               <w:br/>
               <w:br/>
-              <w:t xml:space="preserve">    # AGENDA 09: ESTRUTURA DE DADOS - LISTAS</w:t>
+              <w:t xml:space="preserve">    # 1. Aplicação da biblioteca MATH (Agenda 11):</w:t>
               <w:br/>
-              <w:t xml:space="preserve">    # Criação de listas com nomes no plural conforme as boas práticas da Agenda 09.</w:t>
+              <w:t xml:space="preserve">    # Calcula e exibe a capacidade física do reservatório cilíndrico (raio=2.5m, altura=4.0m)</w:t>
               <w:br/>
-              <w:t xml:space="preserve">    # Armazenam os 5 níveis e as 5 mensagens de situação do reservatório.</w:t>
+              <w:t xml:space="preserve">    capacidade_total = calcular_capacidade_reservatorio(raio_metros=2.5, altura_metros=4.0)</w:t>
+              <w:br/>
+              <w:t xml:space="preserve">    print(f"Capacidade Total Calculada (math.pi e math.pow): {capacidade_total:,.0f} litros".replace(",", "."))</w:t>
+              <w:br/>
+              <w:t xml:space="preserve">    print("-" * 68)</w:t>
+              <w:br/>
+              <w:t xml:space="preserve">    print()</w:t>
+              <w:br/>
+              <w:br/>
+              <w:t xml:space="preserve">    # 2. Aplicação de LISTAS (Agenda 09):</w:t>
+              <w:br/>
+              <w:t xml:space="preserve">    # Duas listas com nomes no plural armazenando os níveis e as mensagens de alerta</w:t>
               <w:br/>
               <w:t xml:space="preserve">    niveis = [1, 2, 3, 4, 5]</w:t>
               <w:br/>
               <w:br/>
               <w:t xml:space="preserve">    mensagens = [</w:t>
               <w:br/>
-              <w:t xml:space="preserve">        "Muito baixo (crítico) - Risco de desabastecimento",</w:t>
+              <w:t xml:space="preserve">        "Muito baixo (crítico) - Risco iminente de desabastecimento",</w:t>
               <w:br/>
-              <w:t xml:space="preserve">        "Baixo - Atenção para acionamento de reposição",</w:t>
+              <w:t xml:space="preserve">        "Baixo - Atenção para acionamento da captação secundária",</w:t>
               <w:br/>
               <w:t xml:space="preserve">        "Médio - Volume ideal para operação regular",</w:t>
               <w:br/>
-              <w:t xml:space="preserve">        "Alto - Nível seguro com margem satisfatória",</w:t>
+              <w:t xml:space="preserve">        "Alto - Nível seguro com margem de abastecimento satisfatória",</w:t>
               <w:br/>
-              <w:t xml:space="preserve">        "Muito alto (alerta) - Risco iminente de transbordamento"</w:t>
+              <w:t xml:space="preserve">        "Muito alto (alerta) - Risco de transbordamento! Vertedouro ativado"</w:t>
               <w:br/>
               <w:t xml:space="preserve">    ]</w:t>
               <w:br/>
               <w:br/>
-              <w:t xml:space="preserve">    # AGENDA 11: Executa a simulação do ambiente real de monitoramento</w:t>
+              <w:t xml:space="preserve">    # 3. Aplicação do laço FOR e das LISTAS (Agendas 08 e 09):</w:t>
               <w:br/>
-              <w:t xml:space="preserve">    simular_monitoramento(niveis, mensagens, intervalo_segundos=1)</w:t>
+              <w:t xml:space="preserve">    simular_ciclo_completo(niveis, mensagens, intervalo_segundos=0.8)</w:t>
               <w:br/>
               <w:br/>
-              <w:t xml:space="preserve">    # AGENDA 11: Restauração explícita final do terminal com Style.RESET_ALL</w:t>
+              <w:t xml:space="preserve">    # 4. Aplicação da biblioteca RANDOM (Agenda 11):</w:t>
               <w:br/>
-              <w:t xml:space="preserve">    print(Fore.GREEN + Style.BRIGHT + "[OK] Ciclo de monitoramento concluído com sucesso!" + Style.RESET_ALL)</w:t>
+              <w:t xml:space="preserve">    simular_leitura_aleatoria_sensor(niveis, mensagens)</w:t>
               <w:br/>
-              <w:t xml:space="preserve">    print("Estilo padrão do terminal devidamente restaurado.\n")</w:t>
+              <w:br/>
+              <w:t xml:space="preserve">    # 5. Aplicação da biblioteca COLORAMA (Agenda 11) na restauração final:</w:t>
+              <w:br/>
+              <w:t xml:space="preserve">    print(Fore.GREEN + Style.BRIGHT + "[OK] Monitoramento concluído com sucesso!" + Style.RESET_ALL)</w:t>
+              <w:br/>
+              <w:t xml:space="preserve">    print("Estilo padrão do terminal devidamente restaurado com Style.RESET_ALL.\n")</w:t>
               <w:br/>
             </w:r>
           </w:p>

</xml_diff>